<commit_message>
docs: secrets are managed via dashboard UI, not dev tools
The EnvVarEditor component in the agent config page has a plain/secret
toggle + inline secret creation. Updated the guide to use the UI flow
instead of browser console API calls for storing credentials.

Co-Authored-By: Claude Opus 4.6 (1M context) <noreply@anthropic.com>
</commit_message>
<xml_diff>
--- a/docs/paperclip-cloud-operations-guide.docx
+++ b/docs/paperclip-cloud-operations-guide.docx
@@ -2718,7 +2718,7 @@
     </w:p>
     <w:bookmarkEnd w:id="26"/>
     <w:bookmarkEnd w:id="27"/>
-    <w:bookmarkStart w:id="41" w:name="part-2-3rd-party-integrations"/>
+    <w:bookmarkStart w:id="40" w:name="part-2-3rd-party-integrations"/>
     <w:p>
       <w:pPr>
         <w:pStyle w:val="Heading1"/>
@@ -2727,7 +2727,7 @@
         <w:t xml:space="preserve">Part 2: 3rd Party Integrations</w:t>
       </w:r>
     </w:p>
-    <w:bookmarkStart w:id="35" w:name="connecting-agents-to-external-services"/>
+    <w:bookmarkStart w:id="34" w:name="connecting-agents-to-external-services"/>
     <w:p>
       <w:pPr>
         <w:pStyle w:val="Heading2"/>
@@ -3069,13 +3069,13 @@
       </w:tr>
     </w:tbl>
     <w:bookmarkEnd w:id="31"/>
-    <w:bookmarkStart w:id="32" w:name="storing-credentials-as-secrets"/>
+    <w:bookmarkStart w:id="32" w:name="X5e1bd796b3cfdb70103a64c955f15d2e1e93a70"/>
     <w:p>
       <w:pPr>
         <w:pStyle w:val="Heading3"/>
       </w:pPr>
       <w:r>
-        <w:t xml:space="preserve">Storing credentials as secrets</w:t>
+        <w:t xml:space="preserve">Storing credentials and configuring agents (via the dashboard)</w:t>
       </w:r>
     </w:p>
     <w:p>
@@ -3083,681 +3083,7 @@
         <w:pStyle w:val="FirstParagraph"/>
       </w:pPr>
       <w:r>
-        <w:t xml:space="preserve">In the browser dev tools console (while signed in):</w:t>
-      </w:r>
-    </w:p>
-    <w:p>
-      <w:pPr>
-        <w:pStyle w:val="SourceCode"/>
-      </w:pPr>
-      <w:r>
-        <w:rPr>
-          <w:rStyle w:val="FunctionTok"/>
-        </w:rPr>
-        <w:t xml:space="preserve">fetch</w:t>
-      </w:r>
-      <w:r>
-        <w:rPr>
-          <w:rStyle w:val="NormalTok"/>
-        </w:rPr>
-        <w:t xml:space="preserve">(</w:t>
-      </w:r>
-      <w:r>
-        <w:rPr>
-          <w:rStyle w:val="StringTok"/>
-        </w:rPr>
-        <w:t xml:space="preserve">"/api/companies/YOUR_COMPANY_ID/secrets"</w:t>
-      </w:r>
-      <w:r>
-        <w:rPr>
-          <w:rStyle w:val="OperatorTok"/>
-        </w:rPr>
-        <w:t xml:space="preserve">,</w:t>
-      </w:r>
-      <w:r>
-        <w:rPr>
-          <w:rStyle w:val="NormalTok"/>
-        </w:rPr>
-        <w:t xml:space="preserve"> {</w:t>
-      </w:r>
-      <w:r>
-        <w:br/>
-      </w:r>
-      <w:r>
-        <w:rPr>
-          <w:rStyle w:val="NormalTok"/>
-        </w:rPr>
-        <w:t xml:space="preserve">  </w:t>
-      </w:r>
-      <w:r>
-        <w:rPr>
-          <w:rStyle w:val="DataTypeTok"/>
-        </w:rPr>
-        <w:t xml:space="preserve">method</w:t>
-      </w:r>
-      <w:r>
-        <w:rPr>
-          <w:rStyle w:val="OperatorTok"/>
-        </w:rPr>
-        <w:t xml:space="preserve">:</w:t>
-      </w:r>
-      <w:r>
-        <w:rPr>
-          <w:rStyle w:val="NormalTok"/>
-        </w:rPr>
-        <w:t xml:space="preserve"> </w:t>
-      </w:r>
-      <w:r>
-        <w:rPr>
-          <w:rStyle w:val="StringTok"/>
-        </w:rPr>
-        <w:t xml:space="preserve">"POST"</w:t>
-      </w:r>
-      <w:r>
-        <w:rPr>
-          <w:rStyle w:val="OperatorTok"/>
-        </w:rPr>
-        <w:t xml:space="preserve">,</w:t>
-      </w:r>
-      <w:r>
-        <w:br/>
-      </w:r>
-      <w:r>
-        <w:rPr>
-          <w:rStyle w:val="NormalTok"/>
-        </w:rPr>
-        <w:t xml:space="preserve">  </w:t>
-      </w:r>
-      <w:r>
-        <w:rPr>
-          <w:rStyle w:val="DataTypeTok"/>
-        </w:rPr>
-        <w:t xml:space="preserve">headers</w:t>
-      </w:r>
-      <w:r>
-        <w:rPr>
-          <w:rStyle w:val="OperatorTok"/>
-        </w:rPr>
-        <w:t xml:space="preserve">:</w:t>
-      </w:r>
-      <w:r>
-        <w:rPr>
-          <w:rStyle w:val="NormalTok"/>
-        </w:rPr>
-        <w:t xml:space="preserve"> { </w:t>
-      </w:r>
-      <w:r>
-        <w:rPr>
-          <w:rStyle w:val="StringTok"/>
-        </w:rPr>
-        <w:t xml:space="preserve">"Content-Type"</w:t>
-      </w:r>
-      <w:r>
-        <w:rPr>
-          <w:rStyle w:val="OperatorTok"/>
-        </w:rPr>
-        <w:t xml:space="preserve">:</w:t>
-      </w:r>
-      <w:r>
-        <w:rPr>
-          <w:rStyle w:val="NormalTok"/>
-        </w:rPr>
-        <w:t xml:space="preserve"> </w:t>
-      </w:r>
-      <w:r>
-        <w:rPr>
-          <w:rStyle w:val="StringTok"/>
-        </w:rPr>
-        <w:t xml:space="preserve">"application/json"</w:t>
-      </w:r>
-      <w:r>
-        <w:rPr>
-          <w:rStyle w:val="NormalTok"/>
-        </w:rPr>
-        <w:t xml:space="preserve"> }</w:t>
-      </w:r>
-      <w:r>
-        <w:rPr>
-          <w:rStyle w:val="OperatorTok"/>
-        </w:rPr>
-        <w:t xml:space="preserve">,</w:t>
-      </w:r>
-      <w:r>
-        <w:br/>
-      </w:r>
-      <w:r>
-        <w:rPr>
-          <w:rStyle w:val="NormalTok"/>
-        </w:rPr>
-        <w:t xml:space="preserve">  </w:t>
-      </w:r>
-      <w:r>
-        <w:rPr>
-          <w:rStyle w:val="DataTypeTok"/>
-        </w:rPr>
-        <w:t xml:space="preserve">body</w:t>
-      </w:r>
-      <w:r>
-        <w:rPr>
-          <w:rStyle w:val="OperatorTok"/>
-        </w:rPr>
-        <w:t xml:space="preserve">:</w:t>
-      </w:r>
-      <w:r>
-        <w:rPr>
-          <w:rStyle w:val="NormalTok"/>
-        </w:rPr>
-        <w:t xml:space="preserve"> </w:t>
-      </w:r>
-      <w:r>
-        <w:rPr>
-          <w:rStyle w:val="BuiltInTok"/>
-        </w:rPr>
-        <w:t xml:space="preserve">JSON</w:t>
-      </w:r>
-      <w:r>
-        <w:rPr>
-          <w:rStyle w:val="OperatorTok"/>
-        </w:rPr>
-        <w:t xml:space="preserve">.</w:t>
-      </w:r>
-      <w:r>
-        <w:rPr>
-          <w:rStyle w:val="FunctionTok"/>
-        </w:rPr>
-        <w:t xml:space="preserve">stringify</w:t>
-      </w:r>
-      <w:r>
-        <w:rPr>
-          <w:rStyle w:val="NormalTok"/>
-        </w:rPr>
-        <w:t xml:space="preserve">({</w:t>
-      </w:r>
-      <w:r>
-        <w:br/>
-      </w:r>
-      <w:r>
-        <w:rPr>
-          <w:rStyle w:val="NormalTok"/>
-        </w:rPr>
-        <w:t xml:space="preserve">    </w:t>
-      </w:r>
-      <w:r>
-        <w:rPr>
-          <w:rStyle w:val="DataTypeTok"/>
-        </w:rPr>
-        <w:t xml:space="preserve">name</w:t>
-      </w:r>
-      <w:r>
-        <w:rPr>
-          <w:rStyle w:val="OperatorTok"/>
-        </w:rPr>
-        <w:t xml:space="preserve">:</w:t>
-      </w:r>
-      <w:r>
-        <w:rPr>
-          <w:rStyle w:val="NormalTok"/>
-        </w:rPr>
-        <w:t xml:space="preserve"> </w:t>
-      </w:r>
-      <w:r>
-        <w:rPr>
-          <w:rStyle w:val="StringTok"/>
-        </w:rPr>
-        <w:t xml:space="preserve">"linkedin-access-token"</w:t>
-      </w:r>
-      <w:r>
-        <w:rPr>
-          <w:rStyle w:val="OperatorTok"/>
-        </w:rPr>
-        <w:t xml:space="preserve">,</w:t>
-      </w:r>
-      <w:r>
-        <w:br/>
-      </w:r>
-      <w:r>
-        <w:rPr>
-          <w:rStyle w:val="NormalTok"/>
-        </w:rPr>
-        <w:t xml:space="preserve">    </w:t>
-      </w:r>
-      <w:r>
-        <w:rPr>
-          <w:rStyle w:val="DataTypeTok"/>
-        </w:rPr>
-        <w:t xml:space="preserve">value</w:t>
-      </w:r>
-      <w:r>
-        <w:rPr>
-          <w:rStyle w:val="OperatorTok"/>
-        </w:rPr>
-        <w:t xml:space="preserve">:</w:t>
-      </w:r>
-      <w:r>
-        <w:rPr>
-          <w:rStyle w:val="NormalTok"/>
-        </w:rPr>
-        <w:t xml:space="preserve"> </w:t>
-      </w:r>
-      <w:r>
-        <w:rPr>
-          <w:rStyle w:val="StringTok"/>
-        </w:rPr>
-        <w:t xml:space="preserve">"YOUR_TOKEN_HERE"</w:t>
-      </w:r>
-      <w:r>
-        <w:br/>
-      </w:r>
-      <w:r>
-        <w:rPr>
-          <w:rStyle w:val="NormalTok"/>
-        </w:rPr>
-        <w:t xml:space="preserve">  })</w:t>
-      </w:r>
-      <w:r>
-        <w:rPr>
-          <w:rStyle w:val="OperatorTok"/>
-        </w:rPr>
-        <w:t xml:space="preserve">,</w:t>
-      </w:r>
-      <w:r>
-        <w:br/>
-      </w:r>
-      <w:r>
-        <w:rPr>
-          <w:rStyle w:val="NormalTok"/>
-        </w:rPr>
-        <w:t xml:space="preserve">})</w:t>
-      </w:r>
-      <w:r>
-        <w:rPr>
-          <w:rStyle w:val="OperatorTok"/>
-        </w:rPr>
-        <w:t xml:space="preserve">.</w:t>
-      </w:r>
-      <w:r>
-        <w:rPr>
-          <w:rStyle w:val="FunctionTok"/>
-        </w:rPr>
-        <w:t xml:space="preserve">then</w:t>
-      </w:r>
-      <w:r>
-        <w:rPr>
-          <w:rStyle w:val="NormalTok"/>
-        </w:rPr>
-        <w:t xml:space="preserve">(r </w:t>
-      </w:r>
-      <w:r>
-        <w:rPr>
-          <w:rStyle w:val="KeywordTok"/>
-        </w:rPr>
-        <w:t xml:space="preserve">=&gt;</w:t>
-      </w:r>
-      <w:r>
-        <w:rPr>
-          <w:rStyle w:val="NormalTok"/>
-        </w:rPr>
-        <w:t xml:space="preserve"> r</w:t>
-      </w:r>
-      <w:r>
-        <w:rPr>
-          <w:rStyle w:val="OperatorTok"/>
-        </w:rPr>
-        <w:t xml:space="preserve">.</w:t>
-      </w:r>
-      <w:r>
-        <w:rPr>
-          <w:rStyle w:val="FunctionTok"/>
-        </w:rPr>
-        <w:t xml:space="preserve">json</w:t>
-      </w:r>
-      <w:r>
-        <w:rPr>
-          <w:rStyle w:val="NormalTok"/>
-        </w:rPr>
-        <w:t xml:space="preserve">())</w:t>
-      </w:r>
-      <w:r>
-        <w:rPr>
-          <w:rStyle w:val="OperatorTok"/>
-        </w:rPr>
-        <w:t xml:space="preserve">.</w:t>
-      </w:r>
-      <w:r>
-        <w:rPr>
-          <w:rStyle w:val="FunctionTok"/>
-        </w:rPr>
-        <w:t xml:space="preserve">then</w:t>
-      </w:r>
-      <w:r>
-        <w:rPr>
-          <w:rStyle w:val="NormalTok"/>
-        </w:rPr>
-        <w:t xml:space="preserve">(j </w:t>
-      </w:r>
-      <w:r>
-        <w:rPr>
-          <w:rStyle w:val="KeywordTok"/>
-        </w:rPr>
-        <w:t xml:space="preserve">=&gt;</w:t>
-      </w:r>
-      <w:r>
-        <w:rPr>
-          <w:rStyle w:val="NormalTok"/>
-        </w:rPr>
-        <w:t xml:space="preserve"> </w:t>
-      </w:r>
-      <w:r>
-        <w:rPr>
-          <w:rStyle w:val="BuiltInTok"/>
-        </w:rPr>
-        <w:t xml:space="preserve">console</w:t>
-      </w:r>
-      <w:r>
-        <w:rPr>
-          <w:rStyle w:val="OperatorTok"/>
-        </w:rPr>
-        <w:t xml:space="preserve">.</w:t>
-      </w:r>
-      <w:r>
-        <w:rPr>
-          <w:rStyle w:val="FunctionTok"/>
-        </w:rPr>
-        <w:t xml:space="preserve">log</w:t>
-      </w:r>
-      <w:r>
-        <w:rPr>
-          <w:rStyle w:val="NormalTok"/>
-        </w:rPr>
-        <w:t xml:space="preserve">(</w:t>
-      </w:r>
-      <w:r>
-        <w:rPr>
-          <w:rStyle w:val="StringTok"/>
-        </w:rPr>
-        <w:t xml:space="preserve">"Secret ID:"</w:t>
-      </w:r>
-      <w:r>
-        <w:rPr>
-          <w:rStyle w:val="OperatorTok"/>
-        </w:rPr>
-        <w:t xml:space="preserve">,</w:t>
-      </w:r>
-      <w:r>
-        <w:rPr>
-          <w:rStyle w:val="NormalTok"/>
-        </w:rPr>
-        <w:t xml:space="preserve"> j</w:t>
-      </w:r>
-      <w:r>
-        <w:rPr>
-          <w:rStyle w:val="OperatorTok"/>
-        </w:rPr>
-        <w:t xml:space="preserve">.</w:t>
-      </w:r>
-      <w:r>
-        <w:rPr>
-          <w:rStyle w:val="AttributeTok"/>
-        </w:rPr>
-        <w:t xml:space="preserve">id</w:t>
-      </w:r>
-      <w:r>
-        <w:rPr>
-          <w:rStyle w:val="NormalTok"/>
-        </w:rPr>
-        <w:t xml:space="preserve">))</w:t>
-      </w:r>
-      <w:r>
-        <w:rPr>
-          <w:rStyle w:val="OperatorTok"/>
-        </w:rPr>
-        <w:t xml:space="preserve">;</w:t>
-      </w:r>
-    </w:p>
-    <w:p>
-      <w:pPr>
-        <w:pStyle w:val="FirstParagraph"/>
-      </w:pPr>
-      <w:r>
-        <w:t xml:space="preserve">Values are encrypted at rest. Only the secret ID is visible in the API.</w:t>
-      </w:r>
-    </w:p>
-    <w:bookmarkEnd w:id="32"/>
-    <w:bookmarkStart w:id="33" w:name="configuring-agents-to-use-secrets"/>
-    <w:p>
-      <w:pPr>
-        <w:pStyle w:val="Heading3"/>
-      </w:pPr>
-      <w:r>
-        <w:t xml:space="preserve">Configuring agents to use secrets</w:t>
-      </w:r>
-    </w:p>
-    <w:p>
-      <w:pPr>
-        <w:pStyle w:val="FirstParagraph"/>
-      </w:pPr>
-      <w:r>
-        <w:t xml:space="preserve">Add the secret to the agent’s adapter config as an environment variable. In the agent’s Configuration → Advanced → env:</w:t>
-      </w:r>
-    </w:p>
-    <w:p>
-      <w:pPr>
-        <w:pStyle w:val="SourceCode"/>
-      </w:pPr>
-      <w:r>
-        <w:rPr>
-          <w:rStyle w:val="FunctionTok"/>
-        </w:rPr>
-        <w:t xml:space="preserve">{</w:t>
-      </w:r>
-      <w:r>
-        <w:br/>
-      </w:r>
-      <w:r>
-        <w:rPr>
-          <w:rStyle w:val="NormalTok"/>
-        </w:rPr>
-        <w:t xml:space="preserve">  </w:t>
-      </w:r>
-      <w:r>
-        <w:rPr>
-          <w:rStyle w:val="DataTypeTok"/>
-        </w:rPr>
-        <w:t xml:space="preserve">"LINKEDIN_ACCESS_TOKEN"</w:t>
-      </w:r>
-      <w:r>
-        <w:rPr>
-          <w:rStyle w:val="FunctionTok"/>
-        </w:rPr>
-        <w:t xml:space="preserve">:</w:t>
-      </w:r>
-      <w:r>
-        <w:rPr>
-          <w:rStyle w:val="NormalTok"/>
-        </w:rPr>
-        <w:t xml:space="preserve"> </w:t>
-      </w:r>
-      <w:r>
-        <w:rPr>
-          <w:rStyle w:val="FunctionTok"/>
-        </w:rPr>
-        <w:t xml:space="preserve">{</w:t>
-      </w:r>
-      <w:r>
-        <w:br/>
-      </w:r>
-      <w:r>
-        <w:rPr>
-          <w:rStyle w:val="NormalTok"/>
-        </w:rPr>
-        <w:t xml:space="preserve">    </w:t>
-      </w:r>
-      <w:r>
-        <w:rPr>
-          <w:rStyle w:val="DataTypeTok"/>
-        </w:rPr>
-        <w:t xml:space="preserve">"type"</w:t>
-      </w:r>
-      <w:r>
-        <w:rPr>
-          <w:rStyle w:val="FunctionTok"/>
-        </w:rPr>
-        <w:t xml:space="preserve">:</w:t>
-      </w:r>
-      <w:r>
-        <w:rPr>
-          <w:rStyle w:val="NormalTok"/>
-        </w:rPr>
-        <w:t xml:space="preserve"> </w:t>
-      </w:r>
-      <w:r>
-        <w:rPr>
-          <w:rStyle w:val="StringTok"/>
-        </w:rPr>
-        <w:t xml:space="preserve">"secret_ref"</w:t>
-      </w:r>
-      <w:r>
-        <w:rPr>
-          <w:rStyle w:val="FunctionTok"/>
-        </w:rPr>
-        <w:t xml:space="preserve">,</w:t>
-      </w:r>
-      <w:r>
-        <w:br/>
-      </w:r>
-      <w:r>
-        <w:rPr>
-          <w:rStyle w:val="NormalTok"/>
-        </w:rPr>
-        <w:t xml:space="preserve">    </w:t>
-      </w:r>
-      <w:r>
-        <w:rPr>
-          <w:rStyle w:val="DataTypeTok"/>
-        </w:rPr>
-        <w:t xml:space="preserve">"secretId"</w:t>
-      </w:r>
-      <w:r>
-        <w:rPr>
-          <w:rStyle w:val="FunctionTok"/>
-        </w:rPr>
-        <w:t xml:space="preserve">:</w:t>
-      </w:r>
-      <w:r>
-        <w:rPr>
-          <w:rStyle w:val="NormalTok"/>
-        </w:rPr>
-        <w:t xml:space="preserve"> </w:t>
-      </w:r>
-      <w:r>
-        <w:rPr>
-          <w:rStyle w:val="StringTok"/>
-        </w:rPr>
-        <w:t xml:space="preserve">"THE_SECRET_ID"</w:t>
-      </w:r>
-      <w:r>
-        <w:rPr>
-          <w:rStyle w:val="FunctionTok"/>
-        </w:rPr>
-        <w:t xml:space="preserve">,</w:t>
-      </w:r>
-      <w:r>
-        <w:br/>
-      </w:r>
-      <w:r>
-        <w:rPr>
-          <w:rStyle w:val="NormalTok"/>
-        </w:rPr>
-        <w:t xml:space="preserve">    </w:t>
-      </w:r>
-      <w:r>
-        <w:rPr>
-          <w:rStyle w:val="DataTypeTok"/>
-        </w:rPr>
-        <w:t xml:space="preserve">"version"</w:t>
-      </w:r>
-      <w:r>
-        <w:rPr>
-          <w:rStyle w:val="FunctionTok"/>
-        </w:rPr>
-        <w:t xml:space="preserve">:</w:t>
-      </w:r>
-      <w:r>
-        <w:rPr>
-          <w:rStyle w:val="NormalTok"/>
-        </w:rPr>
-        <w:t xml:space="preserve"> </w:t>
-      </w:r>
-      <w:r>
-        <w:rPr>
-          <w:rStyle w:val="StringTok"/>
-        </w:rPr>
-        <w:t xml:space="preserve">"latest"</w:t>
-      </w:r>
-      <w:r>
-        <w:br/>
-      </w:r>
-      <w:r>
-        <w:rPr>
-          <w:rStyle w:val="NormalTok"/>
-        </w:rPr>
-        <w:t xml:space="preserve">  </w:t>
-      </w:r>
-      <w:r>
-        <w:rPr>
-          <w:rStyle w:val="FunctionTok"/>
-        </w:rPr>
-        <w:t xml:space="preserve">}</w:t>
-      </w:r>
-      <w:r>
-        <w:br/>
-      </w:r>
-      <w:r>
-        <w:rPr>
-          <w:rStyle w:val="FunctionTok"/>
-        </w:rPr>
-        <w:t xml:space="preserve">}</w:t>
-      </w:r>
-    </w:p>
-    <w:p>
-      <w:pPr>
-        <w:pStyle w:val="FirstParagraph"/>
-      </w:pPr>
-      <w:r>
-        <w:t xml:space="preserve">The agent reads</w:t>
-      </w:r>
-      <w:r>
-        <w:t xml:space="preserve"> </w:t>
-      </w:r>
-      <w:r>
-        <w:rPr>
-          <w:rStyle w:val="VerbatimChar"/>
-        </w:rPr>
-        <w:t xml:space="preserve">$LINKEDIN_ACCESS_TOKEN</w:t>
-      </w:r>
-      <w:r>
-        <w:t xml:space="preserve"> </w:t>
-      </w:r>
-      <w:r>
-        <w:t xml:space="preserve">from its environment during heartbeats.</w:t>
-      </w:r>
-    </w:p>
-    <w:bookmarkEnd w:id="33"/>
-    <w:bookmarkStart w:id="34" w:name="token-lifecycle"/>
-    <w:p>
-      <w:pPr>
-        <w:pStyle w:val="Heading3"/>
-      </w:pPr>
-      <w:r>
-        <w:t xml:space="preserve">Token lifecycle</w:t>
-      </w:r>
-    </w:p>
-    <w:p>
-      <w:pPr>
-        <w:pStyle w:val="FirstParagraph"/>
-      </w:pPr>
-      <w:r>
-        <w:t xml:space="preserve">API tokens expire. Plan for it:</w:t>
+        <w:t xml:space="preserve">Paperclip has built-in secret management with a UI in the agent configuration page:</w:t>
       </w:r>
     </w:p>
     <w:p>
@@ -3769,14 +3095,39 @@
         </w:numPr>
       </w:pPr>
       <w:r>
+        <w:t xml:space="preserve">Go to the</w:t>
+      </w:r>
+      <w:r>
+        <w:t xml:space="preserve"> </w:t>
+      </w:r>
+      <w:r>
         <w:rPr>
           <w:b/>
           <w:bCs/>
         </w:rPr>
-        <w:t xml:space="preserve">LinkedIn</w:t>
-      </w:r>
-      <w:r>
-        <w:t xml:space="preserve">: tokens expire after 60 days</w:t>
+        <w:t xml:space="preserve">agent page</w:t>
+      </w:r>
+      <w:r>
+        <w:t xml:space="preserve"> </w:t>
+      </w:r>
+      <w:r>
+        <w:t xml:space="preserve">(e.g., CMO) →</w:t>
+      </w:r>
+      <w:r>
+        <w:t xml:space="preserve"> </w:t>
+      </w:r>
+      <w:r>
+        <w:rPr>
+          <w:b/>
+          <w:bCs/>
+        </w:rPr>
+        <w:t xml:space="preserve">Configuration</w:t>
+      </w:r>
+      <w:r>
+        <w:t xml:space="preserve"> </w:t>
+      </w:r>
+      <w:r>
+        <w:t xml:space="preserve">tab</w:t>
       </w:r>
     </w:p>
     <w:p>
@@ -3788,14 +3139,23 @@
         </w:numPr>
       </w:pPr>
       <w:r>
+        <w:t xml:space="preserve">Scroll to the</w:t>
+      </w:r>
+      <w:r>
+        <w:t xml:space="preserve"> </w:t>
+      </w:r>
+      <w:r>
         <w:rPr>
           <w:b/>
           <w:bCs/>
         </w:rPr>
-        <w:t xml:space="preserve">X</w:t>
-      </w:r>
-      <w:r>
-        <w:t xml:space="preserve">: tokens don’t expire but can be revoked</w:t>
+        <w:t xml:space="preserve">Environment Variables</w:t>
+      </w:r>
+      <w:r>
+        <w:t xml:space="preserve"> </w:t>
+      </w:r>
+      <w:r>
+        <w:t xml:space="preserve">section</w:t>
       </w:r>
     </w:p>
     <w:p>
@@ -3807,22 +3167,53 @@
         </w:numPr>
       </w:pPr>
       <w:r>
+        <w:t xml:space="preserve">Click</w:t>
+      </w:r>
+      <w:r>
+        <w:t xml:space="preserve"> </w:t>
+      </w:r>
+      <w:r>
         <w:rPr>
           <w:b/>
           <w:bCs/>
         </w:rPr>
-        <w:t xml:space="preserve">Slack</w:t>
-      </w:r>
-      <w:r>
-        <w:t xml:space="preserve">: bot tokens don’t expire unless the app is uninstalled</w:t>
-      </w:r>
-    </w:p>
-    <w:p>
-      <w:pPr>
-        <w:pStyle w:val="FirstParagraph"/>
-      </w:pPr>
-      <w:r>
-        <w:t xml:space="preserve">Set up a monthly</w:t>
+        <w:t xml:space="preserve">Add Variable</w:t>
+      </w:r>
+    </w:p>
+    <w:p>
+      <w:pPr>
+        <w:pStyle w:val="Compact"/>
+        <w:numPr>
+          <w:ilvl w:val="0"/>
+          <w:numId w:val="1017"/>
+        </w:numPr>
+      </w:pPr>
+      <w:r>
+        <w:t xml:space="preserve">Enter the variable name (e.g.,</w:t>
+      </w:r>
+      <w:r>
+        <w:t xml:space="preserve"> </w:t>
+      </w:r>
+      <w:r>
+        <w:rPr>
+          <w:rStyle w:val="VerbatimChar"/>
+        </w:rPr>
+        <w:t xml:space="preserve">LINKEDIN_ACCESS_TOKEN</w:t>
+      </w:r>
+      <w:r>
+        <w:t xml:space="preserve">)</w:t>
+      </w:r>
+    </w:p>
+    <w:p>
+      <w:pPr>
+        <w:pStyle w:val="Compact"/>
+        <w:numPr>
+          <w:ilvl w:val="0"/>
+          <w:numId w:val="1017"/>
+        </w:numPr>
+      </w:pPr>
+      <w:r>
+        <w:t xml:space="preserve">Switch the source from</w:t>
       </w:r>
       <w:r>
         <w:t xml:space="preserve"> </w:t>
@@ -3832,65 +3223,13 @@
           <w:b/>
           <w:bCs/>
         </w:rPr>
-        <w:t xml:space="preserve">routine</w:t>
-      </w:r>
-      <w:r>
-        <w:t xml:space="preserve"> </w:t>
-      </w:r>
-      <w:r>
-        <w:t xml:space="preserve">(see next section) that tests each credential and alerts the board if any are about to expire.</w:t>
-      </w:r>
-    </w:p>
-    <w:bookmarkEnd w:id="34"/>
-    <w:bookmarkEnd w:id="35"/>
-    <w:bookmarkStart w:id="40" w:name="scheduling-recurring-tasks-routines"/>
-    <w:p>
-      <w:pPr>
-        <w:pStyle w:val="Heading2"/>
-      </w:pPr>
-      <w:r>
-        <w:t xml:space="preserve">Scheduling recurring tasks (routines)</w:t>
-      </w:r>
-    </w:p>
-    <w:p>
-      <w:pPr>
-        <w:pStyle w:val="FirstParagraph"/>
-      </w:pPr>
-      <w:r>
-        <w:t xml:space="preserve">Routines let you run tasks on a schedule without manually creating issues each time.</w:t>
-      </w:r>
-    </w:p>
-    <w:bookmarkStart w:id="36" w:name="how-routines-work"/>
-    <w:p>
-      <w:pPr>
-        <w:pStyle w:val="Heading3"/>
-      </w:pPr>
-      <w:r>
-        <w:t xml:space="preserve">How routines work</w:t>
-      </w:r>
-    </w:p>
-    <w:p>
-      <w:pPr>
-        <w:pStyle w:val="Compact"/>
-        <w:numPr>
-          <w:ilvl w:val="0"/>
-          <w:numId w:val="1018"/>
-        </w:numPr>
-      </w:pPr>
-      <w:r>
-        <w:t xml:space="preserve">You define a routine: title, description, assigned agent, schedule</w:t>
-      </w:r>
-    </w:p>
-    <w:p>
-      <w:pPr>
-        <w:pStyle w:val="Compact"/>
-        <w:numPr>
-          <w:ilvl w:val="0"/>
-          <w:numId w:val="1018"/>
-        </w:numPr>
-      </w:pPr>
-      <w:r>
-        <w:t xml:space="preserve">When the schedule fires, Paperclip creates an</w:t>
+        <w:t xml:space="preserve">“Plain”</w:t>
+      </w:r>
+      <w:r>
+        <w:t xml:space="preserve"> </w:t>
+      </w:r>
+      <w:r>
+        <w:t xml:space="preserve">to</w:t>
       </w:r>
       <w:r>
         <w:t xml:space="preserve"> </w:t>
@@ -3900,13 +3239,7 @@
           <w:b/>
           <w:bCs/>
         </w:rPr>
-        <w:t xml:space="preserve">issue</w:t>
-      </w:r>
-      <w:r>
-        <w:t xml:space="preserve"> </w:t>
-      </w:r>
-      <w:r>
-        <w:t xml:space="preserve">automatically</w:t>
+        <w:t xml:space="preserve">“Secret”</w:t>
       </w:r>
     </w:p>
     <w:p>
@@ -3914,65 +3247,368 @@
         <w:pStyle w:val="Compact"/>
         <w:numPr>
           <w:ilvl w:val="0"/>
-          <w:numId w:val="1018"/>
-        </w:numPr>
-      </w:pPr>
-      <w:r>
-        <w:t xml:space="preserve">The assigned agent wakes up and works on the issue in its normal flow</w:t>
-      </w:r>
-    </w:p>
-    <w:p>
-      <w:pPr>
-        <w:pStyle w:val="Compact"/>
-        <w:numPr>
-          <w:ilvl w:val="0"/>
-          <w:numId w:val="1018"/>
-        </w:numPr>
-      </w:pPr>
-      <w:r>
-        <w:t xml:space="preserve">Agent marks the issue done when finished</w:t>
-      </w:r>
-    </w:p>
-    <w:bookmarkEnd w:id="36"/>
-    <w:bookmarkStart w:id="37" w:name="setting-up-a-routine"/>
-    <w:p>
-      <w:pPr>
-        <w:pStyle w:val="Heading3"/>
-      </w:pPr>
-      <w:r>
-        <w:t xml:space="preserve">Setting up a routine</w:t>
-      </w:r>
-    </w:p>
-    <w:p>
-      <w:pPr>
-        <w:pStyle w:val="FirstParagraph"/>
-      </w:pPr>
+          <w:numId w:val="1017"/>
+        </w:numPr>
+      </w:pPr>
+      <w:r>
+        <w:t xml:space="preserve">Either select an existing secret from the dropdown, or click</w:t>
+      </w:r>
+      <w:r>
+        <w:t xml:space="preserve"> </w:t>
+      </w:r>
       <w:r>
         <w:rPr>
           <w:b/>
           <w:bCs/>
         </w:rPr>
-        <w:t xml:space="preserve">Option A — Ask the CEO</w:t>
-      </w:r>
-      <w:r>
-        <w:t xml:space="preserve">: create an issue</w:t>
-      </w:r>
-      <w:r>
-        <w:t xml:space="preserve"> </w:t>
-      </w:r>
-      <w:r>
-        <w:t xml:space="preserve">“Set up a Mon/Wed/Fri LinkedIn posting routine for the CMO”</w:t>
-      </w:r>
-    </w:p>
-    <w:p>
-      <w:pPr>
-        <w:pStyle w:val="BodyText"/>
-      </w:pPr>
+        <w:t xml:space="preserve">Create New Secret</w:t>
+      </w:r>
+      <w:r>
+        <w:t xml:space="preserve">:</w:t>
+      </w:r>
+    </w:p>
+    <w:p>
+      <w:pPr>
+        <w:pStyle w:val="Compact"/>
+        <w:numPr>
+          <w:ilvl w:val="1"/>
+          <w:numId w:val="1018"/>
+        </w:numPr>
+      </w:pPr>
+      <w:r>
+        <w:t xml:space="preserve">Name:</w:t>
+      </w:r>
+      <w:r>
+        <w:t xml:space="preserve"> </w:t>
+      </w:r>
+      <w:r>
+        <w:rPr>
+          <w:rStyle w:val="VerbatimChar"/>
+        </w:rPr>
+        <w:t xml:space="preserve">linkedin-access-token</w:t>
+      </w:r>
+    </w:p>
+    <w:p>
+      <w:pPr>
+        <w:pStyle w:val="Compact"/>
+        <w:numPr>
+          <w:ilvl w:val="1"/>
+          <w:numId w:val="1018"/>
+        </w:numPr>
+      </w:pPr>
+      <w:r>
+        <w:t xml:space="preserve">Value: paste your OAuth token</w:t>
+      </w:r>
+    </w:p>
+    <w:p>
+      <w:pPr>
+        <w:pStyle w:val="Compact"/>
+        <w:numPr>
+          <w:ilvl w:val="1"/>
+          <w:numId w:val="1018"/>
+        </w:numPr>
+      </w:pPr>
+      <w:r>
+        <w:t xml:space="preserve">The value is encrypted at rest — only the secret ID is stored in the config</w:t>
+      </w:r>
+    </w:p>
+    <w:p>
+      <w:pPr>
+        <w:pStyle w:val="Compact"/>
+        <w:numPr>
+          <w:ilvl w:val="0"/>
+          <w:numId w:val="1017"/>
+        </w:numPr>
+      </w:pPr>
+      <w:r>
+        <w:t xml:space="preserve">Click</w:t>
+      </w:r>
+      <w:r>
+        <w:t xml:space="preserve"> </w:t>
+      </w:r>
       <w:r>
         <w:rPr>
           <w:b/>
           <w:bCs/>
         </w:rPr>
+        <w:t xml:space="preserve">Save</w:t>
+      </w:r>
+      <w:r>
+        <w:t xml:space="preserve"> </w:t>
+      </w:r>
+      <w:r>
+        <w:t xml:space="preserve">(floating button at the top)</w:t>
+      </w:r>
+    </w:p>
+    <w:p>
+      <w:pPr>
+        <w:pStyle w:val="FirstParagraph"/>
+      </w:pPr>
+      <w:r>
+        <w:t xml:space="preserve">The agent reads</w:t>
+      </w:r>
+      <w:r>
+        <w:t xml:space="preserve"> </w:t>
+      </w:r>
+      <w:r>
+        <w:rPr>
+          <w:rStyle w:val="VerbatimChar"/>
+        </w:rPr>
+        <w:t xml:space="preserve">$LINKEDIN_ACCESS_TOKEN</w:t>
+      </w:r>
+      <w:r>
+        <w:t xml:space="preserve"> </w:t>
+      </w:r>
+      <w:r>
+        <w:t xml:space="preserve">from its environment during every heartbeat. When you rotate the token later, update the secret value — agents referencing</w:t>
+      </w:r>
+      <w:r>
+        <w:t xml:space="preserve"> </w:t>
+      </w:r>
+      <w:r>
+        <w:rPr>
+          <w:rStyle w:val="VerbatimChar"/>
+        </w:rPr>
+        <w:t xml:space="preserve">"version": "latest"</w:t>
+      </w:r>
+      <w:r>
+        <w:t xml:space="preserve"> </w:t>
+      </w:r>
+      <w:r>
+        <w:t xml:space="preserve">automatically get the new value on their next run.</w:t>
+      </w:r>
+    </w:p>
+    <w:bookmarkEnd w:id="32"/>
+    <w:bookmarkStart w:id="33" w:name="token-lifecycle"/>
+    <w:p>
+      <w:pPr>
+        <w:pStyle w:val="Heading3"/>
+      </w:pPr>
+      <w:r>
+        <w:t xml:space="preserve">Token lifecycle</w:t>
+      </w:r>
+    </w:p>
+    <w:p>
+      <w:pPr>
+        <w:pStyle w:val="FirstParagraph"/>
+      </w:pPr>
+      <w:r>
+        <w:t xml:space="preserve">API tokens expire. Plan for it:</w:t>
+      </w:r>
+    </w:p>
+    <w:p>
+      <w:pPr>
+        <w:pStyle w:val="Compact"/>
+        <w:numPr>
+          <w:ilvl w:val="0"/>
+          <w:numId w:val="1019"/>
+        </w:numPr>
+      </w:pPr>
+      <w:r>
+        <w:rPr>
+          <w:b/>
+          <w:bCs/>
+        </w:rPr>
+        <w:t xml:space="preserve">LinkedIn</w:t>
+      </w:r>
+      <w:r>
+        <w:t xml:space="preserve">: tokens expire after 60 days</w:t>
+      </w:r>
+    </w:p>
+    <w:p>
+      <w:pPr>
+        <w:pStyle w:val="Compact"/>
+        <w:numPr>
+          <w:ilvl w:val="0"/>
+          <w:numId w:val="1019"/>
+        </w:numPr>
+      </w:pPr>
+      <w:r>
+        <w:rPr>
+          <w:b/>
+          <w:bCs/>
+        </w:rPr>
+        <w:t xml:space="preserve">X</w:t>
+      </w:r>
+      <w:r>
+        <w:t xml:space="preserve">: tokens don’t expire but can be revoked</w:t>
+      </w:r>
+    </w:p>
+    <w:p>
+      <w:pPr>
+        <w:pStyle w:val="Compact"/>
+        <w:numPr>
+          <w:ilvl w:val="0"/>
+          <w:numId w:val="1019"/>
+        </w:numPr>
+      </w:pPr>
+      <w:r>
+        <w:rPr>
+          <w:b/>
+          <w:bCs/>
+        </w:rPr>
+        <w:t xml:space="preserve">Slack</w:t>
+      </w:r>
+      <w:r>
+        <w:t xml:space="preserve">: bot tokens don’t expire unless the app is uninstalled</w:t>
+      </w:r>
+    </w:p>
+    <w:p>
+      <w:pPr>
+        <w:pStyle w:val="FirstParagraph"/>
+      </w:pPr>
+      <w:r>
+        <w:t xml:space="preserve">Set up a monthly</w:t>
+      </w:r>
+      <w:r>
+        <w:t xml:space="preserve"> </w:t>
+      </w:r>
+      <w:r>
+        <w:rPr>
+          <w:b/>
+          <w:bCs/>
+        </w:rPr>
+        <w:t xml:space="preserve">routine</w:t>
+      </w:r>
+      <w:r>
+        <w:t xml:space="preserve"> </w:t>
+      </w:r>
+      <w:r>
+        <w:t xml:space="preserve">(see next section) that tests each credential and alerts the board if any are about to expire.</w:t>
+      </w:r>
+    </w:p>
+    <w:bookmarkEnd w:id="33"/>
+    <w:bookmarkEnd w:id="34"/>
+    <w:bookmarkStart w:id="39" w:name="scheduling-recurring-tasks-routines"/>
+    <w:p>
+      <w:pPr>
+        <w:pStyle w:val="Heading2"/>
+      </w:pPr>
+      <w:r>
+        <w:t xml:space="preserve">Scheduling recurring tasks (routines)</w:t>
+      </w:r>
+    </w:p>
+    <w:p>
+      <w:pPr>
+        <w:pStyle w:val="FirstParagraph"/>
+      </w:pPr>
+      <w:r>
+        <w:t xml:space="preserve">Routines let you run tasks on a schedule without manually creating issues each time.</w:t>
+      </w:r>
+    </w:p>
+    <w:bookmarkStart w:id="35" w:name="how-routines-work"/>
+    <w:p>
+      <w:pPr>
+        <w:pStyle w:val="Heading3"/>
+      </w:pPr>
+      <w:r>
+        <w:t xml:space="preserve">How routines work</w:t>
+      </w:r>
+    </w:p>
+    <w:p>
+      <w:pPr>
+        <w:pStyle w:val="Compact"/>
+        <w:numPr>
+          <w:ilvl w:val="0"/>
+          <w:numId w:val="1020"/>
+        </w:numPr>
+      </w:pPr>
+      <w:r>
+        <w:t xml:space="preserve">You define a routine: title, description, assigned agent, schedule</w:t>
+      </w:r>
+    </w:p>
+    <w:p>
+      <w:pPr>
+        <w:pStyle w:val="Compact"/>
+        <w:numPr>
+          <w:ilvl w:val="0"/>
+          <w:numId w:val="1020"/>
+        </w:numPr>
+      </w:pPr>
+      <w:r>
+        <w:t xml:space="preserve">When the schedule fires, Paperclip creates an</w:t>
+      </w:r>
+      <w:r>
+        <w:t xml:space="preserve"> </w:t>
+      </w:r>
+      <w:r>
+        <w:rPr>
+          <w:b/>
+          <w:bCs/>
+        </w:rPr>
+        <w:t xml:space="preserve">issue</w:t>
+      </w:r>
+      <w:r>
+        <w:t xml:space="preserve"> </w:t>
+      </w:r>
+      <w:r>
+        <w:t xml:space="preserve">automatically</w:t>
+      </w:r>
+    </w:p>
+    <w:p>
+      <w:pPr>
+        <w:pStyle w:val="Compact"/>
+        <w:numPr>
+          <w:ilvl w:val="0"/>
+          <w:numId w:val="1020"/>
+        </w:numPr>
+      </w:pPr>
+      <w:r>
+        <w:t xml:space="preserve">The assigned agent wakes up and works on the issue in its normal flow</w:t>
+      </w:r>
+    </w:p>
+    <w:p>
+      <w:pPr>
+        <w:pStyle w:val="Compact"/>
+        <w:numPr>
+          <w:ilvl w:val="0"/>
+          <w:numId w:val="1020"/>
+        </w:numPr>
+      </w:pPr>
+      <w:r>
+        <w:t xml:space="preserve">Agent marks the issue done when finished</w:t>
+      </w:r>
+    </w:p>
+    <w:bookmarkEnd w:id="35"/>
+    <w:bookmarkStart w:id="36" w:name="setting-up-a-routine"/>
+    <w:p>
+      <w:pPr>
+        <w:pStyle w:val="Heading3"/>
+      </w:pPr>
+      <w:r>
+        <w:t xml:space="preserve">Setting up a routine</w:t>
+      </w:r>
+    </w:p>
+    <w:p>
+      <w:pPr>
+        <w:pStyle w:val="FirstParagraph"/>
+      </w:pPr>
+      <w:r>
+        <w:rPr>
+          <w:b/>
+          <w:bCs/>
+        </w:rPr>
+        <w:t xml:space="preserve">Option A — Ask the CEO</w:t>
+      </w:r>
+      <w:r>
+        <w:t xml:space="preserve">: create an issue</w:t>
+      </w:r>
+      <w:r>
+        <w:t xml:space="preserve"> </w:t>
+      </w:r>
+      <w:r>
+        <w:t xml:space="preserve">“Set up a Mon/Wed/Fri LinkedIn posting routine for the CMO”</w:t>
+      </w:r>
+    </w:p>
+    <w:p>
+      <w:pPr>
+        <w:pStyle w:val="BodyText"/>
+      </w:pPr>
+      <w:r>
+        <w:rPr>
+          <w:b/>
+          <w:bCs/>
+        </w:rPr>
         <w:t xml:space="preserve">Option B — Create it yourself</w:t>
       </w:r>
       <w:r>
@@ -4953,8 +4589,8 @@
         <w:t xml:space="preserve">;</w:t>
       </w:r>
     </w:p>
-    <w:bookmarkEnd w:id="37"/>
-    <w:bookmarkStart w:id="38" w:name="useful-schedules"/>
+    <w:bookmarkEnd w:id="36"/>
+    <w:bookmarkStart w:id="37" w:name="useful-schedules"/>
     <w:p>
       <w:pPr>
         <w:pStyle w:val="Heading3"/>
@@ -5136,8 +4772,8 @@
         </w:tc>
       </w:tr>
     </w:tbl>
-    <w:bookmarkEnd w:id="38"/>
-    <w:bookmarkStart w:id="39" w:name="managing-routines"/>
+    <w:bookmarkEnd w:id="37"/>
+    <w:bookmarkStart w:id="38" w:name="managing-routines"/>
     <w:p>
       <w:pPr>
         <w:pStyle w:val="Heading3"/>
@@ -5151,7 +4787,7 @@
         <w:pStyle w:val="Compact"/>
         <w:numPr>
           <w:ilvl w:val="0"/>
-          <w:numId w:val="1019"/>
+          <w:numId w:val="1021"/>
         </w:numPr>
       </w:pPr>
       <w:r>
@@ -5170,7 +4806,7 @@
         <w:pStyle w:val="Compact"/>
         <w:numPr>
           <w:ilvl w:val="0"/>
-          <w:numId w:val="1019"/>
+          <w:numId w:val="1021"/>
         </w:numPr>
       </w:pPr>
       <w:r>
@@ -5189,7 +4825,7 @@
         <w:pStyle w:val="Compact"/>
         <w:numPr>
           <w:ilvl w:val="0"/>
-          <w:numId w:val="1019"/>
+          <w:numId w:val="1021"/>
         </w:numPr>
       </w:pPr>
       <w:r>
@@ -5208,7 +4844,7 @@
         <w:pStyle w:val="Compact"/>
         <w:numPr>
           <w:ilvl w:val="0"/>
-          <w:numId w:val="1019"/>
+          <w:numId w:val="1021"/>
         </w:numPr>
       </w:pPr>
       <w:r>
@@ -5222,10 +4858,10 @@
         <w:t xml:space="preserve">: fire immediately regardless of schedule</w:t>
       </w:r>
     </w:p>
+    <w:bookmarkEnd w:id="38"/>
     <w:bookmarkEnd w:id="39"/>
     <w:bookmarkEnd w:id="40"/>
-    <w:bookmarkEnd w:id="41"/>
-    <w:bookmarkStart w:id="55" w:name="part-3-example-workflows"/>
+    <w:bookmarkStart w:id="54" w:name="part-3-example-workflows"/>
     <w:p>
       <w:pPr>
         <w:pStyle w:val="Heading1"/>
@@ -5234,7 +4870,7 @@
         <w:t xml:space="preserve">Part 3: Example Workflows</w:t>
       </w:r>
     </w:p>
-    <w:bookmarkStart w:id="45" w:name="social-media-campaign"/>
+    <w:bookmarkStart w:id="44" w:name="social-media-campaign"/>
     <w:p>
       <w:pPr>
         <w:pStyle w:val="Heading2"/>
@@ -5243,7 +4879,7 @@
         <w:t xml:space="preserve">Social media campaign</w:t>
       </w:r>
     </w:p>
-    <w:bookmarkStart w:id="42" w:name="one-time-setup-30-minutes"/>
+    <w:bookmarkStart w:id="41" w:name="one-time-setup-30-minutes"/>
     <w:p>
       <w:pPr>
         <w:pStyle w:val="Heading3"/>
@@ -5257,7 +4893,7 @@
         <w:pStyle w:val="Compact"/>
         <w:numPr>
           <w:ilvl w:val="0"/>
-          <w:numId w:val="1020"/>
+          <w:numId w:val="1022"/>
         </w:numPr>
       </w:pPr>
       <w:r>
@@ -5279,7 +4915,7 @@
         <w:pStyle w:val="Compact"/>
         <w:numPr>
           <w:ilvl w:val="0"/>
-          <w:numId w:val="1020"/>
+          <w:numId w:val="1022"/>
         </w:numPr>
       </w:pPr>
       <w:r>
@@ -5301,7 +4937,7 @@
         <w:pStyle w:val="Compact"/>
         <w:numPr>
           <w:ilvl w:val="0"/>
-          <w:numId w:val="1020"/>
+          <w:numId w:val="1022"/>
         </w:numPr>
       </w:pPr>
       <w:r>
@@ -5332,7 +4968,7 @@
         <w:pStyle w:val="Compact"/>
         <w:numPr>
           <w:ilvl w:val="0"/>
-          <w:numId w:val="1020"/>
+          <w:numId w:val="1022"/>
         </w:numPr>
       </w:pPr>
       <w:r>
@@ -5358,8 +4994,8 @@
         <w:t xml:space="preserve">linked to the goal</w:t>
       </w:r>
     </w:p>
-    <w:bookmarkEnd w:id="42"/>
-    <w:bookmarkStart w:id="43" w:name="content-creation"/>
+    <w:bookmarkEnd w:id="41"/>
+    <w:bookmarkStart w:id="42" w:name="content-creation"/>
     <w:p>
       <w:pPr>
         <w:pStyle w:val="Heading3"/>
@@ -5373,7 +5009,7 @@
         <w:pStyle w:val="Compact"/>
         <w:numPr>
           <w:ilvl w:val="0"/>
-          <w:numId w:val="1021"/>
+          <w:numId w:val="1023"/>
         </w:numPr>
       </w:pPr>
       <w:r>
@@ -5398,7 +5034,7 @@
         <w:pStyle w:val="Compact"/>
         <w:numPr>
           <w:ilvl w:val="0"/>
-          <w:numId w:val="1021"/>
+          <w:numId w:val="1023"/>
         </w:numPr>
       </w:pPr>
       <w:r>
@@ -5410,7 +5046,7 @@
         <w:pStyle w:val="Compact"/>
         <w:numPr>
           <w:ilvl w:val="0"/>
-          <w:numId w:val="1021"/>
+          <w:numId w:val="1023"/>
         </w:numPr>
       </w:pPr>
       <w:r>
@@ -5432,15 +5068,15 @@
         <w:pStyle w:val="Compact"/>
         <w:numPr>
           <w:ilvl w:val="0"/>
-          <w:numId w:val="1021"/>
+          <w:numId w:val="1023"/>
         </w:numPr>
       </w:pPr>
       <w:r>
         <w:t xml:space="preserve">Iterate via comments until satisfied</w:t>
       </w:r>
     </w:p>
-    <w:bookmarkEnd w:id="43"/>
-    <w:bookmarkStart w:id="44" w:name="automated-posting"/>
+    <w:bookmarkEnd w:id="42"/>
+    <w:bookmarkStart w:id="43" w:name="automated-posting"/>
     <w:p>
       <w:pPr>
         <w:pStyle w:val="Heading3"/>
@@ -5454,7 +5090,7 @@
         <w:pStyle w:val="Compact"/>
         <w:numPr>
           <w:ilvl w:val="0"/>
-          <w:numId w:val="1022"/>
+          <w:numId w:val="1024"/>
         </w:numPr>
       </w:pPr>
       <w:r>
@@ -5473,7 +5109,7 @@
         <w:pStyle w:val="Compact"/>
         <w:numPr>
           <w:ilvl w:val="0"/>
-          <w:numId w:val="1022"/>
+          <w:numId w:val="1024"/>
         </w:numPr>
       </w:pPr>
       <w:r>
@@ -5485,7 +5121,7 @@
         <w:pStyle w:val="Compact"/>
         <w:numPr>
           <w:ilvl w:val="0"/>
-          <w:numId w:val="1022"/>
+          <w:numId w:val="1024"/>
         </w:numPr>
       </w:pPr>
       <w:r>
@@ -5502,9 +5138,9 @@
         <w:t xml:space="preserve">the issue feed for posting confirmations</w:t>
       </w:r>
     </w:p>
+    <w:bookmarkEnd w:id="43"/>
     <w:bookmarkEnd w:id="44"/>
-    <w:bookmarkEnd w:id="45"/>
-    <w:bookmarkStart w:id="46" w:name="competitive-research"/>
+    <w:bookmarkStart w:id="45" w:name="competitive-research"/>
     <w:p>
       <w:pPr>
         <w:pStyle w:val="Heading2"/>
@@ -5518,7 +5154,7 @@
         <w:pStyle w:val="Compact"/>
         <w:numPr>
           <w:ilvl w:val="0"/>
-          <w:numId w:val="1023"/>
+          <w:numId w:val="1025"/>
         </w:numPr>
       </w:pPr>
       <w:r>
@@ -5589,7 +5225,7 @@
         <w:pStyle w:val="Compact"/>
         <w:numPr>
           <w:ilvl w:val="0"/>
-          <w:numId w:val="1024"/>
+          <w:numId w:val="1026"/>
         </w:numPr>
       </w:pPr>
       <w:r>
@@ -5601,15 +5237,15 @@
         <w:pStyle w:val="Compact"/>
         <w:numPr>
           <w:ilvl w:val="0"/>
-          <w:numId w:val="1024"/>
+          <w:numId w:val="1026"/>
         </w:numPr>
       </w:pPr>
       <w:r>
         <w:t xml:space="preserve">Review findings, request deeper dives via follow-up comments</w:t>
       </w:r>
     </w:p>
-    <w:bookmarkEnd w:id="46"/>
-    <w:bookmarkStart w:id="52" w:name="data-driven-video-content-with-remotion"/>
+    <w:bookmarkEnd w:id="45"/>
+    <w:bookmarkStart w:id="51" w:name="data-driven-video-content-with-remotion"/>
     <w:p>
       <w:pPr>
         <w:pStyle w:val="Heading2"/>
@@ -5628,7 +5264,7 @@
       <w:r>
         <w:t xml:space="preserve"> </w:t>
       </w:r>
-      <w:hyperlink r:id="rId47">
+      <w:hyperlink r:id="rId46">
         <w:r>
           <w:rPr>
             <w:rStyle w:val="Hyperlink"/>
@@ -5643,7 +5279,7 @@
         <w:t xml:space="preserve">— a React-based video framework.</w:t>
       </w:r>
     </w:p>
-    <w:bookmarkStart w:id="48" w:name="how-it-works"/>
+    <w:bookmarkStart w:id="47" w:name="how-it-works"/>
     <w:p>
       <w:pPr>
         <w:pStyle w:val="Heading3"/>
@@ -5708,8 +5344,8 @@
         <w:t xml:space="preserve">  → posts to LinkedIn/X with the video</w:t>
       </w:r>
     </w:p>
-    <w:bookmarkEnd w:id="48"/>
-    <w:bookmarkStart w:id="49" w:name="one-time-setup"/>
+    <w:bookmarkEnd w:id="47"/>
+    <w:bookmarkStart w:id="48" w:name="one-time-setup"/>
     <w:p>
       <w:pPr>
         <w:pStyle w:val="Heading3"/>
@@ -5723,7 +5359,7 @@
         <w:pStyle w:val="Compact"/>
         <w:numPr>
           <w:ilvl w:val="0"/>
-          <w:numId w:val="1025"/>
+          <w:numId w:val="1027"/>
         </w:numPr>
       </w:pPr>
       <w:r>
@@ -5745,7 +5381,7 @@
         <w:pStyle w:val="Compact"/>
         <w:numPr>
           <w:ilvl w:val="0"/>
-          <w:numId w:val="1025"/>
+          <w:numId w:val="1027"/>
         </w:numPr>
       </w:pPr>
       <w:r>
@@ -5767,7 +5403,7 @@
         <w:pStyle w:val="Compact"/>
         <w:numPr>
           <w:ilvl w:val="0"/>
-          <w:numId w:val="1025"/>
+          <w:numId w:val="1027"/>
         </w:numPr>
       </w:pPr>
       <w:r>
@@ -5789,7 +5425,7 @@
         <w:pStyle w:val="Compact"/>
         <w:numPr>
           <w:ilvl w:val="1"/>
-          <w:numId w:val="1026"/>
+          <w:numId w:val="1028"/>
         </w:numPr>
       </w:pPr>
       <w:r>
@@ -5801,7 +5437,7 @@
         <w:pStyle w:val="Compact"/>
         <w:numPr>
           <w:ilvl w:val="1"/>
-          <w:numId w:val="1026"/>
+          <w:numId w:val="1028"/>
         </w:numPr>
       </w:pPr>
       <w:r>
@@ -5813,7 +5449,7 @@
         <w:pStyle w:val="Compact"/>
         <w:numPr>
           <w:ilvl w:val="1"/>
-          <w:numId w:val="1026"/>
+          <w:numId w:val="1028"/>
         </w:numPr>
       </w:pPr>
       <w:r>
@@ -5825,85 +5461,85 @@
         <w:pStyle w:val="Compact"/>
         <w:numPr>
           <w:ilvl w:val="1"/>
-          <w:numId w:val="1026"/>
+          <w:numId w:val="1028"/>
         </w:numPr>
       </w:pPr>
       <w:r>
         <w:t xml:space="preserve">Data insight (WallStreetStats visualizations)</w:t>
       </w:r>
     </w:p>
+    <w:bookmarkEnd w:id="48"/>
+    <w:bookmarkStart w:id="49" w:name="steady-state-flow"/>
+    <w:p>
+      <w:pPr>
+        <w:pStyle w:val="Heading3"/>
+      </w:pPr>
+      <w:r>
+        <w:t xml:space="preserve">Steady-state flow</w:t>
+      </w:r>
+    </w:p>
+    <w:p>
+      <w:pPr>
+        <w:pStyle w:val="Compact"/>
+        <w:numPr>
+          <w:ilvl w:val="0"/>
+          <w:numId w:val="1029"/>
+        </w:numPr>
+      </w:pPr>
+      <w:r>
+        <w:t xml:space="preserve">Routine fires Mon/Wed/Fri</w:t>
+      </w:r>
+    </w:p>
+    <w:p>
+      <w:pPr>
+        <w:pStyle w:val="Compact"/>
+        <w:numPr>
+          <w:ilvl w:val="0"/>
+          <w:numId w:val="1029"/>
+        </w:numPr>
+      </w:pPr>
+      <w:r>
+        <w:t xml:space="preserve">CMO picks a template + fills in current data</w:t>
+      </w:r>
+    </w:p>
+    <w:p>
+      <w:pPr>
+        <w:pStyle w:val="Compact"/>
+        <w:numPr>
+          <w:ilvl w:val="0"/>
+          <w:numId w:val="1029"/>
+        </w:numPr>
+      </w:pPr>
+      <w:r>
+        <w:t xml:space="preserve">Remotion Lambda renders a 15-30 second MP4 (~$0.01-0.05 per render)</w:t>
+      </w:r>
+    </w:p>
+    <w:p>
+      <w:pPr>
+        <w:pStyle w:val="Compact"/>
+        <w:numPr>
+          <w:ilvl w:val="0"/>
+          <w:numId w:val="1029"/>
+        </w:numPr>
+      </w:pPr>
+      <w:r>
+        <w:t xml:space="preserve">CMO attaches the video to the issue for optional board review</w:t>
+      </w:r>
+    </w:p>
+    <w:p>
+      <w:pPr>
+        <w:pStyle w:val="Compact"/>
+        <w:numPr>
+          <w:ilvl w:val="0"/>
+          <w:numId w:val="1029"/>
+        </w:numPr>
+      </w:pPr>
+      <w:r>
+        <w:t xml:space="preserve">CMO posts to LinkedIn/X with the video + caption</w:t>
+      </w:r>
+    </w:p>
     <w:bookmarkEnd w:id="49"/>
-    <w:bookmarkStart w:id="50" w:name="steady-state-flow"/>
-    <w:p>
-      <w:pPr>
-        <w:pStyle w:val="Heading3"/>
-      </w:pPr>
-      <w:r>
-        <w:t xml:space="preserve">Steady-state flow</w:t>
-      </w:r>
-    </w:p>
-    <w:p>
-      <w:pPr>
-        <w:pStyle w:val="Compact"/>
-        <w:numPr>
-          <w:ilvl w:val="0"/>
-          <w:numId w:val="1027"/>
-        </w:numPr>
-      </w:pPr>
-      <w:r>
-        <w:t xml:space="preserve">Routine fires Mon/Wed/Fri</w:t>
-      </w:r>
-    </w:p>
-    <w:p>
-      <w:pPr>
-        <w:pStyle w:val="Compact"/>
-        <w:numPr>
-          <w:ilvl w:val="0"/>
-          <w:numId w:val="1027"/>
-        </w:numPr>
-      </w:pPr>
-      <w:r>
-        <w:t xml:space="preserve">CMO picks a template + fills in current data</w:t>
-      </w:r>
-    </w:p>
-    <w:p>
-      <w:pPr>
-        <w:pStyle w:val="Compact"/>
-        <w:numPr>
-          <w:ilvl w:val="0"/>
-          <w:numId w:val="1027"/>
-        </w:numPr>
-      </w:pPr>
-      <w:r>
-        <w:t xml:space="preserve">Remotion Lambda renders a 15-30 second MP4 (~$0.01-0.05 per render)</w:t>
-      </w:r>
-    </w:p>
-    <w:p>
-      <w:pPr>
-        <w:pStyle w:val="Compact"/>
-        <w:numPr>
-          <w:ilvl w:val="0"/>
-          <w:numId w:val="1027"/>
-        </w:numPr>
-      </w:pPr>
-      <w:r>
-        <w:t xml:space="preserve">CMO attaches the video to the issue for optional board review</w:t>
-      </w:r>
-    </w:p>
-    <w:p>
-      <w:pPr>
-        <w:pStyle w:val="Compact"/>
-        <w:numPr>
-          <w:ilvl w:val="0"/>
-          <w:numId w:val="1027"/>
-        </w:numPr>
-      </w:pPr>
-      <w:r>
-        <w:t xml:space="preserve">CMO posts to LinkedIn/X with the video + caption</w:t>
-      </w:r>
-    </w:p>
-    <w:bookmarkEnd w:id="50"/>
-    <w:bookmarkStart w:id="51" w:name="cost"/>
+    <w:bookmarkStart w:id="50" w:name="cost"/>
     <w:p>
       <w:pPr>
         <w:pStyle w:val="Heading3"/>
@@ -6067,9 +5703,9 @@
         <w:t xml:space="preserve">.</w:t>
       </w:r>
     </w:p>
+    <w:bookmarkEnd w:id="50"/>
     <w:bookmarkEnd w:id="51"/>
-    <w:bookmarkEnd w:id="52"/>
-    <w:bookmarkStart w:id="53" w:name="multi-agent-content-pipeline"/>
+    <w:bookmarkStart w:id="52" w:name="multi-agent-content-pipeline"/>
     <w:p>
       <w:pPr>
         <w:pStyle w:val="Heading2"/>
@@ -6091,7 +5727,7 @@
         <w:pStyle w:val="Compact"/>
         <w:numPr>
           <w:ilvl w:val="0"/>
-          <w:numId w:val="1028"/>
+          <w:numId w:val="1030"/>
         </w:numPr>
       </w:pPr>
       <w:r>
@@ -6113,7 +5749,7 @@
         <w:pStyle w:val="Compact"/>
         <w:numPr>
           <w:ilvl w:val="0"/>
-          <w:numId w:val="1028"/>
+          <w:numId w:val="1030"/>
         </w:numPr>
       </w:pPr>
       <w:r>
@@ -6135,7 +5771,7 @@
         <w:pStyle w:val="Compact"/>
         <w:numPr>
           <w:ilvl w:val="0"/>
-          <w:numId w:val="1028"/>
+          <w:numId w:val="1030"/>
         </w:numPr>
       </w:pPr>
       <w:r>
@@ -6157,7 +5793,7 @@
         <w:pStyle w:val="Compact"/>
         <w:numPr>
           <w:ilvl w:val="0"/>
-          <w:numId w:val="1028"/>
+          <w:numId w:val="1030"/>
         </w:numPr>
       </w:pPr>
       <w:r>
@@ -6188,8 +5824,8 @@
         <w:t xml:space="preserve">) and subtasks that cascade through the chain.</w:t>
       </w:r>
     </w:p>
-    <w:bookmarkEnd w:id="53"/>
-    <w:bookmarkStart w:id="54" w:name="webhook-triggered-workflows"/>
+    <w:bookmarkEnd w:id="52"/>
+    <w:bookmarkStart w:id="53" w:name="webhook-triggered-workflows"/>
     <w:p>
       <w:pPr>
         <w:pStyle w:val="Heading2"/>
@@ -6211,7 +5847,7 @@
         <w:pStyle w:val="Compact"/>
         <w:numPr>
           <w:ilvl w:val="0"/>
-          <w:numId w:val="1029"/>
+          <w:numId w:val="1031"/>
         </w:numPr>
       </w:pPr>
       <w:r>
@@ -6233,7 +5869,7 @@
         <w:pStyle w:val="Compact"/>
         <w:numPr>
           <w:ilvl w:val="0"/>
-          <w:numId w:val="1029"/>
+          <w:numId w:val="1031"/>
         </w:numPr>
       </w:pPr>
       <w:r>
@@ -6255,7 +5891,7 @@
         <w:pStyle w:val="Compact"/>
         <w:numPr>
           <w:ilvl w:val="0"/>
-          <w:numId w:val="1029"/>
+          <w:numId w:val="1031"/>
         </w:numPr>
       </w:pPr>
       <w:r>
@@ -6277,7 +5913,7 @@
         <w:pStyle w:val="Compact"/>
         <w:numPr>
           <w:ilvl w:val="0"/>
-          <w:numId w:val="1029"/>
+          <w:numId w:val="1031"/>
         </w:numPr>
       </w:pPr>
       <w:r>
@@ -6302,90 +5938,90 @@
         <w:t xml:space="preserve">Create a webhook trigger on a routine, give the URL to the external system, and the assigned agent handles each incoming event.</w:t>
       </w:r>
     </w:p>
+    <w:bookmarkEnd w:id="53"/>
     <w:bookmarkEnd w:id="54"/>
+    <w:bookmarkStart w:id="61" w:name="part-4-installing-skills-on-agents"/>
+    <w:p>
+      <w:pPr>
+        <w:pStyle w:val="Heading1"/>
+      </w:pPr>
+      <w:r>
+        <w:t xml:space="preserve">Part 4: Installing Skills on Agents</w:t>
+      </w:r>
+    </w:p>
+    <w:p>
+      <w:pPr>
+        <w:pStyle w:val="FirstParagraph"/>
+      </w:pPr>
+      <w:r>
+        <w:t xml:space="preserve">Skills are reusable packages that teach agents specific capabilities. Instead of writing long instructions for each integration, create a skill once and install it on any agent.</w:t>
+      </w:r>
+    </w:p>
+    <w:bookmarkStart w:id="55" w:name="whats-a-skill"/>
+    <w:p>
+      <w:pPr>
+        <w:pStyle w:val="Heading2"/>
+      </w:pPr>
+      <w:r>
+        <w:t xml:space="preserve">What’s a skill?</w:t>
+      </w:r>
+    </w:p>
+    <w:p>
+      <w:pPr>
+        <w:pStyle w:val="FirstParagraph"/>
+      </w:pPr>
+      <w:r>
+        <w:t xml:space="preserve">A skill is a folder with:</w:t>
+      </w:r>
+    </w:p>
+    <w:p>
+      <w:pPr>
+        <w:pStyle w:val="SourceCode"/>
+      </w:pPr>
+      <w:r>
+        <w:rPr>
+          <w:rStyle w:val="VerbatimChar"/>
+        </w:rPr>
+        <w:t xml:space="preserve">skills/</w:t>
+      </w:r>
+      <w:r>
+        <w:br/>
+      </w:r>
+      <w:r>
+        <w:rPr>
+          <w:rStyle w:val="VerbatimChar"/>
+        </w:rPr>
+        <w:t xml:space="preserve">  post-to-linkedin/</w:t>
+      </w:r>
+      <w:r>
+        <w:br/>
+      </w:r>
+      <w:r>
+        <w:rPr>
+          <w:rStyle w:val="VerbatimChar"/>
+        </w:rPr>
+        <w:t xml:space="preserve">    SKILL.md               # Instructions the agent follows</w:t>
+      </w:r>
+      <w:r>
+        <w:br/>
+      </w:r>
+      <w:r>
+        <w:rPr>
+          <w:rStyle w:val="VerbatimChar"/>
+        </w:rPr>
+        <w:t xml:space="preserve">    references/            # Supporting docs (API reference, templates)</w:t>
+      </w:r>
+    </w:p>
+    <w:p>
+      <w:pPr>
+        <w:pStyle w:val="FirstParagraph"/>
+      </w:pPr>
+      <w:r>
+        <w:t xml:space="preserve">When installed on an agent, the SKILL.md becomes available as context during heartbeats. The agent can invoke the skill by name.</w:t>
+      </w:r>
+    </w:p>
     <w:bookmarkEnd w:id="55"/>
-    <w:bookmarkStart w:id="62" w:name="part-4-installing-skills-on-agents"/>
-    <w:p>
-      <w:pPr>
-        <w:pStyle w:val="Heading1"/>
-      </w:pPr>
-      <w:r>
-        <w:t xml:space="preserve">Part 4: Installing Skills on Agents</w:t>
-      </w:r>
-    </w:p>
-    <w:p>
-      <w:pPr>
-        <w:pStyle w:val="FirstParagraph"/>
-      </w:pPr>
-      <w:r>
-        <w:t xml:space="preserve">Skills are reusable packages that teach agents specific capabilities. Instead of writing long instructions for each integration, create a skill once and install it on any agent.</w:t>
-      </w:r>
-    </w:p>
-    <w:bookmarkStart w:id="56" w:name="whats-a-skill"/>
-    <w:p>
-      <w:pPr>
-        <w:pStyle w:val="Heading2"/>
-      </w:pPr>
-      <w:r>
-        <w:t xml:space="preserve">What’s a skill?</w:t>
-      </w:r>
-    </w:p>
-    <w:p>
-      <w:pPr>
-        <w:pStyle w:val="FirstParagraph"/>
-      </w:pPr>
-      <w:r>
-        <w:t xml:space="preserve">A skill is a folder with:</w:t>
-      </w:r>
-    </w:p>
-    <w:p>
-      <w:pPr>
-        <w:pStyle w:val="SourceCode"/>
-      </w:pPr>
-      <w:r>
-        <w:rPr>
-          <w:rStyle w:val="VerbatimChar"/>
-        </w:rPr>
-        <w:t xml:space="preserve">skills/</w:t>
-      </w:r>
-      <w:r>
-        <w:br/>
-      </w:r>
-      <w:r>
-        <w:rPr>
-          <w:rStyle w:val="VerbatimChar"/>
-        </w:rPr>
-        <w:t xml:space="preserve">  post-to-linkedin/</w:t>
-      </w:r>
-      <w:r>
-        <w:br/>
-      </w:r>
-      <w:r>
-        <w:rPr>
-          <w:rStyle w:val="VerbatimChar"/>
-        </w:rPr>
-        <w:t xml:space="preserve">    SKILL.md               # Instructions the agent follows</w:t>
-      </w:r>
-      <w:r>
-        <w:br/>
-      </w:r>
-      <w:r>
-        <w:rPr>
-          <w:rStyle w:val="VerbatimChar"/>
-        </w:rPr>
-        <w:t xml:space="preserve">    references/            # Supporting docs (API reference, templates)</w:t>
-      </w:r>
-    </w:p>
-    <w:p>
-      <w:pPr>
-        <w:pStyle w:val="FirstParagraph"/>
-      </w:pPr>
-      <w:r>
-        <w:t xml:space="preserve">When installed on an agent, the SKILL.md becomes available as context during heartbeats. The agent can invoke the skill by name.</w:t>
-      </w:r>
-    </w:p>
-    <w:bookmarkEnd w:id="56"/>
-    <w:bookmarkStart w:id="57" w:name="available-skill-ideas"/>
+    <w:bookmarkStart w:id="56" w:name="available-skill-ideas"/>
     <w:p>
       <w:pPr>
         <w:pStyle w:val="Heading2"/>
@@ -6568,23 +6204,211 @@
         </w:tc>
       </w:tr>
     </w:tbl>
+    <w:bookmarkEnd w:id="56"/>
+    <w:bookmarkStart w:id="60" w:name="installing-skills-on-agents"/>
+    <w:p>
+      <w:pPr>
+        <w:pStyle w:val="Heading2"/>
+      </w:pPr>
+      <w:r>
+        <w:t xml:space="preserve">Installing skills on agents</w:t>
+      </w:r>
+    </w:p>
+    <w:bookmarkStart w:id="57" w:name="when-hiring-recommended"/>
+    <w:p>
+      <w:pPr>
+        <w:pStyle w:val="Heading3"/>
+      </w:pPr>
+      <w:r>
+        <w:t xml:space="preserve">When hiring (recommended)</w:t>
+      </w:r>
+    </w:p>
+    <w:p>
+      <w:pPr>
+        <w:pStyle w:val="FirstParagraph"/>
+      </w:pPr>
+      <w:r>
+        <w:t xml:space="preserve">Include</w:t>
+      </w:r>
+      <w:r>
+        <w:t xml:space="preserve"> </w:t>
+      </w:r>
+      <w:r>
+        <w:rPr>
+          <w:rStyle w:val="VerbatimChar"/>
+        </w:rPr>
+        <w:t xml:space="preserve">desiredSkills</w:t>
+      </w:r>
+      <w:r>
+        <w:t xml:space="preserve"> </w:t>
+      </w:r>
+      <w:r>
+        <w:t xml:space="preserve">in the hire request. The CEO agent can do this automatically when it uses the</w:t>
+      </w:r>
+      <w:r>
+        <w:t xml:space="preserve"> </w:t>
+      </w:r>
+      <w:r>
+        <w:rPr>
+          <w:rStyle w:val="VerbatimChar"/>
+        </w:rPr>
+        <w:t xml:space="preserve">paperclip-create-agent</w:t>
+      </w:r>
+      <w:r>
+        <w:t xml:space="preserve"> </w:t>
+      </w:r>
+      <w:r>
+        <w:t xml:space="preserve">skill:</w:t>
+      </w:r>
+    </w:p>
+    <w:p>
+      <w:pPr>
+        <w:pStyle w:val="SourceCode"/>
+      </w:pPr>
+      <w:r>
+        <w:rPr>
+          <w:rStyle w:val="FunctionTok"/>
+        </w:rPr>
+        <w:t xml:space="preserve">{</w:t>
+      </w:r>
+      <w:r>
+        <w:br/>
+      </w:r>
+      <w:r>
+        <w:rPr>
+          <w:rStyle w:val="NormalTok"/>
+        </w:rPr>
+        <w:t xml:space="preserve">  </w:t>
+      </w:r>
+      <w:r>
+        <w:rPr>
+          <w:rStyle w:val="DataTypeTok"/>
+        </w:rPr>
+        <w:t xml:space="preserve">"name"</w:t>
+      </w:r>
+      <w:r>
+        <w:rPr>
+          <w:rStyle w:val="FunctionTok"/>
+        </w:rPr>
+        <w:t xml:space="preserve">:</w:t>
+      </w:r>
+      <w:r>
+        <w:rPr>
+          <w:rStyle w:val="NormalTok"/>
+        </w:rPr>
+        <w:t xml:space="preserve"> </w:t>
+      </w:r>
+      <w:r>
+        <w:rPr>
+          <w:rStyle w:val="StringTok"/>
+        </w:rPr>
+        <w:t xml:space="preserve">"CMO"</w:t>
+      </w:r>
+      <w:r>
+        <w:rPr>
+          <w:rStyle w:val="FunctionTok"/>
+        </w:rPr>
+        <w:t xml:space="preserve">,</w:t>
+      </w:r>
+      <w:r>
+        <w:br/>
+      </w:r>
+      <w:r>
+        <w:rPr>
+          <w:rStyle w:val="NormalTok"/>
+        </w:rPr>
+        <w:t xml:space="preserve">  </w:t>
+      </w:r>
+      <w:r>
+        <w:rPr>
+          <w:rStyle w:val="DataTypeTok"/>
+        </w:rPr>
+        <w:t xml:space="preserve">"desiredSkills"</w:t>
+      </w:r>
+      <w:r>
+        <w:rPr>
+          <w:rStyle w:val="FunctionTok"/>
+        </w:rPr>
+        <w:t xml:space="preserve">:</w:t>
+      </w:r>
+      <w:r>
+        <w:rPr>
+          <w:rStyle w:val="NormalTok"/>
+        </w:rPr>
+        <w:t xml:space="preserve"> </w:t>
+      </w:r>
+      <w:r>
+        <w:rPr>
+          <w:rStyle w:val="OtherTok"/>
+        </w:rPr>
+        <w:t xml:space="preserve">[</w:t>
+      </w:r>
+      <w:r>
+        <w:rPr>
+          <w:rStyle w:val="StringTok"/>
+        </w:rPr>
+        <w:t xml:space="preserve">"post-to-linkedin"</w:t>
+      </w:r>
+      <w:r>
+        <w:rPr>
+          <w:rStyle w:val="OtherTok"/>
+        </w:rPr>
+        <w:t xml:space="preserve">,</w:t>
+      </w:r>
+      <w:r>
+        <w:rPr>
+          <w:rStyle w:val="NormalTok"/>
+        </w:rPr>
+        <w:t xml:space="preserve"> </w:t>
+      </w:r>
+      <w:r>
+        <w:rPr>
+          <w:rStyle w:val="StringTok"/>
+        </w:rPr>
+        <w:t xml:space="preserve">"post-to-x"</w:t>
+      </w:r>
+      <w:r>
+        <w:rPr>
+          <w:rStyle w:val="OtherTok"/>
+        </w:rPr>
+        <w:t xml:space="preserve">,</w:t>
+      </w:r>
+      <w:r>
+        <w:rPr>
+          <w:rStyle w:val="NormalTok"/>
+        </w:rPr>
+        <w:t xml:space="preserve"> </w:t>
+      </w:r>
+      <w:r>
+        <w:rPr>
+          <w:rStyle w:val="StringTok"/>
+        </w:rPr>
+        <w:t xml:space="preserve">"render-remotion-video"</w:t>
+      </w:r>
+      <w:r>
+        <w:rPr>
+          <w:rStyle w:val="OtherTok"/>
+        </w:rPr>
+        <w:t xml:space="preserve">]</w:t>
+      </w:r>
+      <w:r>
+        <w:br/>
+      </w:r>
+      <w:r>
+        <w:rPr>
+          <w:rStyle w:val="FunctionTok"/>
+        </w:rPr>
+        <w:t xml:space="preserve">}</w:t>
+      </w:r>
+    </w:p>
     <w:bookmarkEnd w:id="57"/>
-    <w:bookmarkStart w:id="61" w:name="installing-skills-on-agents"/>
-    <w:p>
-      <w:pPr>
-        <w:pStyle w:val="Heading2"/>
-      </w:pPr>
-      <w:r>
-        <w:t xml:space="preserve">Installing skills on agents</w:t>
-      </w:r>
-    </w:p>
-    <w:bookmarkStart w:id="58" w:name="when-hiring-recommended"/>
+    <w:bookmarkStart w:id="58" w:name="on-existing-agents"/>
     <w:p>
       <w:pPr>
         <w:pStyle w:val="Heading3"/>
       </w:pPr>
       <w:r>
-        <w:t xml:space="preserve">When hiring (recommended)</w:t>
+        <w:t xml:space="preserve">On existing agents</w:t>
       </w:r>
     </w:p>
     <w:p>
@@ -6592,564 +6416,376 @@
         <w:pStyle w:val="FirstParagraph"/>
       </w:pPr>
       <w:r>
-        <w:t xml:space="preserve">Include</w:t>
-      </w:r>
-      <w:r>
-        <w:t xml:space="preserve"> </w:t>
-      </w:r>
-      <w:r>
-        <w:rPr>
-          <w:rStyle w:val="VerbatimChar"/>
+        <w:t xml:space="preserve">Sync skills via the API:</w:t>
+      </w:r>
+    </w:p>
+    <w:p>
+      <w:pPr>
+        <w:pStyle w:val="SourceCode"/>
+      </w:pPr>
+      <w:r>
+        <w:rPr>
+          <w:rStyle w:val="FunctionTok"/>
+        </w:rPr>
+        <w:t xml:space="preserve">fetch</w:t>
+      </w:r>
+      <w:r>
+        <w:rPr>
+          <w:rStyle w:val="NormalTok"/>
+        </w:rPr>
+        <w:t xml:space="preserve">(</w:t>
+      </w:r>
+      <w:r>
+        <w:rPr>
+          <w:rStyle w:val="StringTok"/>
+        </w:rPr>
+        <w:t xml:space="preserve">"/api/agents/AGENT_ID/skills/sync"</w:t>
+      </w:r>
+      <w:r>
+        <w:rPr>
+          <w:rStyle w:val="OperatorTok"/>
+        </w:rPr>
+        <w:t xml:space="preserve">,</w:t>
+      </w:r>
+      <w:r>
+        <w:rPr>
+          <w:rStyle w:val="NormalTok"/>
+        </w:rPr>
+        <w:t xml:space="preserve"> {</w:t>
+      </w:r>
+      <w:r>
+        <w:br/>
+      </w:r>
+      <w:r>
+        <w:rPr>
+          <w:rStyle w:val="NormalTok"/>
+        </w:rPr>
+        <w:t xml:space="preserve">  </w:t>
+      </w:r>
+      <w:r>
+        <w:rPr>
+          <w:rStyle w:val="DataTypeTok"/>
+        </w:rPr>
+        <w:t xml:space="preserve">method</w:t>
+      </w:r>
+      <w:r>
+        <w:rPr>
+          <w:rStyle w:val="OperatorTok"/>
+        </w:rPr>
+        <w:t xml:space="preserve">:</w:t>
+      </w:r>
+      <w:r>
+        <w:rPr>
+          <w:rStyle w:val="NormalTok"/>
+        </w:rPr>
+        <w:t xml:space="preserve"> </w:t>
+      </w:r>
+      <w:r>
+        <w:rPr>
+          <w:rStyle w:val="StringTok"/>
+        </w:rPr>
+        <w:t xml:space="preserve">"POST"</w:t>
+      </w:r>
+      <w:r>
+        <w:rPr>
+          <w:rStyle w:val="OperatorTok"/>
+        </w:rPr>
+        <w:t xml:space="preserve">,</w:t>
+      </w:r>
+      <w:r>
+        <w:br/>
+      </w:r>
+      <w:r>
+        <w:rPr>
+          <w:rStyle w:val="NormalTok"/>
+        </w:rPr>
+        <w:t xml:space="preserve">  </w:t>
+      </w:r>
+      <w:r>
+        <w:rPr>
+          <w:rStyle w:val="DataTypeTok"/>
+        </w:rPr>
+        <w:t xml:space="preserve">headers</w:t>
+      </w:r>
+      <w:r>
+        <w:rPr>
+          <w:rStyle w:val="OperatorTok"/>
+        </w:rPr>
+        <w:t xml:space="preserve">:</w:t>
+      </w:r>
+      <w:r>
+        <w:rPr>
+          <w:rStyle w:val="NormalTok"/>
+        </w:rPr>
+        <w:t xml:space="preserve"> { </w:t>
+      </w:r>
+      <w:r>
+        <w:rPr>
+          <w:rStyle w:val="StringTok"/>
+        </w:rPr>
+        <w:t xml:space="preserve">"Content-Type"</w:t>
+      </w:r>
+      <w:r>
+        <w:rPr>
+          <w:rStyle w:val="OperatorTok"/>
+        </w:rPr>
+        <w:t xml:space="preserve">:</w:t>
+      </w:r>
+      <w:r>
+        <w:rPr>
+          <w:rStyle w:val="NormalTok"/>
+        </w:rPr>
+        <w:t xml:space="preserve"> </w:t>
+      </w:r>
+      <w:r>
+        <w:rPr>
+          <w:rStyle w:val="StringTok"/>
+        </w:rPr>
+        <w:t xml:space="preserve">"application/json"</w:t>
+      </w:r>
+      <w:r>
+        <w:rPr>
+          <w:rStyle w:val="NormalTok"/>
+        </w:rPr>
+        <w:t xml:space="preserve"> }</w:t>
+      </w:r>
+      <w:r>
+        <w:rPr>
+          <w:rStyle w:val="OperatorTok"/>
+        </w:rPr>
+        <w:t xml:space="preserve">,</w:t>
+      </w:r>
+      <w:r>
+        <w:br/>
+      </w:r>
+      <w:r>
+        <w:rPr>
+          <w:rStyle w:val="NormalTok"/>
+        </w:rPr>
+        <w:t xml:space="preserve">  </w:t>
+      </w:r>
+      <w:r>
+        <w:rPr>
+          <w:rStyle w:val="DataTypeTok"/>
+        </w:rPr>
+        <w:t xml:space="preserve">body</w:t>
+      </w:r>
+      <w:r>
+        <w:rPr>
+          <w:rStyle w:val="OperatorTok"/>
+        </w:rPr>
+        <w:t xml:space="preserve">:</w:t>
+      </w:r>
+      <w:r>
+        <w:rPr>
+          <w:rStyle w:val="NormalTok"/>
+        </w:rPr>
+        <w:t xml:space="preserve"> </w:t>
+      </w:r>
+      <w:r>
+        <w:rPr>
+          <w:rStyle w:val="BuiltInTok"/>
+        </w:rPr>
+        <w:t xml:space="preserve">JSON</w:t>
+      </w:r>
+      <w:r>
+        <w:rPr>
+          <w:rStyle w:val="OperatorTok"/>
+        </w:rPr>
+        <w:t xml:space="preserve">.</w:t>
+      </w:r>
+      <w:r>
+        <w:rPr>
+          <w:rStyle w:val="FunctionTok"/>
+        </w:rPr>
+        <w:t xml:space="preserve">stringify</w:t>
+      </w:r>
+      <w:r>
+        <w:rPr>
+          <w:rStyle w:val="NormalTok"/>
+        </w:rPr>
+        <w:t xml:space="preserve">({</w:t>
+      </w:r>
+      <w:r>
+        <w:br/>
+      </w:r>
+      <w:r>
+        <w:rPr>
+          <w:rStyle w:val="NormalTok"/>
+        </w:rPr>
+        <w:t xml:space="preserve">    </w:t>
+      </w:r>
+      <w:r>
+        <w:rPr>
+          <w:rStyle w:val="DataTypeTok"/>
         </w:rPr>
         <w:t xml:space="preserve">desiredSkills</w:t>
       </w:r>
       <w:r>
-        <w:t xml:space="preserve"> </w:t>
-      </w:r>
-      <w:r>
-        <w:t xml:space="preserve">in the hire request. The CEO agent can do this automatically when it uses the</w:t>
-      </w:r>
-      <w:r>
-        <w:t xml:space="preserve"> </w:t>
-      </w:r>
-      <w:r>
-        <w:rPr>
-          <w:rStyle w:val="VerbatimChar"/>
-        </w:rPr>
-        <w:t xml:space="preserve">paperclip-create-agent</w:t>
-      </w:r>
-      <w:r>
-        <w:t xml:space="preserve"> </w:t>
-      </w:r>
-      <w:r>
-        <w:t xml:space="preserve">skill:</w:t>
-      </w:r>
-    </w:p>
-    <w:p>
-      <w:pPr>
-        <w:pStyle w:val="SourceCode"/>
-      </w:pPr>
+        <w:rPr>
+          <w:rStyle w:val="OperatorTok"/>
+        </w:rPr>
+        <w:t xml:space="preserve">:</w:t>
+      </w:r>
+      <w:r>
+        <w:rPr>
+          <w:rStyle w:val="NormalTok"/>
+        </w:rPr>
+        <w:t xml:space="preserve"> [</w:t>
+      </w:r>
+      <w:r>
+        <w:rPr>
+          <w:rStyle w:val="StringTok"/>
+        </w:rPr>
+        <w:t xml:space="preserve">"post-to-linkedin"</w:t>
+      </w:r>
+      <w:r>
+        <w:rPr>
+          <w:rStyle w:val="OperatorTok"/>
+        </w:rPr>
+        <w:t xml:space="preserve">,</w:t>
+      </w:r>
+      <w:r>
+        <w:rPr>
+          <w:rStyle w:val="NormalTok"/>
+        </w:rPr>
+        <w:t xml:space="preserve"> </w:t>
+      </w:r>
+      <w:r>
+        <w:rPr>
+          <w:rStyle w:val="StringTok"/>
+        </w:rPr>
+        <w:t xml:space="preserve">"post-to-x"</w:t>
+      </w:r>
+      <w:r>
+        <w:rPr>
+          <w:rStyle w:val="NormalTok"/>
+        </w:rPr>
+        <w:t xml:space="preserve">]</w:t>
+      </w:r>
+      <w:r>
+        <w:br/>
+      </w:r>
+      <w:r>
+        <w:rPr>
+          <w:rStyle w:val="NormalTok"/>
+        </w:rPr>
+        <w:t xml:space="preserve">  })</w:t>
+      </w:r>
+      <w:r>
+        <w:rPr>
+          <w:rStyle w:val="OperatorTok"/>
+        </w:rPr>
+        <w:t xml:space="preserve">,</w:t>
+      </w:r>
+      <w:r>
+        <w:br/>
+      </w:r>
+      <w:r>
+        <w:rPr>
+          <w:rStyle w:val="NormalTok"/>
+        </w:rPr>
+        <w:t xml:space="preserve">})</w:t>
+      </w:r>
+      <w:r>
+        <w:rPr>
+          <w:rStyle w:val="OperatorTok"/>
+        </w:rPr>
+        <w:t xml:space="preserve">.</w:t>
+      </w:r>
       <w:r>
         <w:rPr>
           <w:rStyle w:val="FunctionTok"/>
         </w:rPr>
-        <w:t xml:space="preserve">{</w:t>
-      </w:r>
-      <w:r>
-        <w:br/>
-      </w:r>
-      <w:r>
-        <w:rPr>
-          <w:rStyle w:val="NormalTok"/>
-        </w:rPr>
-        <w:t xml:space="preserve">  </w:t>
-      </w:r>
-      <w:r>
-        <w:rPr>
-          <w:rStyle w:val="DataTypeTok"/>
-        </w:rPr>
-        <w:t xml:space="preserve">"name"</w:t>
+        <w:t xml:space="preserve">then</w:t>
+      </w:r>
+      <w:r>
+        <w:rPr>
+          <w:rStyle w:val="NormalTok"/>
+        </w:rPr>
+        <w:t xml:space="preserve">(r </w:t>
+      </w:r>
+      <w:r>
+        <w:rPr>
+          <w:rStyle w:val="KeywordTok"/>
+        </w:rPr>
+        <w:t xml:space="preserve">=&gt;</w:t>
+      </w:r>
+      <w:r>
+        <w:rPr>
+          <w:rStyle w:val="NormalTok"/>
+        </w:rPr>
+        <w:t xml:space="preserve"> r</w:t>
+      </w:r>
+      <w:r>
+        <w:rPr>
+          <w:rStyle w:val="OperatorTok"/>
+        </w:rPr>
+        <w:t xml:space="preserve">.</w:t>
       </w:r>
       <w:r>
         <w:rPr>
           <w:rStyle w:val="FunctionTok"/>
         </w:rPr>
-        <w:t xml:space="preserve">:</w:t>
-      </w:r>
-      <w:r>
-        <w:rPr>
-          <w:rStyle w:val="NormalTok"/>
-        </w:rPr>
-        <w:t xml:space="preserve"> </w:t>
-      </w:r>
-      <w:r>
-        <w:rPr>
-          <w:rStyle w:val="StringTok"/>
-        </w:rPr>
-        <w:t xml:space="preserve">"CMO"</w:t>
+        <w:t xml:space="preserve">json</w:t>
+      </w:r>
+      <w:r>
+        <w:rPr>
+          <w:rStyle w:val="NormalTok"/>
+        </w:rPr>
+        <w:t xml:space="preserve">())</w:t>
+      </w:r>
+      <w:r>
+        <w:rPr>
+          <w:rStyle w:val="OperatorTok"/>
+        </w:rPr>
+        <w:t xml:space="preserve">.</w:t>
       </w:r>
       <w:r>
         <w:rPr>
           <w:rStyle w:val="FunctionTok"/>
         </w:rPr>
-        <w:t xml:space="preserve">,</w:t>
-      </w:r>
-      <w:r>
-        <w:br/>
-      </w:r>
-      <w:r>
-        <w:rPr>
-          <w:rStyle w:val="NormalTok"/>
-        </w:rPr>
-        <w:t xml:space="preserve">  </w:t>
-      </w:r>
-      <w:r>
-        <w:rPr>
-          <w:rStyle w:val="DataTypeTok"/>
-        </w:rPr>
-        <w:t xml:space="preserve">"desiredSkills"</w:t>
+        <w:t xml:space="preserve">then</w:t>
+      </w:r>
+      <w:r>
+        <w:rPr>
+          <w:rStyle w:val="NormalTok"/>
+        </w:rPr>
+        <w:t xml:space="preserve">(</w:t>
+      </w:r>
+      <w:r>
+        <w:rPr>
+          <w:rStyle w:val="BuiltInTok"/>
+        </w:rPr>
+        <w:t xml:space="preserve">console</w:t>
+      </w:r>
+      <w:r>
+        <w:rPr>
+          <w:rStyle w:val="OperatorTok"/>
+        </w:rPr>
+        <w:t xml:space="preserve">.</w:t>
       </w:r>
       <w:r>
         <w:rPr>
           <w:rStyle w:val="FunctionTok"/>
         </w:rPr>
-        <w:t xml:space="preserve">:</w:t>
-      </w:r>
-      <w:r>
-        <w:rPr>
-          <w:rStyle w:val="NormalTok"/>
-        </w:rPr>
-        <w:t xml:space="preserve"> </w:t>
-      </w:r>
-      <w:r>
-        <w:rPr>
-          <w:rStyle w:val="OtherTok"/>
-        </w:rPr>
-        <w:t xml:space="preserve">[</w:t>
-      </w:r>
-      <w:r>
-        <w:rPr>
-          <w:rStyle w:val="StringTok"/>
-        </w:rPr>
-        <w:t xml:space="preserve">"post-to-linkedin"</w:t>
-      </w:r>
-      <w:r>
-        <w:rPr>
-          <w:rStyle w:val="OtherTok"/>
-        </w:rPr>
-        <w:t xml:space="preserve">,</w:t>
-      </w:r>
-      <w:r>
-        <w:rPr>
-          <w:rStyle w:val="NormalTok"/>
-        </w:rPr>
-        <w:t xml:space="preserve"> </w:t>
-      </w:r>
-      <w:r>
-        <w:rPr>
-          <w:rStyle w:val="StringTok"/>
-        </w:rPr>
-        <w:t xml:space="preserve">"post-to-x"</w:t>
-      </w:r>
-      <w:r>
-        <w:rPr>
-          <w:rStyle w:val="OtherTok"/>
-        </w:rPr>
-        <w:t xml:space="preserve">,</w:t>
-      </w:r>
-      <w:r>
-        <w:rPr>
-          <w:rStyle w:val="NormalTok"/>
-        </w:rPr>
-        <w:t xml:space="preserve"> </w:t>
-      </w:r>
-      <w:r>
-        <w:rPr>
-          <w:rStyle w:val="StringTok"/>
-        </w:rPr>
-        <w:t xml:space="preserve">"render-remotion-video"</w:t>
-      </w:r>
-      <w:r>
-        <w:rPr>
-          <w:rStyle w:val="OtherTok"/>
-        </w:rPr>
-        <w:t xml:space="preserve">]</w:t>
-      </w:r>
-      <w:r>
-        <w:br/>
-      </w:r>
-      <w:r>
-        <w:rPr>
-          <w:rStyle w:val="FunctionTok"/>
-        </w:rPr>
-        <w:t xml:space="preserve">}</w:t>
+        <w:t xml:space="preserve">log</w:t>
+      </w:r>
+      <w:r>
+        <w:rPr>
+          <w:rStyle w:val="NormalTok"/>
+        </w:rPr>
+        <w:t xml:space="preserve">)</w:t>
+      </w:r>
+      <w:r>
+        <w:rPr>
+          <w:rStyle w:val="OperatorTok"/>
+        </w:rPr>
+        <w:t xml:space="preserve">;</w:t>
       </w:r>
     </w:p>
     <w:bookmarkEnd w:id="58"/>
-    <w:bookmarkStart w:id="59" w:name="on-existing-agents"/>
-    <w:p>
-      <w:pPr>
-        <w:pStyle w:val="Heading3"/>
-      </w:pPr>
-      <w:r>
-        <w:t xml:space="preserve">On existing agents</w:t>
-      </w:r>
-    </w:p>
-    <w:p>
-      <w:pPr>
-        <w:pStyle w:val="FirstParagraph"/>
-      </w:pPr>
-      <w:r>
-        <w:t xml:space="preserve">Sync skills via the API:</w:t>
-      </w:r>
-    </w:p>
-    <w:p>
-      <w:pPr>
-        <w:pStyle w:val="SourceCode"/>
-      </w:pPr>
-      <w:r>
-        <w:rPr>
-          <w:rStyle w:val="FunctionTok"/>
-        </w:rPr>
-        <w:t xml:space="preserve">fetch</w:t>
-      </w:r>
-      <w:r>
-        <w:rPr>
-          <w:rStyle w:val="NormalTok"/>
-        </w:rPr>
-        <w:t xml:space="preserve">(</w:t>
-      </w:r>
-      <w:r>
-        <w:rPr>
-          <w:rStyle w:val="StringTok"/>
-        </w:rPr>
-        <w:t xml:space="preserve">"/api/agents/AGENT_ID/skills/sync"</w:t>
-      </w:r>
-      <w:r>
-        <w:rPr>
-          <w:rStyle w:val="OperatorTok"/>
-        </w:rPr>
-        <w:t xml:space="preserve">,</w:t>
-      </w:r>
-      <w:r>
-        <w:rPr>
-          <w:rStyle w:val="NormalTok"/>
-        </w:rPr>
-        <w:t xml:space="preserve"> {</w:t>
-      </w:r>
-      <w:r>
-        <w:br/>
-      </w:r>
-      <w:r>
-        <w:rPr>
-          <w:rStyle w:val="NormalTok"/>
-        </w:rPr>
-        <w:t xml:space="preserve">  </w:t>
-      </w:r>
-      <w:r>
-        <w:rPr>
-          <w:rStyle w:val="DataTypeTok"/>
-        </w:rPr>
-        <w:t xml:space="preserve">method</w:t>
-      </w:r>
-      <w:r>
-        <w:rPr>
-          <w:rStyle w:val="OperatorTok"/>
-        </w:rPr>
-        <w:t xml:space="preserve">:</w:t>
-      </w:r>
-      <w:r>
-        <w:rPr>
-          <w:rStyle w:val="NormalTok"/>
-        </w:rPr>
-        <w:t xml:space="preserve"> </w:t>
-      </w:r>
-      <w:r>
-        <w:rPr>
-          <w:rStyle w:val="StringTok"/>
-        </w:rPr>
-        <w:t xml:space="preserve">"POST"</w:t>
-      </w:r>
-      <w:r>
-        <w:rPr>
-          <w:rStyle w:val="OperatorTok"/>
-        </w:rPr>
-        <w:t xml:space="preserve">,</w:t>
-      </w:r>
-      <w:r>
-        <w:br/>
-      </w:r>
-      <w:r>
-        <w:rPr>
-          <w:rStyle w:val="NormalTok"/>
-        </w:rPr>
-        <w:t xml:space="preserve">  </w:t>
-      </w:r>
-      <w:r>
-        <w:rPr>
-          <w:rStyle w:val="DataTypeTok"/>
-        </w:rPr>
-        <w:t xml:space="preserve">headers</w:t>
-      </w:r>
-      <w:r>
-        <w:rPr>
-          <w:rStyle w:val="OperatorTok"/>
-        </w:rPr>
-        <w:t xml:space="preserve">:</w:t>
-      </w:r>
-      <w:r>
-        <w:rPr>
-          <w:rStyle w:val="NormalTok"/>
-        </w:rPr>
-        <w:t xml:space="preserve"> { </w:t>
-      </w:r>
-      <w:r>
-        <w:rPr>
-          <w:rStyle w:val="StringTok"/>
-        </w:rPr>
-        <w:t xml:space="preserve">"Content-Type"</w:t>
-      </w:r>
-      <w:r>
-        <w:rPr>
-          <w:rStyle w:val="OperatorTok"/>
-        </w:rPr>
-        <w:t xml:space="preserve">:</w:t>
-      </w:r>
-      <w:r>
-        <w:rPr>
-          <w:rStyle w:val="NormalTok"/>
-        </w:rPr>
-        <w:t xml:space="preserve"> </w:t>
-      </w:r>
-      <w:r>
-        <w:rPr>
-          <w:rStyle w:val="StringTok"/>
-        </w:rPr>
-        <w:t xml:space="preserve">"application/json"</w:t>
-      </w:r>
-      <w:r>
-        <w:rPr>
-          <w:rStyle w:val="NormalTok"/>
-        </w:rPr>
-        <w:t xml:space="preserve"> }</w:t>
-      </w:r>
-      <w:r>
-        <w:rPr>
-          <w:rStyle w:val="OperatorTok"/>
-        </w:rPr>
-        <w:t xml:space="preserve">,</w:t>
-      </w:r>
-      <w:r>
-        <w:br/>
-      </w:r>
-      <w:r>
-        <w:rPr>
-          <w:rStyle w:val="NormalTok"/>
-        </w:rPr>
-        <w:t xml:space="preserve">  </w:t>
-      </w:r>
-      <w:r>
-        <w:rPr>
-          <w:rStyle w:val="DataTypeTok"/>
-        </w:rPr>
-        <w:t xml:space="preserve">body</w:t>
-      </w:r>
-      <w:r>
-        <w:rPr>
-          <w:rStyle w:val="OperatorTok"/>
-        </w:rPr>
-        <w:t xml:space="preserve">:</w:t>
-      </w:r>
-      <w:r>
-        <w:rPr>
-          <w:rStyle w:val="NormalTok"/>
-        </w:rPr>
-        <w:t xml:space="preserve"> </w:t>
-      </w:r>
-      <w:r>
-        <w:rPr>
-          <w:rStyle w:val="BuiltInTok"/>
-        </w:rPr>
-        <w:t xml:space="preserve">JSON</w:t>
-      </w:r>
-      <w:r>
-        <w:rPr>
-          <w:rStyle w:val="OperatorTok"/>
-        </w:rPr>
-        <w:t xml:space="preserve">.</w:t>
-      </w:r>
-      <w:r>
-        <w:rPr>
-          <w:rStyle w:val="FunctionTok"/>
-        </w:rPr>
-        <w:t xml:space="preserve">stringify</w:t>
-      </w:r>
-      <w:r>
-        <w:rPr>
-          <w:rStyle w:val="NormalTok"/>
-        </w:rPr>
-        <w:t xml:space="preserve">({</w:t>
-      </w:r>
-      <w:r>
-        <w:br/>
-      </w:r>
-      <w:r>
-        <w:rPr>
-          <w:rStyle w:val="NormalTok"/>
-        </w:rPr>
-        <w:t xml:space="preserve">    </w:t>
-      </w:r>
-      <w:r>
-        <w:rPr>
-          <w:rStyle w:val="DataTypeTok"/>
-        </w:rPr>
-        <w:t xml:space="preserve">desiredSkills</w:t>
-      </w:r>
-      <w:r>
-        <w:rPr>
-          <w:rStyle w:val="OperatorTok"/>
-        </w:rPr>
-        <w:t xml:space="preserve">:</w:t>
-      </w:r>
-      <w:r>
-        <w:rPr>
-          <w:rStyle w:val="NormalTok"/>
-        </w:rPr>
-        <w:t xml:space="preserve"> [</w:t>
-      </w:r>
-      <w:r>
-        <w:rPr>
-          <w:rStyle w:val="StringTok"/>
-        </w:rPr>
-        <w:t xml:space="preserve">"post-to-linkedin"</w:t>
-      </w:r>
-      <w:r>
-        <w:rPr>
-          <w:rStyle w:val="OperatorTok"/>
-        </w:rPr>
-        <w:t xml:space="preserve">,</w:t>
-      </w:r>
-      <w:r>
-        <w:rPr>
-          <w:rStyle w:val="NormalTok"/>
-        </w:rPr>
-        <w:t xml:space="preserve"> </w:t>
-      </w:r>
-      <w:r>
-        <w:rPr>
-          <w:rStyle w:val="StringTok"/>
-        </w:rPr>
-        <w:t xml:space="preserve">"post-to-x"</w:t>
-      </w:r>
-      <w:r>
-        <w:rPr>
-          <w:rStyle w:val="NormalTok"/>
-        </w:rPr>
-        <w:t xml:space="preserve">]</w:t>
-      </w:r>
-      <w:r>
-        <w:br/>
-      </w:r>
-      <w:r>
-        <w:rPr>
-          <w:rStyle w:val="NormalTok"/>
-        </w:rPr>
-        <w:t xml:space="preserve">  })</w:t>
-      </w:r>
-      <w:r>
-        <w:rPr>
-          <w:rStyle w:val="OperatorTok"/>
-        </w:rPr>
-        <w:t xml:space="preserve">,</w:t>
-      </w:r>
-      <w:r>
-        <w:br/>
-      </w:r>
-      <w:r>
-        <w:rPr>
-          <w:rStyle w:val="NormalTok"/>
-        </w:rPr>
-        <w:t xml:space="preserve">})</w:t>
-      </w:r>
-      <w:r>
-        <w:rPr>
-          <w:rStyle w:val="OperatorTok"/>
-        </w:rPr>
-        <w:t xml:space="preserve">.</w:t>
-      </w:r>
-      <w:r>
-        <w:rPr>
-          <w:rStyle w:val="FunctionTok"/>
-        </w:rPr>
-        <w:t xml:space="preserve">then</w:t>
-      </w:r>
-      <w:r>
-        <w:rPr>
-          <w:rStyle w:val="NormalTok"/>
-        </w:rPr>
-        <w:t xml:space="preserve">(r </w:t>
-      </w:r>
-      <w:r>
-        <w:rPr>
-          <w:rStyle w:val="KeywordTok"/>
-        </w:rPr>
-        <w:t xml:space="preserve">=&gt;</w:t>
-      </w:r>
-      <w:r>
-        <w:rPr>
-          <w:rStyle w:val="NormalTok"/>
-        </w:rPr>
-        <w:t xml:space="preserve"> r</w:t>
-      </w:r>
-      <w:r>
-        <w:rPr>
-          <w:rStyle w:val="OperatorTok"/>
-        </w:rPr>
-        <w:t xml:space="preserve">.</w:t>
-      </w:r>
-      <w:r>
-        <w:rPr>
-          <w:rStyle w:val="FunctionTok"/>
-        </w:rPr>
-        <w:t xml:space="preserve">json</w:t>
-      </w:r>
-      <w:r>
-        <w:rPr>
-          <w:rStyle w:val="NormalTok"/>
-        </w:rPr>
-        <w:t xml:space="preserve">())</w:t>
-      </w:r>
-      <w:r>
-        <w:rPr>
-          <w:rStyle w:val="OperatorTok"/>
-        </w:rPr>
-        <w:t xml:space="preserve">.</w:t>
-      </w:r>
-      <w:r>
-        <w:rPr>
-          <w:rStyle w:val="FunctionTok"/>
-        </w:rPr>
-        <w:t xml:space="preserve">then</w:t>
-      </w:r>
-      <w:r>
-        <w:rPr>
-          <w:rStyle w:val="NormalTok"/>
-        </w:rPr>
-        <w:t xml:space="preserve">(</w:t>
-      </w:r>
-      <w:r>
-        <w:rPr>
-          <w:rStyle w:val="BuiltInTok"/>
-        </w:rPr>
-        <w:t xml:space="preserve">console</w:t>
-      </w:r>
-      <w:r>
-        <w:rPr>
-          <w:rStyle w:val="OperatorTok"/>
-        </w:rPr>
-        <w:t xml:space="preserve">.</w:t>
-      </w:r>
-      <w:r>
-        <w:rPr>
-          <w:rStyle w:val="FunctionTok"/>
-        </w:rPr>
-        <w:t xml:space="preserve">log</w:t>
-      </w:r>
-      <w:r>
-        <w:rPr>
-          <w:rStyle w:val="NormalTok"/>
-        </w:rPr>
-        <w:t xml:space="preserve">)</w:t>
-      </w:r>
-      <w:r>
-        <w:rPr>
-          <w:rStyle w:val="OperatorTok"/>
-        </w:rPr>
-        <w:t xml:space="preserve">;</w:t>
-      </w:r>
-    </w:p>
-    <w:bookmarkEnd w:id="59"/>
-    <w:bookmarkStart w:id="60" w:name="creating-custom-skills"/>
+    <w:bookmarkStart w:id="59" w:name="creating-custom-skills"/>
     <w:p>
       <w:pPr>
         <w:pStyle w:val="Heading3"/>
@@ -7645,10 +7281,10 @@
         <w:t xml:space="preserve">;</w:t>
       </w:r>
     </w:p>
+    <w:bookmarkEnd w:id="59"/>
     <w:bookmarkEnd w:id="60"/>
     <w:bookmarkEnd w:id="61"/>
-    <w:bookmarkEnd w:id="62"/>
-    <w:bookmarkStart w:id="63" w:name="appendix-key-concepts"/>
+    <w:bookmarkStart w:id="62" w:name="appendix-key-concepts"/>
     <w:p>
       <w:pPr>
         <w:pStyle w:val="Heading1"/>
@@ -8108,7 +7744,7 @@
         <w:t xml:space="preserve">(April 10, 2026, between v2026.403.0 and v2026.410.0). Paperclip is evolving rapidly — verify against your deployed version.</w:t>
       </w:r>
     </w:p>
-    <w:bookmarkEnd w:id="63"/>
+    <w:bookmarkEnd w:id="62"/>
     <w:sectPr>
       <w:footnotePr>
         <w:numRestart w:val="eachSect"/>
@@ -8903,37 +8539,37 @@
     </w:lvlOverride>
   </w:num>
   <w:num w:numId="1017">
-    <w:abstractNumId w:val="991"/>
+    <w:abstractNumId w:val="99411"/>
+    <w:lvlOverride w:ilvl="0">
+      <w:startOverride w:val="1"/>
+    </w:lvlOverride>
+    <w:lvlOverride w:ilvl="1">
+      <w:startOverride w:val="1"/>
+    </w:lvlOverride>
+    <w:lvlOverride w:ilvl="2">
+      <w:startOverride w:val="1"/>
+    </w:lvlOverride>
+    <w:lvlOverride w:ilvl="3">
+      <w:startOverride w:val="1"/>
+    </w:lvlOverride>
+    <w:lvlOverride w:ilvl="4">
+      <w:startOverride w:val="1"/>
+    </w:lvlOverride>
+    <w:lvlOverride w:ilvl="5">
+      <w:startOverride w:val="1"/>
+    </w:lvlOverride>
+    <w:lvlOverride w:ilvl="6">
+      <w:startOverride w:val="1"/>
+    </w:lvlOverride>
+    <w:lvlOverride w:ilvl="7">
+      <w:startOverride w:val="1"/>
+    </w:lvlOverride>
+    <w:lvlOverride w:ilvl="8">
+      <w:startOverride w:val="1"/>
+    </w:lvlOverride>
   </w:num>
   <w:num w:numId="1018">
-    <w:abstractNumId w:val="99411"/>
-    <w:lvlOverride w:ilvl="0">
-      <w:startOverride w:val="1"/>
-    </w:lvlOverride>
-    <w:lvlOverride w:ilvl="1">
-      <w:startOverride w:val="1"/>
-    </w:lvlOverride>
-    <w:lvlOverride w:ilvl="2">
-      <w:startOverride w:val="1"/>
-    </w:lvlOverride>
-    <w:lvlOverride w:ilvl="3">
-      <w:startOverride w:val="1"/>
-    </w:lvlOverride>
-    <w:lvlOverride w:ilvl="4">
-      <w:startOverride w:val="1"/>
-    </w:lvlOverride>
-    <w:lvlOverride w:ilvl="5">
-      <w:startOverride w:val="1"/>
-    </w:lvlOverride>
-    <w:lvlOverride w:ilvl="6">
-      <w:startOverride w:val="1"/>
-    </w:lvlOverride>
-    <w:lvlOverride w:ilvl="7">
-      <w:startOverride w:val="1"/>
-    </w:lvlOverride>
-    <w:lvlOverride w:ilvl="8">
-      <w:startOverride w:val="1"/>
-    </w:lvlOverride>
+    <w:abstractNumId w:val="991"/>
   </w:num>
   <w:num w:numId="1019">
     <w:abstractNumId w:val="991"/>
@@ -8969,6 +8605,39 @@
     </w:lvlOverride>
   </w:num>
   <w:num w:numId="1021">
+    <w:abstractNumId w:val="991"/>
+  </w:num>
+  <w:num w:numId="1022">
+    <w:abstractNumId w:val="99411"/>
+    <w:lvlOverride w:ilvl="0">
+      <w:startOverride w:val="1"/>
+    </w:lvlOverride>
+    <w:lvlOverride w:ilvl="1">
+      <w:startOverride w:val="1"/>
+    </w:lvlOverride>
+    <w:lvlOverride w:ilvl="2">
+      <w:startOverride w:val="1"/>
+    </w:lvlOverride>
+    <w:lvlOverride w:ilvl="3">
+      <w:startOverride w:val="1"/>
+    </w:lvlOverride>
+    <w:lvlOverride w:ilvl="4">
+      <w:startOverride w:val="1"/>
+    </w:lvlOverride>
+    <w:lvlOverride w:ilvl="5">
+      <w:startOverride w:val="1"/>
+    </w:lvlOverride>
+    <w:lvlOverride w:ilvl="6">
+      <w:startOverride w:val="1"/>
+    </w:lvlOverride>
+    <w:lvlOverride w:ilvl="7">
+      <w:startOverride w:val="1"/>
+    </w:lvlOverride>
+    <w:lvlOverride w:ilvl="8">
+      <w:startOverride w:val="1"/>
+    </w:lvlOverride>
+  </w:num>
+  <w:num w:numId="1023">
     <w:abstractNumId w:val="99415"/>
     <w:lvlOverride w:ilvl="0">
       <w:startOverride w:val="5"/>
@@ -8998,7 +8667,7 @@
       <w:startOverride w:val="5"/>
     </w:lvlOverride>
   </w:num>
-  <w:num w:numId="1022">
+  <w:num w:numId="1024">
     <w:abstractNumId w:val="99419"/>
     <w:lvlOverride w:ilvl="0">
       <w:startOverride w:val="9"/>
@@ -9026,66 +8695,6 @@
     </w:lvlOverride>
     <w:lvlOverride w:ilvl="8">
       <w:startOverride w:val="9"/>
-    </w:lvlOverride>
-  </w:num>
-  <w:num w:numId="1023">
-    <w:abstractNumId w:val="99411"/>
-    <w:lvlOverride w:ilvl="0">
-      <w:startOverride w:val="1"/>
-    </w:lvlOverride>
-    <w:lvlOverride w:ilvl="1">
-      <w:startOverride w:val="1"/>
-    </w:lvlOverride>
-    <w:lvlOverride w:ilvl="2">
-      <w:startOverride w:val="1"/>
-    </w:lvlOverride>
-    <w:lvlOverride w:ilvl="3">
-      <w:startOverride w:val="1"/>
-    </w:lvlOverride>
-    <w:lvlOverride w:ilvl="4">
-      <w:startOverride w:val="1"/>
-    </w:lvlOverride>
-    <w:lvlOverride w:ilvl="5">
-      <w:startOverride w:val="1"/>
-    </w:lvlOverride>
-    <w:lvlOverride w:ilvl="6">
-      <w:startOverride w:val="1"/>
-    </w:lvlOverride>
-    <w:lvlOverride w:ilvl="7">
-      <w:startOverride w:val="1"/>
-    </w:lvlOverride>
-    <w:lvlOverride w:ilvl="8">
-      <w:startOverride w:val="1"/>
-    </w:lvlOverride>
-  </w:num>
-  <w:num w:numId="1024">
-    <w:abstractNumId w:val="99412"/>
-    <w:lvlOverride w:ilvl="0">
-      <w:startOverride w:val="2"/>
-    </w:lvlOverride>
-    <w:lvlOverride w:ilvl="1">
-      <w:startOverride w:val="2"/>
-    </w:lvlOverride>
-    <w:lvlOverride w:ilvl="2">
-      <w:startOverride w:val="2"/>
-    </w:lvlOverride>
-    <w:lvlOverride w:ilvl="3">
-      <w:startOverride w:val="2"/>
-    </w:lvlOverride>
-    <w:lvlOverride w:ilvl="4">
-      <w:startOverride w:val="2"/>
-    </w:lvlOverride>
-    <w:lvlOverride w:ilvl="5">
-      <w:startOverride w:val="2"/>
-    </w:lvlOverride>
-    <w:lvlOverride w:ilvl="6">
-      <w:startOverride w:val="2"/>
-    </w:lvlOverride>
-    <w:lvlOverride w:ilvl="7">
-      <w:startOverride w:val="2"/>
-    </w:lvlOverride>
-    <w:lvlOverride w:ilvl="8">
-      <w:startOverride w:val="2"/>
     </w:lvlOverride>
   </w:num>
   <w:num w:numId="1025">
@@ -9119,12 +8728,72 @@
     </w:lvlOverride>
   </w:num>
   <w:num w:numId="1026">
+    <w:abstractNumId w:val="99412"/>
+    <w:lvlOverride w:ilvl="0">
+      <w:startOverride w:val="2"/>
+    </w:lvlOverride>
+    <w:lvlOverride w:ilvl="1">
+      <w:startOverride w:val="2"/>
+    </w:lvlOverride>
+    <w:lvlOverride w:ilvl="2">
+      <w:startOverride w:val="2"/>
+    </w:lvlOverride>
+    <w:lvlOverride w:ilvl="3">
+      <w:startOverride w:val="2"/>
+    </w:lvlOverride>
+    <w:lvlOverride w:ilvl="4">
+      <w:startOverride w:val="2"/>
+    </w:lvlOverride>
+    <w:lvlOverride w:ilvl="5">
+      <w:startOverride w:val="2"/>
+    </w:lvlOverride>
+    <w:lvlOverride w:ilvl="6">
+      <w:startOverride w:val="2"/>
+    </w:lvlOverride>
+    <w:lvlOverride w:ilvl="7">
+      <w:startOverride w:val="2"/>
+    </w:lvlOverride>
+    <w:lvlOverride w:ilvl="8">
+      <w:startOverride w:val="2"/>
+    </w:lvlOverride>
+  </w:num>
+  <w:num w:numId="1027">
+    <w:abstractNumId w:val="99411"/>
+    <w:lvlOverride w:ilvl="0">
+      <w:startOverride w:val="1"/>
+    </w:lvlOverride>
+    <w:lvlOverride w:ilvl="1">
+      <w:startOverride w:val="1"/>
+    </w:lvlOverride>
+    <w:lvlOverride w:ilvl="2">
+      <w:startOverride w:val="1"/>
+    </w:lvlOverride>
+    <w:lvlOverride w:ilvl="3">
+      <w:startOverride w:val="1"/>
+    </w:lvlOverride>
+    <w:lvlOverride w:ilvl="4">
+      <w:startOverride w:val="1"/>
+    </w:lvlOverride>
+    <w:lvlOverride w:ilvl="5">
+      <w:startOverride w:val="1"/>
+    </w:lvlOverride>
+    <w:lvlOverride w:ilvl="6">
+      <w:startOverride w:val="1"/>
+    </w:lvlOverride>
+    <w:lvlOverride w:ilvl="7">
+      <w:startOverride w:val="1"/>
+    </w:lvlOverride>
+    <w:lvlOverride w:ilvl="8">
+      <w:startOverride w:val="1"/>
+    </w:lvlOverride>
+  </w:num>
+  <w:num w:numId="1028">
     <w:abstractNumId w:val="991"/>
   </w:num>
-  <w:num w:numId="1027">
+  <w:num w:numId="1029">
     <w:abstractNumId w:val="991"/>
   </w:num>
-  <w:num w:numId="1028">
+  <w:num w:numId="1030">
     <w:abstractNumId w:val="99411"/>
     <w:lvlOverride w:ilvl="0">
       <w:startOverride w:val="1"/>
@@ -9154,7 +8823,7 @@
       <w:startOverride w:val="1"/>
     </w:lvlOverride>
   </w:num>
-  <w:num w:numId="1029">
+  <w:num w:numId="1031">
     <w:abstractNumId w:val="991"/>
   </w:num>
 </w:numbering>

</xml_diff>

<commit_message>
docs: add routine templates, recurring posting, and analytics recipes
- Routine variables/templates section: {{date}} built-in, custom
  variables with types, how secrets/routines/agents separate concerns
- LinkedIn 3x/week posting routine with {{date}} scoped issues
- X daily posting routine with WallStreetStats data integration
- Weekly social analytics routine: pull LinkedIn + X stats, compare
  week-over-week, recommend optimizations
- Analytics → content feedback loop pattern (analytics fires before
  posting routines, CMO self-optimizes)
- Secrets now documented as dashboard UI flow, not dev tools

Co-Authored-By: Claude Opus 4.6 (1M context) <noreply@anthropic.com>
</commit_message>
<xml_diff>
--- a/docs/paperclip-cloud-operations-guide.docx
+++ b/docs/paperclip-cloud-operations-guide.docx
@@ -2718,7 +2718,7 @@
     </w:p>
     <w:bookmarkEnd w:id="26"/>
     <w:bookmarkEnd w:id="27"/>
-    <w:bookmarkStart w:id="40" w:name="part-2-3rd-party-integrations"/>
+    <w:bookmarkStart w:id="42" w:name="part-2-3rd-party-integrations"/>
     <w:p>
       <w:pPr>
         <w:pStyle w:val="Heading1"/>
@@ -3479,7 +3479,7 @@
     </w:p>
     <w:bookmarkEnd w:id="33"/>
     <w:bookmarkEnd w:id="34"/>
-    <w:bookmarkStart w:id="39" w:name="scheduling-recurring-tasks-routines"/>
+    <w:bookmarkStart w:id="41" w:name="scheduling-recurring-tasks-routines"/>
     <w:p>
       <w:pPr>
         <w:pStyle w:val="Heading2"/>
@@ -4773,13 +4773,856 @@
       </w:tr>
     </w:tbl>
     <w:bookmarkEnd w:id="37"/>
-    <w:bookmarkStart w:id="38" w:name="managing-routines"/>
+    <w:bookmarkStart w:id="38" w:name="routine-variables-and-templates"/>
     <w:p>
       <w:pPr>
         <w:pStyle w:val="Heading3"/>
       </w:pPr>
       <w:r>
-        <w:t xml:space="preserve">Managing routines</w:t>
+        <w:t xml:space="preserve">Routine variables and templates</w:t>
+      </w:r>
+    </w:p>
+    <w:p>
+      <w:pPr>
+        <w:pStyle w:val="FirstParagraph"/>
+      </w:pPr>
+      <w:r>
+        <w:t xml:space="preserve">Routine titles and descriptions support</w:t>
+      </w:r>
+      <w:r>
+        <w:t xml:space="preserve"> </w:t>
+      </w:r>
+      <w:r>
+        <w:rPr>
+          <w:rStyle w:val="VerbatimChar"/>
+        </w:rPr>
+        <w:t xml:space="preserve">{{variable}}</w:t>
+      </w:r>
+      <w:r>
+        <w:t xml:space="preserve"> </w:t>
+      </w:r>
+      <w:r>
+        <w:t xml:space="preserve">placeholders that get filled in when the routine fires:</w:t>
+      </w:r>
+    </w:p>
+    <w:p>
+      <w:pPr>
+        <w:pStyle w:val="BodyText"/>
+      </w:pPr>
+      <w:r>
+        <w:rPr>
+          <w:b/>
+          <w:bCs/>
+        </w:rPr>
+        <w:t xml:space="preserve">Built-in variable</w:t>
+      </w:r>
+      <w:r>
+        <w:t xml:space="preserve">:</w:t>
+      </w:r>
+      <w:r>
+        <w:t xml:space="preserve"> </w:t>
+      </w:r>
+      <w:r>
+        <w:rPr>
+          <w:rStyle w:val="VerbatimChar"/>
+        </w:rPr>
+        <w:t xml:space="preserve">{{date}}</w:t>
+      </w:r>
+      <w:r>
+        <w:t xml:space="preserve"> </w:t>
+      </w:r>
+      <w:r>
+        <w:t xml:space="preserve">— expands to today’s date (YYYY-MM-DD)</w:t>
+      </w:r>
+    </w:p>
+    <w:p>
+      <w:pPr>
+        <w:pStyle w:val="BodyText"/>
+      </w:pPr>
+      <w:r>
+        <w:rPr>
+          <w:b/>
+          <w:bCs/>
+        </w:rPr>
+        <w:t xml:space="preserve">Custom variables</w:t>
+      </w:r>
+      <w:r>
+        <w:t xml:space="preserve">: define your own with types (</w:t>
+      </w:r>
+      <w:r>
+        <w:rPr>
+          <w:rStyle w:val="VerbatimChar"/>
+        </w:rPr>
+        <w:t xml:space="preserve">text</w:t>
+      </w:r>
+      <w:r>
+        <w:t xml:space="preserve">,</w:t>
+      </w:r>
+      <w:r>
+        <w:t xml:space="preserve"> </w:t>
+      </w:r>
+      <w:r>
+        <w:rPr>
+          <w:rStyle w:val="VerbatimChar"/>
+        </w:rPr>
+        <w:t xml:space="preserve">textarea</w:t>
+      </w:r>
+      <w:r>
+        <w:t xml:space="preserve">,</w:t>
+      </w:r>
+      <w:r>
+        <w:t xml:space="preserve"> </w:t>
+      </w:r>
+      <w:r>
+        <w:rPr>
+          <w:rStyle w:val="VerbatimChar"/>
+        </w:rPr>
+        <w:t xml:space="preserve">number</w:t>
+      </w:r>
+      <w:r>
+        <w:t xml:space="preserve">,</w:t>
+      </w:r>
+      <w:r>
+        <w:t xml:space="preserve"> </w:t>
+      </w:r>
+      <w:r>
+        <w:rPr>
+          <w:rStyle w:val="VerbatimChar"/>
+        </w:rPr>
+        <w:t xml:space="preserve">boolean</w:t>
+      </w:r>
+      <w:r>
+        <w:t xml:space="preserve">,</w:t>
+      </w:r>
+      <w:r>
+        <w:t xml:space="preserve"> </w:t>
+      </w:r>
+      <w:r>
+        <w:rPr>
+          <w:rStyle w:val="VerbatimChar"/>
+        </w:rPr>
+        <w:t xml:space="preserve">select</w:t>
+      </w:r>
+      <w:r>
+        <w:t xml:space="preserve">)</w:t>
+      </w:r>
+    </w:p>
+    <w:p>
+      <w:pPr>
+        <w:pStyle w:val="BodyText"/>
+      </w:pPr>
+      <w:r>
+        <w:rPr>
+          <w:b/>
+          <w:bCs/>
+        </w:rPr>
+        <w:t xml:space="preserve">Example</w:t>
+      </w:r>
+      <w:r>
+        <w:t xml:space="preserve"> </w:t>
+      </w:r>
+      <w:r>
+        <w:t xml:space="preserve">— a routine with dynamic title:</w:t>
+      </w:r>
+    </w:p>
+    <w:p>
+      <w:pPr>
+        <w:pStyle w:val="SourceCode"/>
+      </w:pPr>
+      <w:r>
+        <w:rPr>
+          <w:rStyle w:val="FunctionTok"/>
+        </w:rPr>
+        <w:t xml:space="preserve">{</w:t>
+      </w:r>
+      <w:r>
+        <w:br/>
+      </w:r>
+      <w:r>
+        <w:rPr>
+          <w:rStyle w:val="NormalTok"/>
+        </w:rPr>
+        <w:t xml:space="preserve">  </w:t>
+      </w:r>
+      <w:r>
+        <w:rPr>
+          <w:rStyle w:val="DataTypeTok"/>
+        </w:rPr>
+        <w:t xml:space="preserve">"title"</w:t>
+      </w:r>
+      <w:r>
+        <w:rPr>
+          <w:rStyle w:val="FunctionTok"/>
+        </w:rPr>
+        <w:t xml:space="preserve">:</w:t>
+      </w:r>
+      <w:r>
+        <w:rPr>
+          <w:rStyle w:val="NormalTok"/>
+        </w:rPr>
+        <w:t xml:space="preserve"> </w:t>
+      </w:r>
+      <w:r>
+        <w:rPr>
+          <w:rStyle w:val="StringTok"/>
+        </w:rPr>
+        <w:t xml:space="preserve">"Social media post for {{date}} — {{platform}}"</w:t>
+      </w:r>
+      <w:r>
+        <w:rPr>
+          <w:rStyle w:val="FunctionTok"/>
+        </w:rPr>
+        <w:t xml:space="preserve">,</w:t>
+      </w:r>
+      <w:r>
+        <w:br/>
+      </w:r>
+      <w:r>
+        <w:rPr>
+          <w:rStyle w:val="NormalTok"/>
+        </w:rPr>
+        <w:t xml:space="preserve">  </w:t>
+      </w:r>
+      <w:r>
+        <w:rPr>
+          <w:rStyle w:val="DataTypeTok"/>
+        </w:rPr>
+        <w:t xml:space="preserve">"description"</w:t>
+      </w:r>
+      <w:r>
+        <w:rPr>
+          <w:rStyle w:val="FunctionTok"/>
+        </w:rPr>
+        <w:t xml:space="preserve">:</w:t>
+      </w:r>
+      <w:r>
+        <w:rPr>
+          <w:rStyle w:val="NormalTok"/>
+        </w:rPr>
+        <w:t xml:space="preserve"> </w:t>
+      </w:r>
+      <w:r>
+        <w:rPr>
+          <w:rStyle w:val="StringTok"/>
+        </w:rPr>
+        <w:t xml:space="preserve">"Post the next item from the content calendar.</w:t>
+      </w:r>
+      <w:r>
+        <w:rPr>
+          <w:rStyle w:val="CharTok"/>
+        </w:rPr>
+        <w:t xml:space="preserve">\n</w:t>
+      </w:r>
+      <w:r>
+        <w:rPr>
+          <w:rStyle w:val="StringTok"/>
+        </w:rPr>
+        <w:t xml:space="preserve">Platform: {{platform}}</w:t>
+      </w:r>
+      <w:r>
+        <w:rPr>
+          <w:rStyle w:val="CharTok"/>
+        </w:rPr>
+        <w:t xml:space="preserve">\n</w:t>
+      </w:r>
+      <w:r>
+        <w:rPr>
+          <w:rStyle w:val="StringTok"/>
+        </w:rPr>
+        <w:t xml:space="preserve">Content type: {{content_type}}"</w:t>
+      </w:r>
+      <w:r>
+        <w:rPr>
+          <w:rStyle w:val="FunctionTok"/>
+        </w:rPr>
+        <w:t xml:space="preserve">,</w:t>
+      </w:r>
+      <w:r>
+        <w:br/>
+      </w:r>
+      <w:r>
+        <w:rPr>
+          <w:rStyle w:val="NormalTok"/>
+        </w:rPr>
+        <w:t xml:space="preserve">  </w:t>
+      </w:r>
+      <w:r>
+        <w:rPr>
+          <w:rStyle w:val="DataTypeTok"/>
+        </w:rPr>
+        <w:t xml:space="preserve">"variables"</w:t>
+      </w:r>
+      <w:r>
+        <w:rPr>
+          <w:rStyle w:val="FunctionTok"/>
+        </w:rPr>
+        <w:t xml:space="preserve">:</w:t>
+      </w:r>
+      <w:r>
+        <w:rPr>
+          <w:rStyle w:val="NormalTok"/>
+        </w:rPr>
+        <w:t xml:space="preserve"> </w:t>
+      </w:r>
+      <w:r>
+        <w:rPr>
+          <w:rStyle w:val="OtherTok"/>
+        </w:rPr>
+        <w:t xml:space="preserve">[</w:t>
+      </w:r>
+      <w:r>
+        <w:br/>
+      </w:r>
+      <w:r>
+        <w:rPr>
+          <w:rStyle w:val="NormalTok"/>
+        </w:rPr>
+        <w:t xml:space="preserve">    </w:t>
+      </w:r>
+      <w:r>
+        <w:rPr>
+          <w:rStyle w:val="FunctionTok"/>
+        </w:rPr>
+        <w:t xml:space="preserve">{</w:t>
+      </w:r>
+      <w:r>
+        <w:rPr>
+          <w:rStyle w:val="NormalTok"/>
+        </w:rPr>
+        <w:t xml:space="preserve"> </w:t>
+      </w:r>
+      <w:r>
+        <w:rPr>
+          <w:rStyle w:val="DataTypeTok"/>
+        </w:rPr>
+        <w:t xml:space="preserve">"name"</w:t>
+      </w:r>
+      <w:r>
+        <w:rPr>
+          <w:rStyle w:val="FunctionTok"/>
+        </w:rPr>
+        <w:t xml:space="preserve">:</w:t>
+      </w:r>
+      <w:r>
+        <w:rPr>
+          <w:rStyle w:val="NormalTok"/>
+        </w:rPr>
+        <w:t xml:space="preserve"> </w:t>
+      </w:r>
+      <w:r>
+        <w:rPr>
+          <w:rStyle w:val="StringTok"/>
+        </w:rPr>
+        <w:t xml:space="preserve">"platform"</w:t>
+      </w:r>
+      <w:r>
+        <w:rPr>
+          <w:rStyle w:val="FunctionTok"/>
+        </w:rPr>
+        <w:t xml:space="preserve">,</w:t>
+      </w:r>
+      <w:r>
+        <w:rPr>
+          <w:rStyle w:val="NormalTok"/>
+        </w:rPr>
+        <w:t xml:space="preserve"> </w:t>
+      </w:r>
+      <w:r>
+        <w:rPr>
+          <w:rStyle w:val="DataTypeTok"/>
+        </w:rPr>
+        <w:t xml:space="preserve">"type"</w:t>
+      </w:r>
+      <w:r>
+        <w:rPr>
+          <w:rStyle w:val="FunctionTok"/>
+        </w:rPr>
+        <w:t xml:space="preserve">:</w:t>
+      </w:r>
+      <w:r>
+        <w:rPr>
+          <w:rStyle w:val="NormalTok"/>
+        </w:rPr>
+        <w:t xml:space="preserve"> </w:t>
+      </w:r>
+      <w:r>
+        <w:rPr>
+          <w:rStyle w:val="StringTok"/>
+        </w:rPr>
+        <w:t xml:space="preserve">"select"</w:t>
+      </w:r>
+      <w:r>
+        <w:rPr>
+          <w:rStyle w:val="FunctionTok"/>
+        </w:rPr>
+        <w:t xml:space="preserve">,</w:t>
+      </w:r>
+      <w:r>
+        <w:rPr>
+          <w:rStyle w:val="NormalTok"/>
+        </w:rPr>
+        <w:t xml:space="preserve"> </w:t>
+      </w:r>
+      <w:r>
+        <w:rPr>
+          <w:rStyle w:val="DataTypeTok"/>
+        </w:rPr>
+        <w:t xml:space="preserve">"options"</w:t>
+      </w:r>
+      <w:r>
+        <w:rPr>
+          <w:rStyle w:val="FunctionTok"/>
+        </w:rPr>
+        <w:t xml:space="preserve">:</w:t>
+      </w:r>
+      <w:r>
+        <w:rPr>
+          <w:rStyle w:val="NormalTok"/>
+        </w:rPr>
+        <w:t xml:space="preserve"> </w:t>
+      </w:r>
+      <w:r>
+        <w:rPr>
+          <w:rStyle w:val="OtherTok"/>
+        </w:rPr>
+        <w:t xml:space="preserve">[</w:t>
+      </w:r>
+      <w:r>
+        <w:rPr>
+          <w:rStyle w:val="StringTok"/>
+        </w:rPr>
+        <w:t xml:space="preserve">"linkedin"</w:t>
+      </w:r>
+      <w:r>
+        <w:rPr>
+          <w:rStyle w:val="OtherTok"/>
+        </w:rPr>
+        <w:t xml:space="preserve">,</w:t>
+      </w:r>
+      <w:r>
+        <w:rPr>
+          <w:rStyle w:val="NormalTok"/>
+        </w:rPr>
+        <w:t xml:space="preserve"> </w:t>
+      </w:r>
+      <w:r>
+        <w:rPr>
+          <w:rStyle w:val="StringTok"/>
+        </w:rPr>
+        <w:t xml:space="preserve">"x"</w:t>
+      </w:r>
+      <w:r>
+        <w:rPr>
+          <w:rStyle w:val="OtherTok"/>
+        </w:rPr>
+        <w:t xml:space="preserve">,</w:t>
+      </w:r>
+      <w:r>
+        <w:rPr>
+          <w:rStyle w:val="NormalTok"/>
+        </w:rPr>
+        <w:t xml:space="preserve"> </w:t>
+      </w:r>
+      <w:r>
+        <w:rPr>
+          <w:rStyle w:val="StringTok"/>
+        </w:rPr>
+        <w:t xml:space="preserve">"both"</w:t>
+      </w:r>
+      <w:r>
+        <w:rPr>
+          <w:rStyle w:val="OtherTok"/>
+        </w:rPr>
+        <w:t xml:space="preserve">]</w:t>
+      </w:r>
+      <w:r>
+        <w:rPr>
+          <w:rStyle w:val="FunctionTok"/>
+        </w:rPr>
+        <w:t xml:space="preserve">,</w:t>
+      </w:r>
+      <w:r>
+        <w:rPr>
+          <w:rStyle w:val="NormalTok"/>
+        </w:rPr>
+        <w:t xml:space="preserve"> </w:t>
+      </w:r>
+      <w:r>
+        <w:rPr>
+          <w:rStyle w:val="DataTypeTok"/>
+        </w:rPr>
+        <w:t xml:space="preserve">"defaultValue"</w:t>
+      </w:r>
+      <w:r>
+        <w:rPr>
+          <w:rStyle w:val="FunctionTok"/>
+        </w:rPr>
+        <w:t xml:space="preserve">:</w:t>
+      </w:r>
+      <w:r>
+        <w:rPr>
+          <w:rStyle w:val="NormalTok"/>
+        </w:rPr>
+        <w:t xml:space="preserve"> </w:t>
+      </w:r>
+      <w:r>
+        <w:rPr>
+          <w:rStyle w:val="StringTok"/>
+        </w:rPr>
+        <w:t xml:space="preserve">"linkedin"</w:t>
+      </w:r>
+      <w:r>
+        <w:rPr>
+          <w:rStyle w:val="FunctionTok"/>
+        </w:rPr>
+        <w:t xml:space="preserve">,</w:t>
+      </w:r>
+      <w:r>
+        <w:rPr>
+          <w:rStyle w:val="NormalTok"/>
+        </w:rPr>
+        <w:t xml:space="preserve"> </w:t>
+      </w:r>
+      <w:r>
+        <w:rPr>
+          <w:rStyle w:val="DataTypeTok"/>
+        </w:rPr>
+        <w:t xml:space="preserve">"required"</w:t>
+      </w:r>
+      <w:r>
+        <w:rPr>
+          <w:rStyle w:val="FunctionTok"/>
+        </w:rPr>
+        <w:t xml:space="preserve">:</w:t>
+      </w:r>
+      <w:r>
+        <w:rPr>
+          <w:rStyle w:val="NormalTok"/>
+        </w:rPr>
+        <w:t xml:space="preserve"> </w:t>
+      </w:r>
+      <w:r>
+        <w:rPr>
+          <w:rStyle w:val="KeywordTok"/>
+        </w:rPr>
+        <w:t xml:space="preserve">true</w:t>
+      </w:r>
+      <w:r>
+        <w:rPr>
+          <w:rStyle w:val="NormalTok"/>
+        </w:rPr>
+        <w:t xml:space="preserve"> </w:t>
+      </w:r>
+      <w:r>
+        <w:rPr>
+          <w:rStyle w:val="FunctionTok"/>
+        </w:rPr>
+        <w:t xml:space="preserve">}</w:t>
+      </w:r>
+      <w:r>
+        <w:rPr>
+          <w:rStyle w:val="OtherTok"/>
+        </w:rPr>
+        <w:t xml:space="preserve">,</w:t>
+      </w:r>
+      <w:r>
+        <w:br/>
+      </w:r>
+      <w:r>
+        <w:rPr>
+          <w:rStyle w:val="NormalTok"/>
+        </w:rPr>
+        <w:t xml:space="preserve">    </w:t>
+      </w:r>
+      <w:r>
+        <w:rPr>
+          <w:rStyle w:val="FunctionTok"/>
+        </w:rPr>
+        <w:t xml:space="preserve">{</w:t>
+      </w:r>
+      <w:r>
+        <w:rPr>
+          <w:rStyle w:val="NormalTok"/>
+        </w:rPr>
+        <w:t xml:space="preserve"> </w:t>
+      </w:r>
+      <w:r>
+        <w:rPr>
+          <w:rStyle w:val="DataTypeTok"/>
+        </w:rPr>
+        <w:t xml:space="preserve">"name"</w:t>
+      </w:r>
+      <w:r>
+        <w:rPr>
+          <w:rStyle w:val="FunctionTok"/>
+        </w:rPr>
+        <w:t xml:space="preserve">:</w:t>
+      </w:r>
+      <w:r>
+        <w:rPr>
+          <w:rStyle w:val="NormalTok"/>
+        </w:rPr>
+        <w:t xml:space="preserve"> </w:t>
+      </w:r>
+      <w:r>
+        <w:rPr>
+          <w:rStyle w:val="StringTok"/>
+        </w:rPr>
+        <w:t xml:space="preserve">"content_type"</w:t>
+      </w:r>
+      <w:r>
+        <w:rPr>
+          <w:rStyle w:val="FunctionTok"/>
+        </w:rPr>
+        <w:t xml:space="preserve">,</w:t>
+      </w:r>
+      <w:r>
+        <w:rPr>
+          <w:rStyle w:val="NormalTok"/>
+        </w:rPr>
+        <w:t xml:space="preserve"> </w:t>
+      </w:r>
+      <w:r>
+        <w:rPr>
+          <w:rStyle w:val="DataTypeTok"/>
+        </w:rPr>
+        <w:t xml:space="preserve">"type"</w:t>
+      </w:r>
+      <w:r>
+        <w:rPr>
+          <w:rStyle w:val="FunctionTok"/>
+        </w:rPr>
+        <w:t xml:space="preserve">:</w:t>
+      </w:r>
+      <w:r>
+        <w:rPr>
+          <w:rStyle w:val="NormalTok"/>
+        </w:rPr>
+        <w:t xml:space="preserve"> </w:t>
+      </w:r>
+      <w:r>
+        <w:rPr>
+          <w:rStyle w:val="StringTok"/>
+        </w:rPr>
+        <w:t xml:space="preserve">"select"</w:t>
+      </w:r>
+      <w:r>
+        <w:rPr>
+          <w:rStyle w:val="FunctionTok"/>
+        </w:rPr>
+        <w:t xml:space="preserve">,</w:t>
+      </w:r>
+      <w:r>
+        <w:rPr>
+          <w:rStyle w:val="NormalTok"/>
+        </w:rPr>
+        <w:t xml:space="preserve"> </w:t>
+      </w:r>
+      <w:r>
+        <w:rPr>
+          <w:rStyle w:val="DataTypeTok"/>
+        </w:rPr>
+        <w:t xml:space="preserve">"options"</w:t>
+      </w:r>
+      <w:r>
+        <w:rPr>
+          <w:rStyle w:val="FunctionTok"/>
+        </w:rPr>
+        <w:t xml:space="preserve">:</w:t>
+      </w:r>
+      <w:r>
+        <w:rPr>
+          <w:rStyle w:val="NormalTok"/>
+        </w:rPr>
+        <w:t xml:space="preserve"> </w:t>
+      </w:r>
+      <w:r>
+        <w:rPr>
+          <w:rStyle w:val="OtherTok"/>
+        </w:rPr>
+        <w:t xml:space="preserve">[</w:t>
+      </w:r>
+      <w:r>
+        <w:rPr>
+          <w:rStyle w:val="StringTok"/>
+        </w:rPr>
+        <w:t xml:space="preserve">"text"</w:t>
+      </w:r>
+      <w:r>
+        <w:rPr>
+          <w:rStyle w:val="OtherTok"/>
+        </w:rPr>
+        <w:t xml:space="preserve">,</w:t>
+      </w:r>
+      <w:r>
+        <w:rPr>
+          <w:rStyle w:val="NormalTok"/>
+        </w:rPr>
+        <w:t xml:space="preserve"> </w:t>
+      </w:r>
+      <w:r>
+        <w:rPr>
+          <w:rStyle w:val="StringTok"/>
+        </w:rPr>
+        <w:t xml:space="preserve">"image"</w:t>
+      </w:r>
+      <w:r>
+        <w:rPr>
+          <w:rStyle w:val="OtherTok"/>
+        </w:rPr>
+        <w:t xml:space="preserve">,</w:t>
+      </w:r>
+      <w:r>
+        <w:rPr>
+          <w:rStyle w:val="NormalTok"/>
+        </w:rPr>
+        <w:t xml:space="preserve"> </w:t>
+      </w:r>
+      <w:r>
+        <w:rPr>
+          <w:rStyle w:val="StringTok"/>
+        </w:rPr>
+        <w:t xml:space="preserve">"video"</w:t>
+      </w:r>
+      <w:r>
+        <w:rPr>
+          <w:rStyle w:val="OtherTok"/>
+        </w:rPr>
+        <w:t xml:space="preserve">,</w:t>
+      </w:r>
+      <w:r>
+        <w:rPr>
+          <w:rStyle w:val="NormalTok"/>
+        </w:rPr>
+        <w:t xml:space="preserve"> </w:t>
+      </w:r>
+      <w:r>
+        <w:rPr>
+          <w:rStyle w:val="StringTok"/>
+        </w:rPr>
+        <w:t xml:space="preserve">"thread"</w:t>
+      </w:r>
+      <w:r>
+        <w:rPr>
+          <w:rStyle w:val="OtherTok"/>
+        </w:rPr>
+        <w:t xml:space="preserve">]</w:t>
+      </w:r>
+      <w:r>
+        <w:rPr>
+          <w:rStyle w:val="FunctionTok"/>
+        </w:rPr>
+        <w:t xml:space="preserve">,</w:t>
+      </w:r>
+      <w:r>
+        <w:rPr>
+          <w:rStyle w:val="NormalTok"/>
+        </w:rPr>
+        <w:t xml:space="preserve"> </w:t>
+      </w:r>
+      <w:r>
+        <w:rPr>
+          <w:rStyle w:val="DataTypeTok"/>
+        </w:rPr>
+        <w:t xml:space="preserve">"defaultValue"</w:t>
+      </w:r>
+      <w:r>
+        <w:rPr>
+          <w:rStyle w:val="FunctionTok"/>
+        </w:rPr>
+        <w:t xml:space="preserve">:</w:t>
+      </w:r>
+      <w:r>
+        <w:rPr>
+          <w:rStyle w:val="NormalTok"/>
+        </w:rPr>
+        <w:t xml:space="preserve"> </w:t>
+      </w:r>
+      <w:r>
+        <w:rPr>
+          <w:rStyle w:val="StringTok"/>
+        </w:rPr>
+        <w:t xml:space="preserve">"text"</w:t>
+      </w:r>
+      <w:r>
+        <w:rPr>
+          <w:rStyle w:val="FunctionTok"/>
+        </w:rPr>
+        <w:t xml:space="preserve">,</w:t>
+      </w:r>
+      <w:r>
+        <w:rPr>
+          <w:rStyle w:val="NormalTok"/>
+        </w:rPr>
+        <w:t xml:space="preserve"> </w:t>
+      </w:r>
+      <w:r>
+        <w:rPr>
+          <w:rStyle w:val="DataTypeTok"/>
+        </w:rPr>
+        <w:t xml:space="preserve">"required"</w:t>
+      </w:r>
+      <w:r>
+        <w:rPr>
+          <w:rStyle w:val="FunctionTok"/>
+        </w:rPr>
+        <w:t xml:space="preserve">:</w:t>
+      </w:r>
+      <w:r>
+        <w:rPr>
+          <w:rStyle w:val="NormalTok"/>
+        </w:rPr>
+        <w:t xml:space="preserve"> </w:t>
+      </w:r>
+      <w:r>
+        <w:rPr>
+          <w:rStyle w:val="KeywordTok"/>
+        </w:rPr>
+        <w:t xml:space="preserve">true</w:t>
+      </w:r>
+      <w:r>
+        <w:rPr>
+          <w:rStyle w:val="NormalTok"/>
+        </w:rPr>
+        <w:t xml:space="preserve"> </w:t>
+      </w:r>
+      <w:r>
+        <w:rPr>
+          <w:rStyle w:val="FunctionTok"/>
+        </w:rPr>
+        <w:t xml:space="preserve">}</w:t>
+      </w:r>
+      <w:r>
+        <w:br/>
+      </w:r>
+      <w:r>
+        <w:rPr>
+          <w:rStyle w:val="NormalTok"/>
+        </w:rPr>
+        <w:t xml:space="preserve">  </w:t>
+      </w:r>
+      <w:r>
+        <w:rPr>
+          <w:rStyle w:val="OtherTok"/>
+        </w:rPr>
+        <w:t xml:space="preserve">]</w:t>
+      </w:r>
+      <w:r>
+        <w:br/>
+      </w:r>
+      <w:r>
+        <w:rPr>
+          <w:rStyle w:val="FunctionTok"/>
+        </w:rPr>
+        <w:t xml:space="preserve">}</w:t>
+      </w:r>
+    </w:p>
+    <w:p>
+      <w:pPr>
+        <w:pStyle w:val="FirstParagraph"/>
+      </w:pPr>
+      <w:r>
+        <w:t xml:space="preserve">When this fires on April 14, the created issue becomes:</w:t>
       </w:r>
     </w:p>
     <w:p>
@@ -4791,6 +5634,109 @@
         </w:numPr>
       </w:pPr>
       <w:r>
+        <w:t xml:space="preserve">Title:</w:t>
+      </w:r>
+      <w:r>
+        <w:t xml:space="preserve"> </w:t>
+      </w:r>
+      <w:r>
+        <w:t xml:space="preserve">“Social media post for 2026-04-14 — linkedin”</w:t>
+      </w:r>
+    </w:p>
+    <w:p>
+      <w:pPr>
+        <w:pStyle w:val="Compact"/>
+        <w:numPr>
+          <w:ilvl w:val="0"/>
+          <w:numId w:val="1021"/>
+        </w:numPr>
+      </w:pPr>
+      <w:r>
+        <w:t xml:space="preserve">Description includes the interpolated platform and content type</w:t>
+      </w:r>
+    </w:p>
+    <w:p>
+      <w:pPr>
+        <w:pStyle w:val="FirstParagraph"/>
+      </w:pPr>
+      <w:r>
+        <w:t xml:space="preserve">This is powerful for recurring posts — each fired issue gets today’s date automatically, so the agent knows exactly which day’s content to post.</w:t>
+      </w:r>
+    </w:p>
+    <w:bookmarkEnd w:id="38"/>
+    <w:bookmarkStart w:id="39" w:name="Xe0d5cc6f75521940b9971118436254c6da6d985"/>
+    <w:p>
+      <w:pPr>
+        <w:pStyle w:val="Heading3"/>
+      </w:pPr>
+      <w:r>
+        <w:t xml:space="preserve">How secrets, routines, and agents work together</w:t>
+      </w:r>
+    </w:p>
+    <w:p>
+      <w:pPr>
+        <w:pStyle w:val="FirstParagraph"/>
+      </w:pPr>
+      <w:r>
+        <w:t xml:space="preserve">Each piece has a distinct job:</w:t>
+      </w:r>
+    </w:p>
+    <w:p>
+      <w:pPr>
+        <w:pStyle w:val="SourceCode"/>
+      </w:pPr>
+      <w:r>
+        <w:rPr>
+          <w:rStyle w:val="VerbatimChar"/>
+        </w:rPr>
+        <w:t xml:space="preserve">Routine         → WHAT to do + WHEN (title, description, schedule)</w:t>
+      </w:r>
+      <w:r>
+        <w:br/>
+      </w:r>
+      <w:r>
+        <w:rPr>
+          <w:rStyle w:val="VerbatimChar"/>
+        </w:rPr>
+        <w:t xml:space="preserve">Agent config    → HOW to authenticate (env vars with encrypted secret refs)</w:t>
+      </w:r>
+      <w:r>
+        <w:br/>
+      </w:r>
+      <w:r>
+        <w:rPr>
+          <w:rStyle w:val="VerbatimChar"/>
+        </w:rPr>
+        <w:t xml:space="preserve">Agent skills    → HOW to call the API (curl commands, API formats)</w:t>
+      </w:r>
+    </w:p>
+    <w:p>
+      <w:pPr>
+        <w:pStyle w:val="FirstParagraph"/>
+      </w:pPr>
+      <w:r>
+        <w:t xml:space="preserve">Secrets live in the agent’s environment, not in the routine. The routine just creates the issue — the agent already has the API tokens it needs when it wakes up.</w:t>
+      </w:r>
+    </w:p>
+    <w:bookmarkEnd w:id="39"/>
+    <w:bookmarkStart w:id="40" w:name="managing-routines"/>
+    <w:p>
+      <w:pPr>
+        <w:pStyle w:val="Heading3"/>
+      </w:pPr>
+      <w:r>
+        <w:t xml:space="preserve">Managing routines</w:t>
+      </w:r>
+    </w:p>
+    <w:p>
+      <w:pPr>
+        <w:pStyle w:val="Compact"/>
+        <w:numPr>
+          <w:ilvl w:val="0"/>
+          <w:numId w:val="1022"/>
+        </w:numPr>
+      </w:pPr>
+      <w:r>
         <w:rPr>
           <w:b/>
           <w:bCs/>
@@ -4806,7 +5752,7 @@
         <w:pStyle w:val="Compact"/>
         <w:numPr>
           <w:ilvl w:val="0"/>
-          <w:numId w:val="1021"/>
+          <w:numId w:val="1022"/>
         </w:numPr>
       </w:pPr>
       <w:r>
@@ -4825,7 +5771,7 @@
         <w:pStyle w:val="Compact"/>
         <w:numPr>
           <w:ilvl w:val="0"/>
-          <w:numId w:val="1021"/>
+          <w:numId w:val="1022"/>
         </w:numPr>
       </w:pPr>
       <w:r>
@@ -4844,7 +5790,7 @@
         <w:pStyle w:val="Compact"/>
         <w:numPr>
           <w:ilvl w:val="0"/>
-          <w:numId w:val="1021"/>
+          <w:numId w:val="1022"/>
         </w:numPr>
       </w:pPr>
       <w:r>
@@ -4858,10 +5804,10 @@
         <w:t xml:space="preserve">: fire immediately regardless of schedule</w:t>
       </w:r>
     </w:p>
-    <w:bookmarkEnd w:id="38"/>
-    <w:bookmarkEnd w:id="39"/>
     <w:bookmarkEnd w:id="40"/>
-    <w:bookmarkStart w:id="54" w:name="part-3-example-workflows"/>
+    <w:bookmarkEnd w:id="41"/>
+    <w:bookmarkEnd w:id="42"/>
+    <w:bookmarkStart w:id="61" w:name="part-3-example-workflows"/>
     <w:p>
       <w:pPr>
         <w:pStyle w:val="Heading1"/>
@@ -4870,7 +5816,7 @@
         <w:t xml:space="preserve">Part 3: Example Workflows</w:t>
       </w:r>
     </w:p>
-    <w:bookmarkStart w:id="44" w:name="social-media-campaign"/>
+    <w:bookmarkStart w:id="46" w:name="social-media-campaign"/>
     <w:p>
       <w:pPr>
         <w:pStyle w:val="Heading2"/>
@@ -4879,7 +5825,7 @@
         <w:t xml:space="preserve">Social media campaign</w:t>
       </w:r>
     </w:p>
-    <w:bookmarkStart w:id="41" w:name="one-time-setup-30-minutes"/>
+    <w:bookmarkStart w:id="43" w:name="one-time-setup-30-minutes"/>
     <w:p>
       <w:pPr>
         <w:pStyle w:val="Heading3"/>
@@ -4893,7 +5839,7 @@
         <w:pStyle w:val="Compact"/>
         <w:numPr>
           <w:ilvl w:val="0"/>
-          <w:numId w:val="1022"/>
+          <w:numId w:val="1023"/>
         </w:numPr>
       </w:pPr>
       <w:r>
@@ -4915,7 +5861,7 @@
         <w:pStyle w:val="Compact"/>
         <w:numPr>
           <w:ilvl w:val="0"/>
-          <w:numId w:val="1022"/>
+          <w:numId w:val="1023"/>
         </w:numPr>
       </w:pPr>
       <w:r>
@@ -4937,7 +5883,7 @@
         <w:pStyle w:val="Compact"/>
         <w:numPr>
           <w:ilvl w:val="0"/>
-          <w:numId w:val="1022"/>
+          <w:numId w:val="1023"/>
         </w:numPr>
       </w:pPr>
       <w:r>
@@ -4968,7 +5914,7 @@
         <w:pStyle w:val="Compact"/>
         <w:numPr>
           <w:ilvl w:val="0"/>
-          <w:numId w:val="1022"/>
+          <w:numId w:val="1023"/>
         </w:numPr>
       </w:pPr>
       <w:r>
@@ -4994,8 +5940,8 @@
         <w:t xml:space="preserve">linked to the goal</w:t>
       </w:r>
     </w:p>
-    <w:bookmarkEnd w:id="41"/>
-    <w:bookmarkStart w:id="42" w:name="content-creation"/>
+    <w:bookmarkEnd w:id="43"/>
+    <w:bookmarkStart w:id="44" w:name="content-creation"/>
     <w:p>
       <w:pPr>
         <w:pStyle w:val="Heading3"/>
@@ -5009,7 +5955,7 @@
         <w:pStyle w:val="Compact"/>
         <w:numPr>
           <w:ilvl w:val="0"/>
-          <w:numId w:val="1023"/>
+          <w:numId w:val="1024"/>
         </w:numPr>
       </w:pPr>
       <w:r>
@@ -5034,7 +5980,7 @@
         <w:pStyle w:val="Compact"/>
         <w:numPr>
           <w:ilvl w:val="0"/>
-          <w:numId w:val="1023"/>
+          <w:numId w:val="1024"/>
         </w:numPr>
       </w:pPr>
       <w:r>
@@ -5046,7 +5992,7 @@
         <w:pStyle w:val="Compact"/>
         <w:numPr>
           <w:ilvl w:val="0"/>
-          <w:numId w:val="1023"/>
+          <w:numId w:val="1024"/>
         </w:numPr>
       </w:pPr>
       <w:r>
@@ -5068,15 +6014,15 @@
         <w:pStyle w:val="Compact"/>
         <w:numPr>
           <w:ilvl w:val="0"/>
-          <w:numId w:val="1023"/>
+          <w:numId w:val="1024"/>
         </w:numPr>
       </w:pPr>
       <w:r>
         <w:t xml:space="preserve">Iterate via comments until satisfied</w:t>
       </w:r>
     </w:p>
-    <w:bookmarkEnd w:id="42"/>
-    <w:bookmarkStart w:id="43" w:name="automated-posting"/>
+    <w:bookmarkEnd w:id="44"/>
+    <w:bookmarkStart w:id="45" w:name="automated-posting"/>
     <w:p>
       <w:pPr>
         <w:pStyle w:val="Heading3"/>
@@ -5090,7 +6036,7 @@
         <w:pStyle w:val="Compact"/>
         <w:numPr>
           <w:ilvl w:val="0"/>
-          <w:numId w:val="1024"/>
+          <w:numId w:val="1025"/>
         </w:numPr>
       </w:pPr>
       <w:r>
@@ -5109,7 +6055,7 @@
         <w:pStyle w:val="Compact"/>
         <w:numPr>
           <w:ilvl w:val="0"/>
-          <w:numId w:val="1024"/>
+          <w:numId w:val="1025"/>
         </w:numPr>
       </w:pPr>
       <w:r>
@@ -5121,7 +6067,7 @@
         <w:pStyle w:val="Compact"/>
         <w:numPr>
           <w:ilvl w:val="0"/>
-          <w:numId w:val="1024"/>
+          <w:numId w:val="1025"/>
         </w:numPr>
       </w:pPr>
       <w:r>
@@ -5138,9 +6084,9 @@
         <w:t xml:space="preserve">the issue feed for posting confirmations</w:t>
       </w:r>
     </w:p>
-    <w:bookmarkEnd w:id="43"/>
-    <w:bookmarkEnd w:id="44"/>
-    <w:bookmarkStart w:id="45" w:name="competitive-research"/>
+    <w:bookmarkEnd w:id="45"/>
+    <w:bookmarkEnd w:id="46"/>
+    <w:bookmarkStart w:id="47" w:name="competitive-research"/>
     <w:p>
       <w:pPr>
         <w:pStyle w:val="Heading2"/>
@@ -5154,7 +6100,7 @@
         <w:pStyle w:val="Compact"/>
         <w:numPr>
           <w:ilvl w:val="0"/>
-          <w:numId w:val="1025"/>
+          <w:numId w:val="1026"/>
         </w:numPr>
       </w:pPr>
       <w:r>
@@ -5225,7 +6171,7 @@
         <w:pStyle w:val="Compact"/>
         <w:numPr>
           <w:ilvl w:val="0"/>
-          <w:numId w:val="1026"/>
+          <w:numId w:val="1027"/>
         </w:numPr>
       </w:pPr>
       <w:r>
@@ -5237,15 +6183,15 @@
         <w:pStyle w:val="Compact"/>
         <w:numPr>
           <w:ilvl w:val="0"/>
-          <w:numId w:val="1026"/>
+          <w:numId w:val="1027"/>
         </w:numPr>
       </w:pPr>
       <w:r>
         <w:t xml:space="preserve">Review findings, request deeper dives via follow-up comments</w:t>
       </w:r>
     </w:p>
-    <w:bookmarkEnd w:id="45"/>
-    <w:bookmarkStart w:id="51" w:name="data-driven-video-content-with-remotion"/>
+    <w:bookmarkEnd w:id="47"/>
+    <w:bookmarkStart w:id="53" w:name="data-driven-video-content-with-remotion"/>
     <w:p>
       <w:pPr>
         <w:pStyle w:val="Heading2"/>
@@ -5264,7 +6210,7 @@
       <w:r>
         <w:t xml:space="preserve"> </w:t>
       </w:r>
-      <w:hyperlink r:id="rId46">
+      <w:hyperlink r:id="rId48">
         <w:r>
           <w:rPr>
             <w:rStyle w:val="Hyperlink"/>
@@ -5279,7 +6225,7 @@
         <w:t xml:space="preserve">— a React-based video framework.</w:t>
       </w:r>
     </w:p>
-    <w:bookmarkStart w:id="47" w:name="how-it-works"/>
+    <w:bookmarkStart w:id="49" w:name="how-it-works"/>
     <w:p>
       <w:pPr>
         <w:pStyle w:val="Heading3"/>
@@ -5344,8 +6290,8 @@
         <w:t xml:space="preserve">  → posts to LinkedIn/X with the video</w:t>
       </w:r>
     </w:p>
-    <w:bookmarkEnd w:id="47"/>
-    <w:bookmarkStart w:id="48" w:name="one-time-setup"/>
+    <w:bookmarkEnd w:id="49"/>
+    <w:bookmarkStart w:id="50" w:name="one-time-setup"/>
     <w:p>
       <w:pPr>
         <w:pStyle w:val="Heading3"/>
@@ -5359,7 +6305,7 @@
         <w:pStyle w:val="Compact"/>
         <w:numPr>
           <w:ilvl w:val="0"/>
-          <w:numId w:val="1027"/>
+          <w:numId w:val="1028"/>
         </w:numPr>
       </w:pPr>
       <w:r>
@@ -5381,7 +6327,7 @@
         <w:pStyle w:val="Compact"/>
         <w:numPr>
           <w:ilvl w:val="0"/>
-          <w:numId w:val="1027"/>
+          <w:numId w:val="1028"/>
         </w:numPr>
       </w:pPr>
       <w:r>
@@ -5403,7 +6349,7 @@
         <w:pStyle w:val="Compact"/>
         <w:numPr>
           <w:ilvl w:val="0"/>
-          <w:numId w:val="1027"/>
+          <w:numId w:val="1028"/>
         </w:numPr>
       </w:pPr>
       <w:r>
@@ -5425,7 +6371,7 @@
         <w:pStyle w:val="Compact"/>
         <w:numPr>
           <w:ilvl w:val="1"/>
-          <w:numId w:val="1028"/>
+          <w:numId w:val="1029"/>
         </w:numPr>
       </w:pPr>
       <w:r>
@@ -5437,7 +6383,7 @@
         <w:pStyle w:val="Compact"/>
         <w:numPr>
           <w:ilvl w:val="1"/>
-          <w:numId w:val="1028"/>
+          <w:numId w:val="1029"/>
         </w:numPr>
       </w:pPr>
       <w:r>
@@ -5449,7 +6395,7 @@
         <w:pStyle w:val="Compact"/>
         <w:numPr>
           <w:ilvl w:val="1"/>
-          <w:numId w:val="1028"/>
+          <w:numId w:val="1029"/>
         </w:numPr>
       </w:pPr>
       <w:r>
@@ -5461,15 +6407,15 @@
         <w:pStyle w:val="Compact"/>
         <w:numPr>
           <w:ilvl w:val="1"/>
-          <w:numId w:val="1028"/>
+          <w:numId w:val="1029"/>
         </w:numPr>
       </w:pPr>
       <w:r>
         <w:t xml:space="preserve">Data insight (WallStreetStats visualizations)</w:t>
       </w:r>
     </w:p>
-    <w:bookmarkEnd w:id="48"/>
-    <w:bookmarkStart w:id="49" w:name="steady-state-flow"/>
+    <w:bookmarkEnd w:id="50"/>
+    <w:bookmarkStart w:id="51" w:name="steady-state-flow"/>
     <w:p>
       <w:pPr>
         <w:pStyle w:val="Heading3"/>
@@ -5483,7 +6429,7 @@
         <w:pStyle w:val="Compact"/>
         <w:numPr>
           <w:ilvl w:val="0"/>
-          <w:numId w:val="1029"/>
+          <w:numId w:val="1030"/>
         </w:numPr>
       </w:pPr>
       <w:r>
@@ -5495,7 +6441,7 @@
         <w:pStyle w:val="Compact"/>
         <w:numPr>
           <w:ilvl w:val="0"/>
-          <w:numId w:val="1029"/>
+          <w:numId w:val="1030"/>
         </w:numPr>
       </w:pPr>
       <w:r>
@@ -5507,7 +6453,7 @@
         <w:pStyle w:val="Compact"/>
         <w:numPr>
           <w:ilvl w:val="0"/>
-          <w:numId w:val="1029"/>
+          <w:numId w:val="1030"/>
         </w:numPr>
       </w:pPr>
       <w:r>
@@ -5519,7 +6465,7 @@
         <w:pStyle w:val="Compact"/>
         <w:numPr>
           <w:ilvl w:val="0"/>
-          <w:numId w:val="1029"/>
+          <w:numId w:val="1030"/>
         </w:numPr>
       </w:pPr>
       <w:r>
@@ -5531,15 +6477,15 @@
         <w:pStyle w:val="Compact"/>
         <w:numPr>
           <w:ilvl w:val="0"/>
-          <w:numId w:val="1029"/>
+          <w:numId w:val="1030"/>
         </w:numPr>
       </w:pPr>
       <w:r>
         <w:t xml:space="preserve">CMO posts to LinkedIn/X with the video + caption</w:t>
       </w:r>
     </w:p>
-    <w:bookmarkEnd w:id="49"/>
-    <w:bookmarkStart w:id="50" w:name="cost"/>
+    <w:bookmarkEnd w:id="51"/>
+    <w:bookmarkStart w:id="52" w:name="cost"/>
     <w:p>
       <w:pPr>
         <w:pStyle w:val="Heading3"/>
@@ -5703,45 +6649,36 @@
         <w:t xml:space="preserve">.</w:t>
       </w:r>
     </w:p>
-    <w:bookmarkEnd w:id="50"/>
-    <w:bookmarkEnd w:id="51"/>
-    <w:bookmarkStart w:id="52" w:name="multi-agent-content-pipeline"/>
+    <w:bookmarkEnd w:id="52"/>
+    <w:bookmarkEnd w:id="53"/>
+    <w:bookmarkStart w:id="58" w:name="recurring-social-media-posting"/>
     <w:p>
       <w:pPr>
         <w:pStyle w:val="Heading2"/>
       </w:pPr>
       <w:r>
-        <w:t xml:space="preserve">Multi-agent content pipeline</w:t>
+        <w:t xml:space="preserve">Recurring social media posting</w:t>
+      </w:r>
+    </w:p>
+    <w:bookmarkStart w:id="54" w:name="linkedin-3x-weekly-posting-routine"/>
+    <w:p>
+      <w:pPr>
+        <w:pStyle w:val="Heading3"/>
+      </w:pPr>
+      <w:r>
+        <w:t xml:space="preserve">LinkedIn — 3x weekly posting routine</w:t>
       </w:r>
     </w:p>
     <w:p>
       <w:pPr>
         <w:pStyle w:val="FirstParagraph"/>
-      </w:pPr>
-      <w:r>
-        <w:t xml:space="preserve">For production workflows, chain agents in a pipeline:</w:t>
-      </w:r>
-    </w:p>
-    <w:p>
-      <w:pPr>
-        <w:pStyle w:val="Compact"/>
-        <w:numPr>
-          <w:ilvl w:val="0"/>
-          <w:numId w:val="1030"/>
-        </w:numPr>
       </w:pPr>
       <w:r>
         <w:rPr>
           <w:b/>
           <w:bCs/>
         </w:rPr>
-        <w:t xml:space="preserve">Head of Product Research</w:t>
-      </w:r>
-      <w:r>
-        <w:t xml:space="preserve"> </w:t>
-      </w:r>
-      <w:r>
-        <w:t xml:space="preserve">→ generates market data + insights</w:t>
+        <w:t xml:space="preserve">One-time setup:</w:t>
       </w:r>
     </w:p>
     <w:p>
@@ -5749,7 +6686,453 @@
         <w:pStyle w:val="Compact"/>
         <w:numPr>
           <w:ilvl w:val="0"/>
-          <w:numId w:val="1030"/>
+          <w:numId w:val="1031"/>
+        </w:numPr>
+      </w:pPr>
+      <w:r>
+        <w:t xml:space="preserve">Store LinkedIn credentials via agent config UI (see Part 2)</w:t>
+      </w:r>
+    </w:p>
+    <w:p>
+      <w:pPr>
+        <w:pStyle w:val="Compact"/>
+        <w:numPr>
+          <w:ilvl w:val="0"/>
+          <w:numId w:val="1031"/>
+        </w:numPr>
+      </w:pPr>
+      <w:r>
+        <w:t xml:space="preserve">Have the CMO create a content calendar (assign an issue for this first)</w:t>
+      </w:r>
+    </w:p>
+    <w:p>
+      <w:pPr>
+        <w:pStyle w:val="Compact"/>
+        <w:numPr>
+          <w:ilvl w:val="0"/>
+          <w:numId w:val="1031"/>
+        </w:numPr>
+      </w:pPr>
+      <w:r>
+        <w:t xml:space="preserve">Create the routine:</w:t>
+      </w:r>
+    </w:p>
+    <w:p>
+      <w:pPr>
+        <w:pStyle w:val="SourceCode"/>
+      </w:pPr>
+      <w:r>
+        <w:rPr>
+          <w:rStyle w:val="VerbatimChar"/>
+        </w:rPr>
+        <w:t xml:space="preserve">Title:       "LinkedIn post for {{date}}"</w:t>
+      </w:r>
+      <w:r>
+        <w:br/>
+      </w:r>
+      <w:r>
+        <w:rPr>
+          <w:rStyle w:val="VerbatimChar"/>
+        </w:rPr>
+        <w:t xml:space="preserve">Description: "Check the content calendar for today's scheduled LinkedIn post.</w:t>
+      </w:r>
+      <w:r>
+        <w:br/>
+      </w:r>
+      <w:r>
+        <w:rPr>
+          <w:rStyle w:val="VerbatimChar"/>
+        </w:rPr>
+        <w:t xml:space="preserve">              If one is scheduled:</w:t>
+      </w:r>
+      <w:r>
+        <w:br/>
+      </w:r>
+      <w:r>
+        <w:rPr>
+          <w:rStyle w:val="VerbatimChar"/>
+        </w:rPr>
+        <w:t xml:space="preserve">              1. Read the post content from the calendar</w:t>
+      </w:r>
+      <w:r>
+        <w:br/>
+      </w:r>
+      <w:r>
+        <w:rPr>
+          <w:rStyle w:val="VerbatimChar"/>
+        </w:rPr>
+        <w:t xml:space="preserve">              2. Post to LinkedIn via the API</w:t>
+      </w:r>
+      <w:r>
+        <w:br/>
+      </w:r>
+      <w:r>
+        <w:rPr>
+          <w:rStyle w:val="VerbatimChar"/>
+        </w:rPr>
+        <w:t xml:space="preserve">              3. Confirm with a link to the live post</w:t>
+      </w:r>
+      <w:r>
+        <w:br/>
+      </w:r>
+      <w:r>
+        <w:rPr>
+          <w:rStyle w:val="VerbatimChar"/>
+        </w:rPr>
+        <w:t xml:space="preserve">              If nothing is scheduled for today, comment 'No post scheduled' and mark done."</w:t>
+      </w:r>
+      <w:r>
+        <w:br/>
+      </w:r>
+      <w:r>
+        <w:rPr>
+          <w:rStyle w:val="VerbatimChar"/>
+        </w:rPr>
+        <w:t xml:space="preserve">Agent:       CMO</w:t>
+      </w:r>
+      <w:r>
+        <w:br/>
+      </w:r>
+      <w:r>
+        <w:rPr>
+          <w:rStyle w:val="VerbatimChar"/>
+        </w:rPr>
+        <w:t xml:space="preserve">Project:     Social Media</w:t>
+      </w:r>
+      <w:r>
+        <w:br/>
+      </w:r>
+      <w:r>
+        <w:rPr>
+          <w:rStyle w:val="VerbatimChar"/>
+        </w:rPr>
+        <w:t xml:space="preserve">Schedule:    Mon/Wed/Fri at 9am ET (cron: 0 9 * * 1,3,5)</w:t>
+      </w:r>
+    </w:p>
+    <w:p>
+      <w:pPr>
+        <w:pStyle w:val="FirstParagraph"/>
+      </w:pPr>
+      <w:r>
+        <w:t xml:space="preserve">The</w:t>
+      </w:r>
+      <w:r>
+        <w:t xml:space="preserve"> </w:t>
+      </w:r>
+      <w:r>
+        <w:rPr>
+          <w:rStyle w:val="VerbatimChar"/>
+        </w:rPr>
+        <w:t xml:space="preserve">{{date}}</w:t>
+      </w:r>
+      <w:r>
+        <w:t xml:space="preserve"> </w:t>
+      </w:r>
+      <w:r>
+        <w:t xml:space="preserve">variable means each issue is automatically scoped to today — the CMO doesn’t need to figure out which day’s content to post.</w:t>
+      </w:r>
+    </w:p>
+    <w:bookmarkEnd w:id="54"/>
+    <w:bookmarkStart w:id="55" w:name="x-twitter-daily-posting-routine"/>
+    <w:p>
+      <w:pPr>
+        <w:pStyle w:val="Heading3"/>
+      </w:pPr>
+      <w:r>
+        <w:t xml:space="preserve">X (Twitter) — daily posting routine</w:t>
+      </w:r>
+    </w:p>
+    <w:p>
+      <w:pPr>
+        <w:pStyle w:val="SourceCode"/>
+      </w:pPr>
+      <w:r>
+        <w:rPr>
+          <w:rStyle w:val="VerbatimChar"/>
+        </w:rPr>
+        <w:t xml:space="preserve">Title:       "X post for {{date}}"</w:t>
+      </w:r>
+      <w:r>
+        <w:br/>
+      </w:r>
+      <w:r>
+        <w:rPr>
+          <w:rStyle w:val="VerbatimChar"/>
+        </w:rPr>
+        <w:t xml:space="preserve">Description: "Post today's X content from the content calendar.</w:t>
+      </w:r>
+      <w:r>
+        <w:br/>
+      </w:r>
+      <w:r>
+        <w:rPr>
+          <w:rStyle w:val="VerbatimChar"/>
+        </w:rPr>
+        <w:t xml:space="preserve">              For data-driven posts (WallStreetStats insights):</w:t>
+      </w:r>
+      <w:r>
+        <w:br/>
+      </w:r>
+      <w:r>
+        <w:rPr>
+          <w:rStyle w:val="VerbatimChar"/>
+        </w:rPr>
+        <w:t xml:space="preserve">              1. Fetch the latest sentiment data</w:t>
+      </w:r>
+      <w:r>
+        <w:br/>
+      </w:r>
+      <w:r>
+        <w:rPr>
+          <w:rStyle w:val="VerbatimChar"/>
+        </w:rPr>
+        <w:t xml:space="preserve">              2. Pick the most interesting shift</w:t>
+      </w:r>
+      <w:r>
+        <w:br/>
+      </w:r>
+      <w:r>
+        <w:rPr>
+          <w:rStyle w:val="VerbatimChar"/>
+        </w:rPr>
+        <w:t xml:space="preserve">              3. Write a tweet with the $GEAT cashtag if relevant</w:t>
+      </w:r>
+      <w:r>
+        <w:br/>
+      </w:r>
+      <w:r>
+        <w:rPr>
+          <w:rStyle w:val="VerbatimChar"/>
+        </w:rPr>
+        <w:t xml:space="preserve">              4. Post via X API</w:t>
+      </w:r>
+      <w:r>
+        <w:br/>
+      </w:r>
+      <w:r>
+        <w:rPr>
+          <w:rStyle w:val="VerbatimChar"/>
+        </w:rPr>
+        <w:t xml:space="preserve">              If a thread is scheduled, post all parts in sequence."</w:t>
+      </w:r>
+      <w:r>
+        <w:br/>
+      </w:r>
+      <w:r>
+        <w:rPr>
+          <w:rStyle w:val="VerbatimChar"/>
+        </w:rPr>
+        <w:t xml:space="preserve">Agent:       CMO</w:t>
+      </w:r>
+      <w:r>
+        <w:br/>
+      </w:r>
+      <w:r>
+        <w:rPr>
+          <w:rStyle w:val="VerbatimChar"/>
+        </w:rPr>
+        <w:t xml:space="preserve">Schedule:    Every weekday at 10am ET (cron: 0 10 * * 1-5)</w:t>
+      </w:r>
+    </w:p>
+    <w:bookmarkEnd w:id="55"/>
+    <w:bookmarkStart w:id="56" w:name="X10b8bfd24ad29e2970ec414e8a7b638ea5558e4"/>
+    <w:p>
+      <w:pPr>
+        <w:pStyle w:val="Heading3"/>
+      </w:pPr>
+      <w:r>
+        <w:t xml:space="preserve">Reading account stats from LinkedIn and X</w:t>
+      </w:r>
+    </w:p>
+    <w:p>
+      <w:pPr>
+        <w:pStyle w:val="FirstParagraph"/>
+      </w:pPr>
+      <w:r>
+        <w:t xml:space="preserve">Set up a weekly analytics routine so the CMO tracks what’s working:</w:t>
+      </w:r>
+    </w:p>
+    <w:p>
+      <w:pPr>
+        <w:pStyle w:val="SourceCode"/>
+      </w:pPr>
+      <w:r>
+        <w:rPr>
+          <w:rStyle w:val="VerbatimChar"/>
+        </w:rPr>
+        <w:t xml:space="preserve">Title:       "Social media analytics report — week of {{date}}"</w:t>
+      </w:r>
+      <w:r>
+        <w:br/>
+      </w:r>
+      <w:r>
+        <w:rPr>
+          <w:rStyle w:val="VerbatimChar"/>
+        </w:rPr>
+        <w:t xml:space="preserve">Description: "Pull performance data from LinkedIn and X for the past 7 days.</w:t>
+      </w:r>
+      <w:r>
+        <w:br/>
+      </w:r>
+      <w:r>
+        <w:br/>
+      </w:r>
+      <w:r>
+        <w:rPr>
+          <w:rStyle w:val="VerbatimChar"/>
+        </w:rPr>
+        <w:t xml:space="preserve">              LinkedIn:</w:t>
+      </w:r>
+      <w:r>
+        <w:br/>
+      </w:r>
+      <w:r>
+        <w:rPr>
+          <w:rStyle w:val="VerbatimChar"/>
+        </w:rPr>
+        <w:t xml:space="preserve">              - GET https://api.linkedin.com/v2/organizationalEntityShareStatistics?q=organizationalEntity&amp;organizationalEntity=$LINKEDIN_ORG_URN&amp;timeIntervals.timeGranularityType=DAY&amp;timeIntervals.timeRange.start=LAST_7_DAYS_EPOCH_MS</w:t>
+      </w:r>
+      <w:r>
+        <w:br/>
+      </w:r>
+      <w:r>
+        <w:rPr>
+          <w:rStyle w:val="VerbatimChar"/>
+        </w:rPr>
+        <w:t xml:space="preserve">              - Extract: impressions, clicks, engagement rate, follower change</w:t>
+      </w:r>
+      <w:r>
+        <w:br/>
+      </w:r>
+      <w:r>
+        <w:br/>
+      </w:r>
+      <w:r>
+        <w:rPr>
+          <w:rStyle w:val="VerbatimChar"/>
+        </w:rPr>
+        <w:t xml:space="preserve">              X/Twitter:</w:t>
+      </w:r>
+      <w:r>
+        <w:br/>
+      </w:r>
+      <w:r>
+        <w:rPr>
+          <w:rStyle w:val="VerbatimChar"/>
+        </w:rPr>
+        <w:t xml:space="preserve">              - GET https://api.x.com/2/users/{user_id}/tweets?tweet.fields=public_metrics&amp;start_time=LAST_7_DAYS_ISO</w:t>
+      </w:r>
+      <w:r>
+        <w:br/>
+      </w:r>
+      <w:r>
+        <w:rPr>
+          <w:rStyle w:val="VerbatimChar"/>
+        </w:rPr>
+        <w:t xml:space="preserve">              - Extract: impressions, likes, retweets, replies per post</w:t>
+      </w:r>
+      <w:r>
+        <w:br/>
+      </w:r>
+      <w:r>
+        <w:br/>
+      </w:r>
+      <w:r>
+        <w:rPr>
+          <w:rStyle w:val="VerbatimChar"/>
+        </w:rPr>
+        <w:t xml:space="preserve">              Deliverables:</w:t>
+      </w:r>
+      <w:r>
+        <w:br/>
+      </w:r>
+      <w:r>
+        <w:rPr>
+          <w:rStyle w:val="VerbatimChar"/>
+        </w:rPr>
+        <w:t xml:space="preserve">              1. Summary table: metric | this week | last week | change</w:t>
+      </w:r>
+      <w:r>
+        <w:br/>
+      </w:r>
+      <w:r>
+        <w:rPr>
+          <w:rStyle w:val="VerbatimChar"/>
+        </w:rPr>
+        <w:t xml:space="preserve">              2. Top performing post (highest engagement)</w:t>
+      </w:r>
+      <w:r>
+        <w:br/>
+      </w:r>
+      <w:r>
+        <w:rPr>
+          <w:rStyle w:val="VerbatimChar"/>
+        </w:rPr>
+        <w:t xml:space="preserve">              3. Recommendation: what to do more/less of next week</w:t>
+      </w:r>
+      <w:r>
+        <w:br/>
+      </w:r>
+      <w:r>
+        <w:br/>
+      </w:r>
+      <w:r>
+        <w:rPr>
+          <w:rStyle w:val="VerbatimChar"/>
+        </w:rPr>
+        <w:t xml:space="preserve">              Post the report as a comment on this issue."</w:t>
+      </w:r>
+      <w:r>
+        <w:br/>
+      </w:r>
+      <w:r>
+        <w:rPr>
+          <w:rStyle w:val="VerbatimChar"/>
+        </w:rPr>
+        <w:t xml:space="preserve">Agent:       CMO (or Head of Product Research for deeper analysis)</w:t>
+      </w:r>
+      <w:r>
+        <w:br/>
+      </w:r>
+      <w:r>
+        <w:rPr>
+          <w:rStyle w:val="VerbatimChar"/>
+        </w:rPr>
+        <w:t xml:space="preserve">Schedule:    Every Monday at 8am ET (cron: 0 8 * * 1)</w:t>
+      </w:r>
+    </w:p>
+    <w:p>
+      <w:pPr>
+        <w:pStyle w:val="FirstParagraph"/>
+      </w:pPr>
+      <w:r>
+        <w:t xml:space="preserve">This creates a weekly issue every Monday. The agent pulls stats, compares week-over-week, and posts a structured report. Board members read the issue comments for insights.</w:t>
+      </w:r>
+    </w:p>
+    <w:bookmarkEnd w:id="56"/>
+    <w:bookmarkStart w:id="57" w:name="X7d2cb371259eb6af3e5391b72c84fe292f023e9"/>
+    <w:p>
+      <w:pPr>
+        <w:pStyle w:val="Heading3"/>
+      </w:pPr>
+      <w:r>
+        <w:t xml:space="preserve">Combining posting + analytics for optimization</w:t>
+      </w:r>
+    </w:p>
+    <w:p>
+      <w:pPr>
+        <w:pStyle w:val="FirstParagraph"/>
+      </w:pPr>
+      <w:r>
+        <w:t xml:space="preserve">The analytics routine can feed back into the content strategy:</w:t>
+      </w:r>
+    </w:p>
+    <w:p>
+      <w:pPr>
+        <w:pStyle w:val="Compact"/>
+        <w:numPr>
+          <w:ilvl w:val="0"/>
+          <w:numId w:val="1032"/>
         </w:numPr>
       </w:pPr>
       <w:r>
@@ -5757,13 +7140,10 @@
           <w:b/>
           <w:bCs/>
         </w:rPr>
-        <w:t xml:space="preserve">CMO</w:t>
-      </w:r>
-      <w:r>
-        <w:t xml:space="preserve"> </w:t>
-      </w:r>
-      <w:r>
-        <w:t xml:space="preserve">→ turns insights into content strategy + drafts</w:t>
+        <w:t xml:space="preserve">Monday 8am</w:t>
+      </w:r>
+      <w:r>
+        <w:t xml:space="preserve">: Analytics routine fires → CMO reviews last week’s performance</w:t>
       </w:r>
     </w:p>
     <w:p>
@@ -5771,7 +7151,7 @@
         <w:pStyle w:val="Compact"/>
         <w:numPr>
           <w:ilvl w:val="0"/>
-          <w:numId w:val="1030"/>
+          <w:numId w:val="1032"/>
         </w:numPr>
       </w:pPr>
       <w:r>
@@ -5779,13 +7159,10 @@
           <w:b/>
           <w:bCs/>
         </w:rPr>
-        <w:t xml:space="preserve">Board</w:t>
-      </w:r>
-      <w:r>
-        <w:t xml:space="preserve"> </w:t>
-      </w:r>
-      <w:r>
-        <w:t xml:space="preserve">→ reviews and approves</w:t>
+        <w:t xml:space="preserve">Monday 9am</w:t>
+      </w:r>
+      <w:r>
+        <w:t xml:space="preserve">: CMO updates the content calendar based on what worked</w:t>
       </w:r>
     </w:p>
     <w:p>
@@ -5793,7 +7170,7 @@
         <w:pStyle w:val="Compact"/>
         <w:numPr>
           <w:ilvl w:val="0"/>
-          <w:numId w:val="1030"/>
+          <w:numId w:val="1032"/>
         </w:numPr>
       </w:pPr>
       <w:r>
@@ -5801,45 +7178,10 @@
           <w:b/>
           <w:bCs/>
         </w:rPr>
-        <w:t xml:space="preserve">CMO</w:t>
-      </w:r>
-      <w:r>
-        <w:t xml:space="preserve"> </w:t>
-      </w:r>
-      <w:r>
-        <w:t xml:space="preserve">→ publishes (routine-triggered)</w:t>
-      </w:r>
-    </w:p>
-    <w:p>
-      <w:pPr>
-        <w:pStyle w:val="FirstParagraph"/>
-      </w:pPr>
-      <w:r>
-        <w:t xml:space="preserve">Set this up with a parent issue (</w:t>
-      </w:r>
-      <w:r>
-        <w:t xml:space="preserve">“Q2 content campaign”</w:t>
-      </w:r>
-      <w:r>
-        <w:t xml:space="preserve">) and subtasks that cascade through the chain.</w:t>
-      </w:r>
-    </w:p>
-    <w:bookmarkEnd w:id="52"/>
-    <w:bookmarkStart w:id="53" w:name="webhook-triggered-workflows"/>
-    <w:p>
-      <w:pPr>
-        <w:pStyle w:val="Heading2"/>
-      </w:pPr>
-      <w:r>
-        <w:t xml:space="preserve">Webhook-triggered workflows</w:t>
-      </w:r>
-    </w:p>
-    <w:p>
-      <w:pPr>
-        <w:pStyle w:val="FirstParagraph"/>
-      </w:pPr>
-      <w:r>
-        <w:t xml:space="preserve">External systems can trigger agent work by POSTing to a webhook URL:</w:t>
+        <w:t xml:space="preserve">Mon/Wed/Fri 10am</w:t>
+      </w:r>
+      <w:r>
+        <w:t xml:space="preserve">: Posting routines fire → CMO posts optimized content</w:t>
       </w:r>
     </w:p>
     <w:p>
@@ -5847,7 +7189,7 @@
         <w:pStyle w:val="Compact"/>
         <w:numPr>
           <w:ilvl w:val="0"/>
-          <w:numId w:val="1031"/>
+          <w:numId w:val="1032"/>
         </w:numPr>
       </w:pPr>
       <w:r>
@@ -5855,13 +7197,37 @@
           <w:b/>
           <w:bCs/>
         </w:rPr>
-        <w:t xml:space="preserve">GitHub push</w:t>
-      </w:r>
-      <w:r>
-        <w:t xml:space="preserve"> </w:t>
-      </w:r>
-      <w:r>
-        <w:t xml:space="preserve">→ agent reviews the code change</w:t>
+        <w:t xml:space="preserve">Repeat</w:t>
+      </w:r>
+      <w:r>
+        <w:t xml:space="preserve">: data-driven content improvement loop, fully automated</w:t>
+      </w:r>
+    </w:p>
+    <w:p>
+      <w:pPr>
+        <w:pStyle w:val="FirstParagraph"/>
+      </w:pPr>
+      <w:r>
+        <w:t xml:space="preserve">To set this up, just create the two routines (analytics + posting) and make sure the analytics one fires BEFORE the posting ones. The CMO will naturally read the analytics report before deciding what to post.</w:t>
+      </w:r>
+    </w:p>
+    <w:bookmarkEnd w:id="57"/>
+    <w:bookmarkEnd w:id="58"/>
+    <w:bookmarkStart w:id="59" w:name="multi-agent-content-pipeline"/>
+    <w:p>
+      <w:pPr>
+        <w:pStyle w:val="Heading2"/>
+      </w:pPr>
+      <w:r>
+        <w:t xml:space="preserve">Multi-agent content pipeline</w:t>
+      </w:r>
+    </w:p>
+    <w:p>
+      <w:pPr>
+        <w:pStyle w:val="FirstParagraph"/>
+      </w:pPr>
+      <w:r>
+        <w:t xml:space="preserve">For production workflows, chain agents in a pipeline:</w:t>
       </w:r>
     </w:p>
     <w:p>
@@ -5869,7 +7235,7 @@
         <w:pStyle w:val="Compact"/>
         <w:numPr>
           <w:ilvl w:val="0"/>
-          <w:numId w:val="1031"/>
+          <w:numId w:val="1033"/>
         </w:numPr>
       </w:pPr>
       <w:r>
@@ -5877,13 +7243,13 @@
           <w:b/>
           <w:bCs/>
         </w:rPr>
-        <w:t xml:space="preserve">Stripe payment</w:t>
-      </w:r>
-      <w:r>
-        <w:t xml:space="preserve"> </w:t>
-      </w:r>
-      <w:r>
-        <w:t xml:space="preserve">→ agent sends a thank-you or updates records</w:t>
+        <w:t xml:space="preserve">Head of Product Research</w:t>
+      </w:r>
+      <w:r>
+        <w:t xml:space="preserve"> </w:t>
+      </w:r>
+      <w:r>
+        <w:t xml:space="preserve">→ generates market data + insights</w:t>
       </w:r>
     </w:p>
     <w:p>
@@ -5891,7 +7257,7 @@
         <w:pStyle w:val="Compact"/>
         <w:numPr>
           <w:ilvl w:val="0"/>
-          <w:numId w:val="1031"/>
+          <w:numId w:val="1033"/>
         </w:numPr>
       </w:pPr>
       <w:r>
@@ -5899,13 +7265,13 @@
           <w:b/>
           <w:bCs/>
         </w:rPr>
-        <w:t xml:space="preserve">CRM lead created</w:t>
-      </w:r>
-      <w:r>
-        <w:t xml:space="preserve"> </w:t>
-      </w:r>
-      <w:r>
-        <w:t xml:space="preserve">→ agent researches the company</w:t>
+        <w:t xml:space="preserve">CMO</w:t>
+      </w:r>
+      <w:r>
+        <w:t xml:space="preserve"> </w:t>
+      </w:r>
+      <w:r>
+        <w:t xml:space="preserve">→ turns insights into content strategy + drafts</w:t>
       </w:r>
     </w:p>
     <w:p>
@@ -5913,7 +7279,7 @@
         <w:pStyle w:val="Compact"/>
         <w:numPr>
           <w:ilvl w:val="0"/>
-          <w:numId w:val="1031"/>
+          <w:numId w:val="1033"/>
         </w:numPr>
       </w:pPr>
       <w:r>
@@ -5921,6 +7287,148 @@
           <w:b/>
           <w:bCs/>
         </w:rPr>
+        <w:t xml:space="preserve">Board</w:t>
+      </w:r>
+      <w:r>
+        <w:t xml:space="preserve"> </w:t>
+      </w:r>
+      <w:r>
+        <w:t xml:space="preserve">→ reviews and approves</w:t>
+      </w:r>
+    </w:p>
+    <w:p>
+      <w:pPr>
+        <w:pStyle w:val="Compact"/>
+        <w:numPr>
+          <w:ilvl w:val="0"/>
+          <w:numId w:val="1033"/>
+        </w:numPr>
+      </w:pPr>
+      <w:r>
+        <w:rPr>
+          <w:b/>
+          <w:bCs/>
+        </w:rPr>
+        <w:t xml:space="preserve">CMO</w:t>
+      </w:r>
+      <w:r>
+        <w:t xml:space="preserve"> </w:t>
+      </w:r>
+      <w:r>
+        <w:t xml:space="preserve">→ publishes (routine-triggered)</w:t>
+      </w:r>
+    </w:p>
+    <w:p>
+      <w:pPr>
+        <w:pStyle w:val="FirstParagraph"/>
+      </w:pPr>
+      <w:r>
+        <w:t xml:space="preserve">Set this up with a parent issue (</w:t>
+      </w:r>
+      <w:r>
+        <w:t xml:space="preserve">“Q2 content campaign”</w:t>
+      </w:r>
+      <w:r>
+        <w:t xml:space="preserve">) and subtasks that cascade through the chain.</w:t>
+      </w:r>
+    </w:p>
+    <w:bookmarkEnd w:id="59"/>
+    <w:bookmarkStart w:id="60" w:name="webhook-triggered-workflows"/>
+    <w:p>
+      <w:pPr>
+        <w:pStyle w:val="Heading2"/>
+      </w:pPr>
+      <w:r>
+        <w:t xml:space="preserve">Webhook-triggered workflows</w:t>
+      </w:r>
+    </w:p>
+    <w:p>
+      <w:pPr>
+        <w:pStyle w:val="FirstParagraph"/>
+      </w:pPr>
+      <w:r>
+        <w:t xml:space="preserve">External systems can trigger agent work by POSTing to a webhook URL:</w:t>
+      </w:r>
+    </w:p>
+    <w:p>
+      <w:pPr>
+        <w:pStyle w:val="Compact"/>
+        <w:numPr>
+          <w:ilvl w:val="0"/>
+          <w:numId w:val="1034"/>
+        </w:numPr>
+      </w:pPr>
+      <w:r>
+        <w:rPr>
+          <w:b/>
+          <w:bCs/>
+        </w:rPr>
+        <w:t xml:space="preserve">GitHub push</w:t>
+      </w:r>
+      <w:r>
+        <w:t xml:space="preserve"> </w:t>
+      </w:r>
+      <w:r>
+        <w:t xml:space="preserve">→ agent reviews the code change</w:t>
+      </w:r>
+    </w:p>
+    <w:p>
+      <w:pPr>
+        <w:pStyle w:val="Compact"/>
+        <w:numPr>
+          <w:ilvl w:val="0"/>
+          <w:numId w:val="1034"/>
+        </w:numPr>
+      </w:pPr>
+      <w:r>
+        <w:rPr>
+          <w:b/>
+          <w:bCs/>
+        </w:rPr>
+        <w:t xml:space="preserve">Stripe payment</w:t>
+      </w:r>
+      <w:r>
+        <w:t xml:space="preserve"> </w:t>
+      </w:r>
+      <w:r>
+        <w:t xml:space="preserve">→ agent sends a thank-you or updates records</w:t>
+      </w:r>
+    </w:p>
+    <w:p>
+      <w:pPr>
+        <w:pStyle w:val="Compact"/>
+        <w:numPr>
+          <w:ilvl w:val="0"/>
+          <w:numId w:val="1034"/>
+        </w:numPr>
+      </w:pPr>
+      <w:r>
+        <w:rPr>
+          <w:b/>
+          <w:bCs/>
+        </w:rPr>
+        <w:t xml:space="preserve">CRM lead created</w:t>
+      </w:r>
+      <w:r>
+        <w:t xml:space="preserve"> </w:t>
+      </w:r>
+      <w:r>
+        <w:t xml:space="preserve">→ agent researches the company</w:t>
+      </w:r>
+    </w:p>
+    <w:p>
+      <w:pPr>
+        <w:pStyle w:val="Compact"/>
+        <w:numPr>
+          <w:ilvl w:val="0"/>
+          <w:numId w:val="1034"/>
+        </w:numPr>
+      </w:pPr>
+      <w:r>
+        <w:rPr>
+          <w:b/>
+          <w:bCs/>
+        </w:rPr>
         <w:t xml:space="preserve">Monitoring alert</w:t>
       </w:r>
       <w:r>
@@ -5938,9 +7446,9 @@
         <w:t xml:space="preserve">Create a webhook trigger on a routine, give the URL to the external system, and the assigned agent handles each incoming event.</w:t>
       </w:r>
     </w:p>
-    <w:bookmarkEnd w:id="53"/>
-    <w:bookmarkEnd w:id="54"/>
-    <w:bookmarkStart w:id="61" w:name="part-4-installing-skills-on-agents"/>
+    <w:bookmarkEnd w:id="60"/>
+    <w:bookmarkEnd w:id="61"/>
+    <w:bookmarkStart w:id="68" w:name="part-4-installing-skills-on-agents"/>
     <w:p>
       <w:pPr>
         <w:pStyle w:val="Heading1"/>
@@ -5957,7 +7465,7 @@
         <w:t xml:space="preserve">Skills are reusable packages that teach agents specific capabilities. Instead of writing long instructions for each integration, create a skill once and install it on any agent.</w:t>
       </w:r>
     </w:p>
-    <w:bookmarkStart w:id="55" w:name="whats-a-skill"/>
+    <w:bookmarkStart w:id="62" w:name="whats-a-skill"/>
     <w:p>
       <w:pPr>
         <w:pStyle w:val="Heading2"/>
@@ -6020,8 +7528,8 @@
         <w:t xml:space="preserve">When installed on an agent, the SKILL.md becomes available as context during heartbeats. The agent can invoke the skill by name.</w:t>
       </w:r>
     </w:p>
-    <w:bookmarkEnd w:id="55"/>
-    <w:bookmarkStart w:id="56" w:name="available-skill-ideas"/>
+    <w:bookmarkEnd w:id="62"/>
+    <w:bookmarkStart w:id="63" w:name="available-skill-ideas"/>
     <w:p>
       <w:pPr>
         <w:pStyle w:val="Heading2"/>
@@ -6204,8 +7712,8 @@
         </w:tc>
       </w:tr>
     </w:tbl>
-    <w:bookmarkEnd w:id="56"/>
-    <w:bookmarkStart w:id="60" w:name="installing-skills-on-agents"/>
+    <w:bookmarkEnd w:id="63"/>
+    <w:bookmarkStart w:id="67" w:name="installing-skills-on-agents"/>
     <w:p>
       <w:pPr>
         <w:pStyle w:val="Heading2"/>
@@ -6214,7 +7722,7 @@
         <w:t xml:space="preserve">Installing skills on agents</w:t>
       </w:r>
     </w:p>
-    <w:bookmarkStart w:id="57" w:name="when-hiring-recommended"/>
+    <w:bookmarkStart w:id="64" w:name="when-hiring-recommended"/>
     <w:p>
       <w:pPr>
         <w:pStyle w:val="Heading3"/>
@@ -6401,8 +7909,8 @@
         <w:t xml:space="preserve">}</w:t>
       </w:r>
     </w:p>
-    <w:bookmarkEnd w:id="57"/>
-    <w:bookmarkStart w:id="58" w:name="on-existing-agents"/>
+    <w:bookmarkEnd w:id="64"/>
+    <w:bookmarkStart w:id="65" w:name="on-existing-agents"/>
     <w:p>
       <w:pPr>
         <w:pStyle w:val="Heading3"/>
@@ -6784,8 +8292,8 @@
         <w:t xml:space="preserve">;</w:t>
       </w:r>
     </w:p>
-    <w:bookmarkEnd w:id="58"/>
-    <w:bookmarkStart w:id="59" w:name="creating-custom-skills"/>
+    <w:bookmarkEnd w:id="65"/>
+    <w:bookmarkStart w:id="66" w:name="creating-custom-skills"/>
     <w:p>
       <w:pPr>
         <w:pStyle w:val="Heading3"/>
@@ -7281,10 +8789,10 @@
         <w:t xml:space="preserve">;</w:t>
       </w:r>
     </w:p>
-    <w:bookmarkEnd w:id="59"/>
-    <w:bookmarkEnd w:id="60"/>
-    <w:bookmarkEnd w:id="61"/>
-    <w:bookmarkStart w:id="62" w:name="appendix-key-concepts"/>
+    <w:bookmarkEnd w:id="66"/>
+    <w:bookmarkEnd w:id="67"/>
+    <w:bookmarkEnd w:id="68"/>
+    <w:bookmarkStart w:id="69" w:name="appendix-key-concepts"/>
     <w:p>
       <w:pPr>
         <w:pStyle w:val="Heading1"/>
@@ -7744,7 +9252,7 @@
         <w:t xml:space="preserve">(April 10, 2026, between v2026.403.0 and v2026.410.0). Paperclip is evolving rapidly — verify against your deployed version.</w:t>
       </w:r>
     </w:p>
-    <w:bookmarkEnd w:id="62"/>
+    <w:bookmarkEnd w:id="69"/>
     <w:sectPr>
       <w:footnotePr>
         <w:numRestart w:val="eachSect"/>
@@ -8608,6 +10116,9 @@
     <w:abstractNumId w:val="991"/>
   </w:num>
   <w:num w:numId="1022">
+    <w:abstractNumId w:val="991"/>
+  </w:num>
+  <w:num w:numId="1023">
     <w:abstractNumId w:val="99411"/>
     <w:lvlOverride w:ilvl="0">
       <w:startOverride w:val="1"/>
@@ -8637,7 +10148,7 @@
       <w:startOverride w:val="1"/>
     </w:lvlOverride>
   </w:num>
-  <w:num w:numId="1023">
+  <w:num w:numId="1024">
     <w:abstractNumId w:val="99415"/>
     <w:lvlOverride w:ilvl="0">
       <w:startOverride w:val="5"/>
@@ -8667,7 +10178,7 @@
       <w:startOverride w:val="5"/>
     </w:lvlOverride>
   </w:num>
-  <w:num w:numId="1024">
+  <w:num w:numId="1025">
     <w:abstractNumId w:val="99419"/>
     <w:lvlOverride w:ilvl="0">
       <w:startOverride w:val="9"/>
@@ -8697,7 +10208,7 @@
       <w:startOverride w:val="9"/>
     </w:lvlOverride>
   </w:num>
-  <w:num w:numId="1025">
+  <w:num w:numId="1026">
     <w:abstractNumId w:val="99411"/>
     <w:lvlOverride w:ilvl="0">
       <w:startOverride w:val="1"/>
@@ -8727,7 +10238,7 @@
       <w:startOverride w:val="1"/>
     </w:lvlOverride>
   </w:num>
-  <w:num w:numId="1026">
+  <w:num w:numId="1027">
     <w:abstractNumId w:val="99412"/>
     <w:lvlOverride w:ilvl="0">
       <w:startOverride w:val="2"/>
@@ -8757,7 +10268,7 @@
       <w:startOverride w:val="2"/>
     </w:lvlOverride>
   </w:num>
-  <w:num w:numId="1027">
+  <w:num w:numId="1028">
     <w:abstractNumId w:val="99411"/>
     <w:lvlOverride w:ilvl="0">
       <w:startOverride w:val="1"/>
@@ -8786,14 +10297,14 @@
     <w:lvlOverride w:ilvl="8">
       <w:startOverride w:val="1"/>
     </w:lvlOverride>
-  </w:num>
-  <w:num w:numId="1028">
-    <w:abstractNumId w:val="991"/>
   </w:num>
   <w:num w:numId="1029">
     <w:abstractNumId w:val="991"/>
   </w:num>
   <w:num w:numId="1030">
+    <w:abstractNumId w:val="991"/>
+  </w:num>
+  <w:num w:numId="1031">
     <w:abstractNumId w:val="99411"/>
     <w:lvlOverride w:ilvl="0">
       <w:startOverride w:val="1"/>
@@ -8823,7 +10334,67 @@
       <w:startOverride w:val="1"/>
     </w:lvlOverride>
   </w:num>
-  <w:num w:numId="1031">
+  <w:num w:numId="1032">
+    <w:abstractNumId w:val="99411"/>
+    <w:lvlOverride w:ilvl="0">
+      <w:startOverride w:val="1"/>
+    </w:lvlOverride>
+    <w:lvlOverride w:ilvl="1">
+      <w:startOverride w:val="1"/>
+    </w:lvlOverride>
+    <w:lvlOverride w:ilvl="2">
+      <w:startOverride w:val="1"/>
+    </w:lvlOverride>
+    <w:lvlOverride w:ilvl="3">
+      <w:startOverride w:val="1"/>
+    </w:lvlOverride>
+    <w:lvlOverride w:ilvl="4">
+      <w:startOverride w:val="1"/>
+    </w:lvlOverride>
+    <w:lvlOverride w:ilvl="5">
+      <w:startOverride w:val="1"/>
+    </w:lvlOverride>
+    <w:lvlOverride w:ilvl="6">
+      <w:startOverride w:val="1"/>
+    </w:lvlOverride>
+    <w:lvlOverride w:ilvl="7">
+      <w:startOverride w:val="1"/>
+    </w:lvlOverride>
+    <w:lvlOverride w:ilvl="8">
+      <w:startOverride w:val="1"/>
+    </w:lvlOverride>
+  </w:num>
+  <w:num w:numId="1033">
+    <w:abstractNumId w:val="99411"/>
+    <w:lvlOverride w:ilvl="0">
+      <w:startOverride w:val="1"/>
+    </w:lvlOverride>
+    <w:lvlOverride w:ilvl="1">
+      <w:startOverride w:val="1"/>
+    </w:lvlOverride>
+    <w:lvlOverride w:ilvl="2">
+      <w:startOverride w:val="1"/>
+    </w:lvlOverride>
+    <w:lvlOverride w:ilvl="3">
+      <w:startOverride w:val="1"/>
+    </w:lvlOverride>
+    <w:lvlOverride w:ilvl="4">
+      <w:startOverride w:val="1"/>
+    </w:lvlOverride>
+    <w:lvlOverride w:ilvl="5">
+      <w:startOverride w:val="1"/>
+    </w:lvlOverride>
+    <w:lvlOverride w:ilvl="6">
+      <w:startOverride w:val="1"/>
+    </w:lvlOverride>
+    <w:lvlOverride w:ilvl="7">
+      <w:startOverride w:val="1"/>
+    </w:lvlOverride>
+    <w:lvlOverride w:ilvl="8">
+      <w:startOverride w:val="1"/>
+    </w:lvlOverride>
+  </w:num>
+  <w:num w:numId="1034">
     <w:abstractNumId w:val="991"/>
   </w:num>
 </w:numbering>

</xml_diff>